<commit_message>
Se agrega presentación de avances
</commit_message>
<xml_diff>
--- a/Tesina/Tesina Luis Lopez 1487280.docx
+++ b/Tesina/Tesina Luis Lopez 1487280.docx
@@ -1,6 +1,6 @@
 
 <file path=word/document.xml><?xml version="1.0" encoding="utf-8"?>
-<w:document xmlns:wpc="http://schemas.microsoft.com/office/word/2010/wordprocessingCanvas" xmlns:mc="http://schemas.openxmlformats.org/markup-compatibility/2006" xmlns:o="urn:schemas-microsoft-com:office:office" xmlns:r="http://schemas.openxmlformats.org/officeDocument/2006/relationships" xmlns:m="http://schemas.openxmlformats.org/officeDocument/2006/math" xmlns:v="urn:schemas-microsoft-com:vml" xmlns:wp14="http://schemas.microsoft.com/office/word/2010/wordprocessingDrawing" xmlns:wp="http://schemas.openxmlformats.org/drawingml/2006/wordprocessingDrawing" xmlns:w10="urn:schemas-microsoft-com:office:word" xmlns:w="http://schemas.openxmlformats.org/wordprocessingml/2006/main" xmlns:w14="http://schemas.microsoft.com/office/word/2010/wordml" xmlns:w15="http://schemas.microsoft.com/office/word/2012/wordml" xmlns:wpg="http://schemas.microsoft.com/office/word/2010/wordprocessingGroup" xmlns:wpi="http://schemas.microsoft.com/office/word/2010/wordprocessingInk" xmlns:wne="http://schemas.microsoft.com/office/word/2006/wordml" xmlns:wps="http://schemas.microsoft.com/office/word/2010/wordprocessingShape" mc:Ignorable="w14 w15 wp14">
+<w:document xmlns:wpc="http://schemas.microsoft.com/office/word/2010/wordprocessingCanvas" xmlns:cx="http://schemas.microsoft.com/office/drawing/2014/chartex" xmlns:cx1="http://schemas.microsoft.com/office/drawing/2015/9/8/chartex" xmlns:cx2="http://schemas.microsoft.com/office/drawing/2015/10/21/chartex" xmlns:cx3="http://schemas.microsoft.com/office/drawing/2016/5/9/chartex" xmlns:cx4="http://schemas.microsoft.com/office/drawing/2016/5/10/chartex" xmlns:cx5="http://schemas.microsoft.com/office/drawing/2016/5/11/chartex" xmlns:cx6="http://schemas.microsoft.com/office/drawing/2016/5/12/chartex" xmlns:cx7="http://schemas.microsoft.com/office/drawing/2016/5/13/chartex" xmlns:cx8="http://schemas.microsoft.com/office/drawing/2016/5/14/chartex" xmlns:mc="http://schemas.openxmlformats.org/markup-compatibility/2006" xmlns:aink="http://schemas.microsoft.com/office/drawing/2016/ink" xmlns:am3d="http://schemas.microsoft.com/office/drawing/2017/model3d" xmlns:o="urn:schemas-microsoft-com:office:office" xmlns:r="http://schemas.openxmlformats.org/officeDocument/2006/relationships" xmlns:m="http://schemas.openxmlformats.org/officeDocument/2006/math" xmlns:v="urn:schemas-microsoft-com:vml" xmlns:wp14="http://schemas.microsoft.com/office/word/2010/wordprocessingDrawing" xmlns:wp="http://schemas.openxmlformats.org/drawingml/2006/wordprocessingDrawing" xmlns:w10="urn:schemas-microsoft-com:office:word" xmlns:w="http://schemas.openxmlformats.org/wordprocessingml/2006/main" xmlns:w14="http://schemas.microsoft.com/office/word/2010/wordml" xmlns:w15="http://schemas.microsoft.com/office/word/2012/wordml" xmlns:w16cex="http://schemas.microsoft.com/office/word/2018/wordml/cex" xmlns:w16cid="http://schemas.microsoft.com/office/word/2016/wordml/cid" xmlns:w16="http://schemas.microsoft.com/office/word/2018/wordml" xmlns:w16sdtdh="http://schemas.microsoft.com/office/word/2020/wordml/sdtdatahash" xmlns:w16se="http://schemas.microsoft.com/office/word/2015/wordml/symex" xmlns:wpg="http://schemas.microsoft.com/office/word/2010/wordprocessingGroup" xmlns:wpi="http://schemas.microsoft.com/office/word/2010/wordprocessingInk" xmlns:wne="http://schemas.microsoft.com/office/word/2006/wordml" xmlns:wps="http://schemas.microsoft.com/office/word/2010/wordprocessingShape" mc:Ignorable="w14 w15 w16se w16cid w16 w16cex w16sdtdh wp14">
   <w:body>
     <w:p>
       <w:pPr>
@@ -1194,10 +1194,11 @@
           <w:docPartUnique/>
         </w:docPartObj>
       </w:sdtPr>
+      <w:sdtEndPr/>
       <w:sdtContent>
         <w:p>
           <w:pPr>
-            <w:pStyle w:val="TtulodeTDC"/>
+            <w:pStyle w:val="TtuloTDC"/>
             <w:rPr>
               <w:lang w:val="es-ES"/>
             </w:rPr>
@@ -1205,7 +1206,7 @@
         </w:p>
         <w:p>
           <w:pPr>
-            <w:pStyle w:val="TtulodeTDC"/>
+            <w:pStyle w:val="TtuloTDC"/>
             <w:rPr>
               <w:lang w:val="es-ES"/>
             </w:rPr>
@@ -1213,7 +1214,7 @@
         </w:p>
         <w:p>
           <w:pPr>
-            <w:pStyle w:val="TtulodeTDC"/>
+            <w:pStyle w:val="TtuloTDC"/>
             <w:rPr>
               <w:lang w:val="es-ES"/>
             </w:rPr>
@@ -1221,7 +1222,7 @@
         </w:p>
         <w:p>
           <w:pPr>
-            <w:pStyle w:val="TtulodeTDC"/>
+            <w:pStyle w:val="TtuloTDC"/>
             <w:rPr>
               <w:lang w:val="es-ES"/>
             </w:rPr>
@@ -2006,7 +2007,7 @@
     </w:p>
     <w:p>
       <w:pPr>
-        <w:pStyle w:val="TtulodeTDC"/>
+        <w:pStyle w:val="TtuloTDC"/>
         <w:rPr>
           <w:lang w:val="es-ES"/>
         </w:rPr>
@@ -2014,7 +2015,7 @@
     </w:p>
     <w:p>
       <w:pPr>
-        <w:pStyle w:val="TtulodeTDC"/>
+        <w:pStyle w:val="TtuloTDC"/>
         <w:rPr>
           <w:lang w:val="es-ES"/>
         </w:rPr>
@@ -2022,7 +2023,7 @@
     </w:p>
     <w:p>
       <w:pPr>
-        <w:pStyle w:val="TtulodeTDC"/>
+        <w:pStyle w:val="TtuloTDC"/>
         <w:rPr>
           <w:lang w:val="es-ES"/>
         </w:rPr>
@@ -2103,7 +2104,7 @@
     </w:p>
     <w:p>
       <w:pPr>
-        <w:pStyle w:val="TtulodeTDC"/>
+        <w:pStyle w:val="TtuloTDC"/>
         <w:rPr>
           <w:lang w:val="es-ES"/>
         </w:rPr>
@@ -2111,7 +2112,7 @@
     </w:p>
     <w:p>
       <w:pPr>
-        <w:pStyle w:val="TtulodeTDC"/>
+        <w:pStyle w:val="TtuloTDC"/>
         <w:rPr>
           <w:lang w:val="es-ES"/>
         </w:rPr>
@@ -2119,7 +2120,7 @@
     </w:p>
     <w:p>
       <w:pPr>
-        <w:pStyle w:val="TtulodeTDC"/>
+        <w:pStyle w:val="TtuloTDC"/>
         <w:rPr>
           <w:lang w:val="es-ES"/>
         </w:rPr>
@@ -2608,71 +2609,7 @@
           <w:sz w:val="24"/>
           <w:szCs w:val="24"/>
         </w:rPr>
-        <w:t>La violencia de género e</w:t>
-      </w:r>
-      <w:r>
-        <w:rPr>
-          <w:rFonts w:ascii="Arial" w:hAnsi="Arial" w:cs="Arial"/>
-          <w:sz w:val="24"/>
-          <w:szCs w:val="24"/>
-        </w:rPr>
-        <w:t xml:space="preserve">s un problema grave en México, </w:t>
-      </w:r>
-      <w:r>
-        <w:rPr>
-          <w:rFonts w:ascii="Arial" w:hAnsi="Arial" w:cs="Arial"/>
-          <w:sz w:val="24"/>
-          <w:szCs w:val="24"/>
-        </w:rPr>
-        <w:t xml:space="preserve">estudiarlo es crucial para entender las causas y encontrar soluciones efectivas. </w:t>
-      </w:r>
-      <w:r>
-        <w:rPr>
-          <w:rFonts w:ascii="Arial" w:hAnsi="Arial" w:cs="Arial"/>
-          <w:sz w:val="24"/>
-          <w:szCs w:val="24"/>
-        </w:rPr>
-        <w:t xml:space="preserve">Entender </w:t>
-      </w:r>
-      <w:r>
-        <w:rPr>
-          <w:rFonts w:ascii="Arial" w:hAnsi="Arial" w:cs="Arial"/>
-          <w:sz w:val="24"/>
-          <w:szCs w:val="24"/>
-        </w:rPr>
-        <w:t>el fenómeno de la violencia de género nos</w:t>
-      </w:r>
-      <w:r>
-        <w:rPr>
-          <w:rFonts w:ascii="Arial" w:hAnsi="Arial" w:cs="Arial"/>
-          <w:sz w:val="24"/>
-          <w:szCs w:val="24"/>
-        </w:rPr>
-        <w:t xml:space="preserve"> permite identificar la</w:t>
-      </w:r>
-      <w:r>
-        <w:rPr>
-          <w:rFonts w:ascii="Arial" w:hAnsi="Arial" w:cs="Arial"/>
-          <w:sz w:val="24"/>
-          <w:szCs w:val="24"/>
-        </w:rPr>
-        <w:t>s causas que provocan la violencia contra la mujer</w:t>
-      </w:r>
-      <w:r>
-        <w:rPr>
-          <w:rFonts w:ascii="Arial" w:hAnsi="Arial" w:cs="Arial"/>
-          <w:sz w:val="24"/>
-          <w:szCs w:val="24"/>
-        </w:rPr>
-        <w:t xml:space="preserve"> y contribuyen a la perpetuación de la </w:t>
-      </w:r>
-      <w:r>
-        <w:rPr>
-          <w:rFonts w:ascii="Arial" w:hAnsi="Arial" w:cs="Arial"/>
-          <w:sz w:val="24"/>
-          <w:szCs w:val="24"/>
-        </w:rPr>
-        <w:t>misma.</w:t>
+        <w:t xml:space="preserve">La violencia de género constituye uno de los problemas de derechos humanos más graves en México, de acuerdo con la Organización Mundial de la Salud (2021), casi una de cada tres mujeres en el mundo ha sufrido violencia física o sexual al menos una vez en su vida. En México la magnitud del fenómeno es aún más pronunciada: la Encuesta Nacional sobre la Dinámica de las Relaciones en los Hogares (ENDIREH 2021) del INEGI, la cual es considerada el indicador de referencia nacional en la materia, reportó que el 70.1% de las mujeres de 15 años y más han experimentado al menos un incidente de violencia a lo largo de su vida (INEGI, 2022). </w:t>
       </w:r>
     </w:p>
     <w:p>
@@ -2692,127 +2629,67 @@
           <w:sz w:val="24"/>
           <w:szCs w:val="24"/>
         </w:rPr>
-        <w:t>Sin un entendimiento profundo de la problemática</w:t>
-      </w:r>
-      <w:r>
-        <w:rPr>
-          <w:rFonts w:ascii="Arial" w:hAnsi="Arial" w:cs="Arial"/>
-          <w:sz w:val="24"/>
-          <w:szCs w:val="24"/>
-        </w:rPr>
-        <w:t>,</w:t>
-      </w:r>
-      <w:r>
-        <w:rPr>
-          <w:rFonts w:ascii="Arial" w:hAnsi="Arial" w:cs="Arial"/>
-          <w:sz w:val="24"/>
-          <w:szCs w:val="24"/>
-        </w:rPr>
-        <w:t xml:space="preserve"> es complicado </w:t>
-      </w:r>
-      <w:r>
-        <w:rPr>
-          <w:rFonts w:ascii="Arial" w:hAnsi="Arial" w:cs="Arial"/>
-          <w:sz w:val="24"/>
-          <w:szCs w:val="24"/>
-        </w:rPr>
-        <w:t>desarrollar políticas y progra</w:t>
-      </w:r>
-      <w:r>
-        <w:rPr>
-          <w:rFonts w:ascii="Arial" w:hAnsi="Arial" w:cs="Arial"/>
-          <w:sz w:val="24"/>
-          <w:szCs w:val="24"/>
-        </w:rPr>
-        <w:t xml:space="preserve">mas para prevenir la violencia, </w:t>
-      </w:r>
-      <w:r>
-        <w:rPr>
-          <w:rFonts w:ascii="Arial" w:hAnsi="Arial" w:cs="Arial"/>
-          <w:sz w:val="24"/>
-          <w:szCs w:val="24"/>
-        </w:rPr>
-        <w:t>que brinden apoyo a las</w:t>
-      </w:r>
-      <w:r>
-        <w:rPr>
-          <w:rFonts w:ascii="Arial" w:hAnsi="Arial" w:cs="Arial"/>
-          <w:sz w:val="24"/>
-          <w:szCs w:val="24"/>
-        </w:rPr>
-        <w:t xml:space="preserve"> víctimas</w:t>
-      </w:r>
-      <w:r>
-        <w:rPr>
-          <w:rFonts w:ascii="Arial" w:hAnsi="Arial" w:cs="Arial"/>
-          <w:sz w:val="24"/>
-          <w:szCs w:val="24"/>
-        </w:rPr>
-        <w:t>, desmonten</w:t>
-      </w:r>
-      <w:r>
-        <w:rPr>
-          <w:rFonts w:ascii="Arial" w:hAnsi="Arial" w:cs="Arial"/>
-          <w:sz w:val="24"/>
-          <w:szCs w:val="24"/>
-        </w:rPr>
-        <w:t xml:space="preserve"> </w:t>
-      </w:r>
-      <w:r>
-        <w:rPr>
-          <w:rFonts w:ascii="Arial" w:hAnsi="Arial" w:cs="Arial"/>
-          <w:sz w:val="24"/>
-          <w:szCs w:val="24"/>
-        </w:rPr>
-        <w:t xml:space="preserve"> los </w:t>
-      </w:r>
-      <w:r>
-        <w:rPr>
-          <w:rFonts w:ascii="Arial" w:hAnsi="Arial" w:cs="Arial"/>
-          <w:sz w:val="24"/>
-          <w:szCs w:val="24"/>
-        </w:rPr>
-        <w:t>estereotipos y prejuic</w:t>
-      </w:r>
-      <w:r>
-        <w:rPr>
-          <w:rFonts w:ascii="Arial" w:hAnsi="Arial" w:cs="Arial"/>
-          <w:sz w:val="24"/>
-          <w:szCs w:val="24"/>
-        </w:rPr>
-        <w:t xml:space="preserve">ios que justifican la violencia contra la mujer. </w:t>
-      </w:r>
-      <w:r>
-        <w:rPr>
-          <w:rFonts w:ascii="Arial" w:hAnsi="Arial" w:cs="Arial"/>
-          <w:sz w:val="24"/>
-          <w:szCs w:val="24"/>
-        </w:rPr>
-        <w:t>Por lo tanto, el</w:t>
-      </w:r>
-      <w:r>
-        <w:rPr>
-          <w:rFonts w:ascii="Arial" w:hAnsi="Arial" w:cs="Arial"/>
-          <w:sz w:val="24"/>
-          <w:szCs w:val="24"/>
-        </w:rPr>
-        <w:t xml:space="preserve"> estudio de la violencia de género es fundamental para garantizar la igualdad y la seguridad de las mujeres en México y promover una sociedad más justa e </w:t>
-      </w:r>
-      <w:r>
-        <w:rPr>
-          <w:rFonts w:ascii="Arial" w:hAnsi="Arial" w:cs="Arial"/>
-          <w:sz w:val="24"/>
-          <w:szCs w:val="24"/>
-        </w:rPr>
-        <w:t>igualitaria</w:t>
-      </w:r>
-      <w:r>
-        <w:rPr>
-          <w:rFonts w:ascii="Arial" w:hAnsi="Arial" w:cs="Arial"/>
-          <w:sz w:val="24"/>
-          <w:szCs w:val="24"/>
-        </w:rPr>
-        <w:t xml:space="preserve"> para todos.</w:t>
+        <w:t>Además</w:t>
+      </w:r>
+      <w:r>
+        <w:rPr>
+          <w:rFonts w:ascii="Arial" w:hAnsi="Arial" w:cs="Arial"/>
+          <w:sz w:val="24"/>
+          <w:szCs w:val="24"/>
+        </w:rPr>
+        <w:t xml:space="preserve">, esta cifra solamente representa la violencia que las mujeres reconocen y reportan en la encuesta, la Encuesta Nacional de Victimización (ENVIPE, 2022) estima que el 93.2% de los delitos en México no se denuncian formalmente ante las autoridades, esto nos deja en evidencia que los registros administrativos de denuncias formales, como las carpetas de investigación consolidadas mensualmente por el Secretariado Ejecutivo del Sistema Nacional de Seguridad Pública (SESNSP, 2025) representan solamente una fracción del </w:t>
+      </w:r>
+      <w:proofErr w:type="spellStart"/>
+      <w:r>
+        <w:rPr>
+          <w:rFonts w:ascii="Arial" w:hAnsi="Arial" w:cs="Arial"/>
+          <w:sz w:val="24"/>
+          <w:szCs w:val="24"/>
+        </w:rPr>
+        <w:t>fenenomeno</w:t>
+      </w:r>
+      <w:proofErr w:type="spellEnd"/>
+      <w:r>
+        <w:rPr>
+          <w:rFonts w:ascii="Arial" w:hAnsi="Arial" w:cs="Arial"/>
+          <w:sz w:val="24"/>
+          <w:szCs w:val="24"/>
+        </w:rPr>
+        <w:t xml:space="preserve"> real. Comprender los patrones temporales del </w:t>
+      </w:r>
+      <w:r>
+        <w:rPr>
+          <w:rFonts w:ascii="Arial" w:hAnsi="Arial" w:cs="Arial"/>
+          <w:sz w:val="24"/>
+          <w:szCs w:val="24"/>
+        </w:rPr>
+        <w:t>fenómeno</w:t>
+      </w:r>
+      <w:r>
+        <w:rPr>
+          <w:rFonts w:ascii="Arial" w:hAnsi="Arial" w:cs="Arial"/>
+          <w:sz w:val="24"/>
+          <w:szCs w:val="24"/>
+        </w:rPr>
+        <w:t xml:space="preserve"> de la violencia de genero resulta fundamental para el diseño de </w:t>
+      </w:r>
+      <w:proofErr w:type="spellStart"/>
+      <w:r>
+        <w:rPr>
+          <w:rFonts w:ascii="Arial" w:hAnsi="Arial" w:cs="Arial"/>
+          <w:sz w:val="24"/>
+          <w:szCs w:val="24"/>
+        </w:rPr>
+        <w:t>plíticas</w:t>
+      </w:r>
+      <w:proofErr w:type="spellEnd"/>
+      <w:r>
+        <w:rPr>
+          <w:rFonts w:ascii="Arial" w:hAnsi="Arial" w:cs="Arial"/>
+          <w:sz w:val="24"/>
+          <w:szCs w:val="24"/>
+        </w:rPr>
+        <w:t xml:space="preserve"> públicas efectivas.</w:t>
       </w:r>
     </w:p>
     <w:p>
@@ -2832,31 +2709,74 @@
           <w:sz w:val="24"/>
           <w:szCs w:val="24"/>
         </w:rPr>
-        <w:t>En la actualidad existen muchos estudios y fuentes de información sobre la violencia de género</w:t>
-      </w:r>
-      <w:r>
-        <w:rPr>
-          <w:rFonts w:ascii="Arial" w:hAnsi="Arial" w:cs="Arial"/>
-          <w:sz w:val="24"/>
-          <w:szCs w:val="24"/>
-        </w:rPr>
-        <w:t>, u</w:t>
-      </w:r>
-      <w:r>
-        <w:rPr>
-          <w:rFonts w:ascii="Arial" w:hAnsi="Arial" w:cs="Arial"/>
-          <w:sz w:val="24"/>
-          <w:szCs w:val="24"/>
-        </w:rPr>
-        <w:t xml:space="preserve">na de las fuentes de información que tiene carácter oficial son las </w:t>
-      </w:r>
-      <w:r>
-        <w:rPr>
-          <w:rFonts w:ascii="Arial" w:hAnsi="Arial" w:cs="Arial"/>
-          <w:sz w:val="24"/>
-          <w:szCs w:val="24"/>
-        </w:rPr>
-        <w:t>llamadas de emergencia al 9-1-1.</w:t>
+        <w:t xml:space="preserve">Partiendo del punto de la importancia de estudiar la violencia de </w:t>
+      </w:r>
+      <w:proofErr w:type="spellStart"/>
+      <w:r>
+        <w:rPr>
+          <w:rFonts w:ascii="Arial" w:hAnsi="Arial" w:cs="Arial"/>
+          <w:sz w:val="24"/>
+          <w:szCs w:val="24"/>
+        </w:rPr>
+        <w:t>genero</w:t>
+      </w:r>
+      <w:proofErr w:type="spellEnd"/>
+      <w:r>
+        <w:rPr>
+          <w:rFonts w:ascii="Arial" w:hAnsi="Arial" w:cs="Arial"/>
+          <w:sz w:val="24"/>
+          <w:szCs w:val="24"/>
+        </w:rPr>
+        <w:t xml:space="preserve">, el estudio de la </w:t>
+      </w:r>
+      <w:r>
+        <w:rPr>
+          <w:rFonts w:ascii="Arial" w:hAnsi="Arial" w:cs="Arial"/>
+          <w:sz w:val="24"/>
+          <w:szCs w:val="24"/>
+        </w:rPr>
+        <w:t>problemática</w:t>
+      </w:r>
+      <w:r>
+        <w:rPr>
+          <w:rFonts w:ascii="Arial" w:hAnsi="Arial" w:cs="Arial"/>
+          <w:sz w:val="24"/>
+          <w:szCs w:val="24"/>
+        </w:rPr>
+        <w:t xml:space="preserve"> no puede limitarse a las fuentes estadísticas </w:t>
+      </w:r>
+      <w:r>
+        <w:rPr>
+          <w:rFonts w:ascii="Arial" w:hAnsi="Arial" w:cs="Arial"/>
+          <w:sz w:val="24"/>
+          <w:szCs w:val="24"/>
+        </w:rPr>
+        <w:lastRenderedPageBreak/>
+        <w:t xml:space="preserve">institucionales tradicionales. Tanto la ENDIREH como las carpetas de investigación del SESNSP capturan dimensiones distintas del fenómeno, sin embargo, </w:t>
+      </w:r>
+      <w:r>
+        <w:rPr>
+          <w:rFonts w:ascii="Arial" w:hAnsi="Arial" w:cs="Arial"/>
+          <w:sz w:val="24"/>
+          <w:szCs w:val="24"/>
+        </w:rPr>
+        <w:t>ambas dependen</w:t>
+      </w:r>
+      <w:r>
+        <w:rPr>
+          <w:rFonts w:ascii="Arial" w:hAnsi="Arial" w:cs="Arial"/>
+          <w:sz w:val="24"/>
+          <w:szCs w:val="24"/>
+        </w:rPr>
+        <w:t xml:space="preserve"> de que la </w:t>
+      </w:r>
+      <w:r>
+        <w:rPr>
+          <w:rFonts w:ascii="Arial" w:hAnsi="Arial" w:cs="Arial"/>
+          <w:sz w:val="24"/>
+          <w:szCs w:val="24"/>
+        </w:rPr>
+        <w:t>víctima</w:t>
       </w:r>
       <w:r>
         <w:rPr>
@@ -2872,23 +2792,49 @@
           <w:sz w:val="24"/>
           <w:szCs w:val="24"/>
         </w:rPr>
-        <w:t>Estas</w:t>
-      </w:r>
-      <w:r>
-        <w:rPr>
-          <w:rFonts w:ascii="Arial" w:hAnsi="Arial" w:cs="Arial"/>
-          <w:sz w:val="24"/>
-          <w:szCs w:val="24"/>
-        </w:rPr>
-        <w:t xml:space="preserve"> llamadas se recaban por los Centros de atención de llamadas de emergencia a lo largo del territorio M</w:t>
-      </w:r>
-      <w:r>
-        <w:rPr>
-          <w:rFonts w:ascii="Arial" w:hAnsi="Arial" w:cs="Arial"/>
-          <w:sz w:val="24"/>
-          <w:szCs w:val="24"/>
-        </w:rPr>
-        <w:t>exicano.</w:t>
+        <w:t>tome</w:t>
+      </w:r>
+      <w:r>
+        <w:rPr>
+          <w:rFonts w:ascii="Arial" w:hAnsi="Arial" w:cs="Arial"/>
+          <w:sz w:val="24"/>
+          <w:szCs w:val="24"/>
+        </w:rPr>
+        <w:t xml:space="preserve"> la iniciativa de denunciar formalmente ante el Ministerio Público o su experiencia se vea reflejada en la muestra de la encuesta. En este contexto, los reportes realizados al servicio de emergencias 9-1-1 representan una fuente complementaria con ventajas importantes, una mayor granularidad, periodicidad continua y </w:t>
+      </w:r>
+      <w:r>
+        <w:rPr>
+          <w:rFonts w:ascii="Arial" w:hAnsi="Arial" w:cs="Arial"/>
+          <w:sz w:val="24"/>
+          <w:szCs w:val="24"/>
+        </w:rPr>
+        <w:t>además capturan</w:t>
+      </w:r>
+      <w:r>
+        <w:rPr>
+          <w:rFonts w:ascii="Arial" w:hAnsi="Arial" w:cs="Arial"/>
+          <w:sz w:val="24"/>
+          <w:szCs w:val="24"/>
+        </w:rPr>
+        <w:t xml:space="preserve"> episodios de violencia no derivan en una denuncia formal (</w:t>
+      </w:r>
+      <w:proofErr w:type="spellStart"/>
+      <w:r>
+        <w:rPr>
+          <w:rFonts w:ascii="Arial" w:hAnsi="Arial" w:cs="Arial"/>
+          <w:sz w:val="24"/>
+          <w:szCs w:val="24"/>
+        </w:rPr>
+        <w:t>Rojido</w:t>
+      </w:r>
+      <w:proofErr w:type="spellEnd"/>
+      <w:r>
+        <w:rPr>
+          <w:rFonts w:ascii="Arial" w:hAnsi="Arial" w:cs="Arial"/>
+          <w:sz w:val="24"/>
+          <w:szCs w:val="24"/>
+        </w:rPr>
+        <w:t xml:space="preserve"> y Cano, 2018). Es precisamente esta fuente la que utiliza el presente trabajo para analizar los patrones temporales de la violencia de género en Monterrey.</w:t>
       </w:r>
     </w:p>
     <w:p>
@@ -2902,70 +2848,145 @@
           <w:szCs w:val="24"/>
         </w:rPr>
       </w:pPr>
-      <w:r>
-        <w:rPr>
-          <w:rFonts w:ascii="Arial" w:hAnsi="Arial" w:cs="Arial"/>
-          <w:sz w:val="24"/>
-          <w:szCs w:val="24"/>
-        </w:rPr>
-        <w:t xml:space="preserve">Es dentro de este contexto que el municipio de Monterrey libera la base de datos de reportes al 911 relacionados con incidentes de violencia de </w:t>
-      </w:r>
-      <w:r>
-        <w:rPr>
-          <w:rFonts w:ascii="Arial" w:hAnsi="Arial" w:cs="Arial"/>
-          <w:sz w:val="24"/>
-          <w:szCs w:val="24"/>
-        </w:rPr>
-        <w:t>género</w:t>
-      </w:r>
-      <w:r>
-        <w:rPr>
-          <w:rFonts w:ascii="Arial" w:hAnsi="Arial" w:cs="Arial"/>
-          <w:sz w:val="24"/>
-          <w:szCs w:val="24"/>
-        </w:rPr>
-        <w:t xml:space="preserve"> (Datos Abiertos Monterrey, 2022). L</w:t>
-      </w:r>
-      <w:r>
-        <w:rPr>
-          <w:rFonts w:ascii="Arial" w:hAnsi="Arial" w:cs="Arial"/>
-          <w:sz w:val="24"/>
-          <w:szCs w:val="24"/>
-        </w:rPr>
-        <w:t xml:space="preserve">a base </w:t>
-      </w:r>
-      <w:r>
-        <w:rPr>
-          <w:rFonts w:ascii="Arial" w:hAnsi="Arial" w:cs="Arial"/>
-          <w:sz w:val="24"/>
-          <w:szCs w:val="24"/>
-        </w:rPr>
-        <w:t xml:space="preserve">se liberó a finales del 2022 y </w:t>
-      </w:r>
-      <w:r>
-        <w:rPr>
-          <w:rFonts w:ascii="Arial" w:hAnsi="Arial" w:cs="Arial"/>
-          <w:sz w:val="24"/>
-          <w:szCs w:val="24"/>
-        </w:rPr>
-        <w:t>cuenta con  los reportes realizados al 911 por motivos de violencia de género en el municipio de Monterrey desde Enero del 2017 hasta Septiembre del 2022.</w:t>
-      </w:r>
     </w:p>
     <w:p>
       <w:pPr>
         <w:spacing w:line="360" w:lineRule="auto"/>
-        <w:rPr>
-          <w:rFonts w:ascii="Arial" w:hAnsi="Arial" w:cs="Arial"/>
-          <w:sz w:val="24"/>
-          <w:szCs w:val="24"/>
-        </w:rPr>
-      </w:pPr>
+        <w:ind w:firstLine="708"/>
+        <w:jc w:val="both"/>
+        <w:rPr>
+          <w:rFonts w:ascii="Arial" w:hAnsi="Arial" w:cs="Arial"/>
+          <w:sz w:val="24"/>
+          <w:szCs w:val="24"/>
+        </w:rPr>
+      </w:pPr>
+      <w:r>
+        <w:rPr>
+          <w:rFonts w:ascii="Arial" w:hAnsi="Arial" w:cs="Arial"/>
+          <w:sz w:val="24"/>
+          <w:szCs w:val="24"/>
+        </w:rPr>
+        <w:t>La elección de Monterrey como caso de estudio no es arbitraria: desde el 18 de noviembre de 2016, el estado de Nuevo León cuenta con una Declaratoria de Alerta de Violencia de Género contra las Mujeres que incluyó al municipio de Monterrey entre sus cinco territorios prioritarios (CONAVIM, 2016), lo que convierte a este periodo de análisis en especialmente relevante para evaluar el comportamiento de los reportes en vigencia de la alerta.</w:t>
+      </w:r>
+    </w:p>
+    <w:p>
+      <w:pPr>
+        <w:spacing w:line="360" w:lineRule="auto"/>
+        <w:ind w:firstLine="708"/>
+        <w:rPr>
+          <w:rFonts w:ascii="Arial" w:hAnsi="Arial" w:cs="Arial"/>
+          <w:sz w:val="24"/>
+          <w:szCs w:val="24"/>
+        </w:rPr>
+      </w:pPr>
+      <w:r>
+        <w:rPr>
+          <w:rFonts w:ascii="Arial" w:hAnsi="Arial" w:cs="Arial"/>
+          <w:sz w:val="24"/>
+          <w:szCs w:val="24"/>
+        </w:rPr>
+        <w:t xml:space="preserve">La base de datos de reportes al 9-1-1 del municipio de Monterrey, publicada a finales de 2022, representa una oportunidad para enriquecer el entendimiento del fenómeno de la violencia de género en la ciudad. Organismos como el Observatorio de Violencia de Género de Nuevo León (2022) han construido un panorama sólido a partir de fuentes como el SESNSP y la ENDIREH; el análisis temporal de los reportes de emergencia mediante técnicas estadísticas formales puede sumarse a ese esfuerzo, aportando una dimensión adicional: la identificación de momentos en que el comportamiento de la serie presenta cambios estructurales que podrían asociarse a distintos tipos de eventos, ya sean de política </w:t>
+      </w:r>
+      <w:proofErr w:type="spellStart"/>
+      <w:r>
+        <w:rPr>
+          <w:rFonts w:ascii="Arial" w:hAnsi="Arial" w:cs="Arial"/>
+          <w:sz w:val="24"/>
+          <w:szCs w:val="24"/>
+        </w:rPr>
+        <w:t>pública</w:t>
+      </w:r>
+      <w:r>
+        <w:rPr>
+          <w:rFonts w:ascii="Arial" w:hAnsi="Arial" w:cs="Arial"/>
+          <w:sz w:val="24"/>
+          <w:szCs w:val="24"/>
+        </w:rPr>
+        <w:t>,</w:t>
+      </w:r>
+      <w:r>
+        <w:rPr>
+          <w:rFonts w:ascii="Arial" w:hAnsi="Arial" w:cs="Arial"/>
+          <w:sz w:val="24"/>
+          <w:szCs w:val="24"/>
+        </w:rPr>
+        <w:t>como</w:t>
+      </w:r>
+      <w:proofErr w:type="spellEnd"/>
+      <w:r>
+        <w:rPr>
+          <w:rFonts w:ascii="Arial" w:hAnsi="Arial" w:cs="Arial"/>
+          <w:sz w:val="24"/>
+          <w:szCs w:val="24"/>
+        </w:rPr>
+        <w:t xml:space="preserve"> la Declaratoria de Alerta de Violencia de Género de 2016, de contexto social </w:t>
+      </w:r>
+      <w:r>
+        <w:rPr>
+          <w:rFonts w:ascii="Arial" w:hAnsi="Arial" w:cs="Arial"/>
+          <w:sz w:val="24"/>
+          <w:szCs w:val="24"/>
+        </w:rPr>
+        <w:t>,</w:t>
+      </w:r>
+      <w:r>
+        <w:rPr>
+          <w:rFonts w:ascii="Arial" w:hAnsi="Arial" w:cs="Arial"/>
+          <w:sz w:val="24"/>
+          <w:szCs w:val="24"/>
+        </w:rPr>
+        <w:t xml:space="preserve">como el confinamiento por COVID-19 en 2020, o de carácter sociocultural, como eventos deportivos de alta convocatoria que la literatura ha asociado con incrementos en los reportes </w:t>
+      </w:r>
+      <w:r>
+        <w:rPr>
+          <w:rFonts w:ascii="Arial" w:hAnsi="Arial" w:cs="Arial"/>
+          <w:sz w:val="24"/>
+          <w:szCs w:val="24"/>
+        </w:rPr>
+        <w:lastRenderedPageBreak/>
+        <w:t>de violencia de género (</w:t>
+      </w:r>
+      <w:proofErr w:type="spellStart"/>
+      <w:r>
+        <w:rPr>
+          <w:rFonts w:ascii="Arial" w:hAnsi="Arial" w:cs="Arial"/>
+          <w:sz w:val="24"/>
+          <w:szCs w:val="24"/>
+        </w:rPr>
+        <w:t>Brimicombe</w:t>
+      </w:r>
+      <w:proofErr w:type="spellEnd"/>
+      <w:r>
+        <w:rPr>
+          <w:rFonts w:ascii="Arial" w:hAnsi="Arial" w:cs="Arial"/>
+          <w:sz w:val="24"/>
+          <w:szCs w:val="24"/>
+        </w:rPr>
+        <w:t xml:space="preserve"> y </w:t>
+      </w:r>
+      <w:proofErr w:type="spellStart"/>
+      <w:r>
+        <w:rPr>
+          <w:rFonts w:ascii="Arial" w:hAnsi="Arial" w:cs="Arial"/>
+          <w:sz w:val="24"/>
+          <w:szCs w:val="24"/>
+        </w:rPr>
+        <w:t>Cafe</w:t>
+      </w:r>
+      <w:proofErr w:type="spellEnd"/>
+      <w:r>
+        <w:rPr>
+          <w:rFonts w:ascii="Arial" w:hAnsi="Arial" w:cs="Arial"/>
+          <w:sz w:val="24"/>
+          <w:szCs w:val="24"/>
+        </w:rPr>
+        <w:t>, 2012).</w:t>
+      </w:r>
       <w:r>
         <w:rPr>
           <w:noProof/>
           <w:lang w:eastAsia="es-MX"/>
         </w:rPr>
-        <w:lastRenderedPageBreak/>
         <w:drawing>
           <wp:inline distT="0" distB="0" distL="0" distR="0" wp14:anchorId="0E739455" wp14:editId="5A1F4F2E">
             <wp:extent cx="5431790" cy="2235835"/>
@@ -3086,72 +3107,167 @@
           <w:sz w:val="24"/>
           <w:szCs w:val="24"/>
         </w:rPr>
-        <w:t>Esta base</w:t>
-      </w:r>
-      <w:r>
-        <w:rPr>
-          <w:rFonts w:ascii="Arial" w:hAnsi="Arial" w:cs="Arial"/>
-          <w:sz w:val="24"/>
-          <w:szCs w:val="24"/>
-        </w:rPr>
-        <w:t xml:space="preserve"> de datos es una fuente</w:t>
-      </w:r>
-      <w:r>
-        <w:rPr>
-          <w:rFonts w:ascii="Arial" w:hAnsi="Arial" w:cs="Arial"/>
-          <w:sz w:val="24"/>
-          <w:szCs w:val="24"/>
-        </w:rPr>
-        <w:t xml:space="preserve"> oficial, sin embargo, por su fecha de publicación</w:t>
-      </w:r>
-      <w:r>
-        <w:rPr>
-          <w:rFonts w:ascii="Arial" w:hAnsi="Arial" w:cs="Arial"/>
-          <w:sz w:val="24"/>
-          <w:szCs w:val="24"/>
-        </w:rPr>
-        <w:t>,</w:t>
-      </w:r>
-      <w:r>
-        <w:rPr>
-          <w:rFonts w:ascii="Arial" w:hAnsi="Arial" w:cs="Arial"/>
-          <w:sz w:val="24"/>
-          <w:szCs w:val="24"/>
-        </w:rPr>
-        <w:t xml:space="preserve"> no es una base de datos ampliamente estudiada, como se mencionaba anteriormente, estudiar este tipo de datos </w:t>
-      </w:r>
-      <w:r>
-        <w:rPr>
-          <w:rFonts w:ascii="Arial" w:hAnsi="Arial" w:cs="Arial"/>
-          <w:sz w:val="24"/>
-          <w:szCs w:val="24"/>
-        </w:rPr>
-        <w:t>ayuda</w:t>
-      </w:r>
-      <w:r>
-        <w:rPr>
-          <w:rFonts w:ascii="Arial" w:hAnsi="Arial" w:cs="Arial"/>
-          <w:sz w:val="24"/>
-          <w:szCs w:val="24"/>
-        </w:rPr>
-        <w:t xml:space="preserve"> a entender el fenómeno de la violencia de </w:t>
-      </w:r>
-      <w:r>
-        <w:rPr>
-          <w:rFonts w:ascii="Arial" w:hAnsi="Arial" w:cs="Arial"/>
-          <w:sz w:val="24"/>
-          <w:szCs w:val="24"/>
-        </w:rPr>
-        <w:t>género</w:t>
-      </w:r>
-      <w:r>
-        <w:rPr>
-          <w:rFonts w:ascii="Arial" w:hAnsi="Arial" w:cs="Arial"/>
-          <w:sz w:val="24"/>
-          <w:szCs w:val="24"/>
-        </w:rPr>
-        <w:t>.</w:t>
-      </w:r>
+        <w:t>Lo anterior plantea la siguiente pregunta de investigación: ¿En qué momentos se producen cambios estructurales estadísticamente significativos en la serie de tiempo de reportes de violencia de género al 9-1-1 en el municipio de Monterrey durante el periodo enero 2017 – septiembre 2022, y en qué medida dichos cambios coinciden con algún evento de interés identificable? Para responder esta pregunta, el presente trabajo propone la aplicación de técnicas estadísticas de detección de puntos de cambio, cuyo fundamento teórico y metodológico se desarrolla en los capítulos subsecuentes.</w:t>
+      </w:r>
+    </w:p>
+    <w:p>
+      <w:pPr>
+        <w:spacing w:line="360" w:lineRule="auto"/>
+        <w:ind w:firstLine="708"/>
+        <w:rPr>
+          <w:rFonts w:ascii="Arial" w:hAnsi="Arial" w:cs="Arial"/>
+          <w:sz w:val="24"/>
+          <w:szCs w:val="24"/>
+        </w:rPr>
+      </w:pPr>
+    </w:p>
+    <w:p>
+      <w:pPr>
+        <w:rPr>
+          <w:rFonts w:ascii="Arial" w:hAnsi="Arial" w:cs="Arial"/>
+          <w:sz w:val="24"/>
+          <w:szCs w:val="24"/>
+        </w:rPr>
+      </w:pPr>
+    </w:p>
+    <w:p>
+      <w:pPr>
+        <w:rPr>
+          <w:rFonts w:ascii="Arial" w:hAnsi="Arial" w:cs="Arial"/>
+          <w:sz w:val="24"/>
+          <w:szCs w:val="24"/>
+        </w:rPr>
+      </w:pPr>
+    </w:p>
+    <w:p>
+      <w:pPr>
+        <w:rPr>
+          <w:rFonts w:ascii="Arial" w:hAnsi="Arial" w:cs="Arial"/>
+          <w:sz w:val="24"/>
+          <w:szCs w:val="24"/>
+        </w:rPr>
+      </w:pPr>
+    </w:p>
+    <w:p>
+      <w:pPr>
+        <w:rPr>
+          <w:rFonts w:ascii="Arial" w:hAnsi="Arial" w:cs="Arial"/>
+          <w:sz w:val="24"/>
+          <w:szCs w:val="24"/>
+        </w:rPr>
+      </w:pPr>
+    </w:p>
+    <w:p>
+      <w:pPr>
+        <w:rPr>
+          <w:rFonts w:ascii="Arial" w:hAnsi="Arial" w:cs="Arial"/>
+          <w:sz w:val="24"/>
+          <w:szCs w:val="24"/>
+        </w:rPr>
+      </w:pPr>
+    </w:p>
+    <w:p>
+      <w:pPr>
+        <w:rPr>
+          <w:rFonts w:ascii="Arial" w:hAnsi="Arial" w:cs="Arial"/>
+          <w:sz w:val="24"/>
+          <w:szCs w:val="24"/>
+        </w:rPr>
+      </w:pPr>
+    </w:p>
+    <w:p>
+      <w:pPr>
+        <w:rPr>
+          <w:rFonts w:ascii="Arial" w:hAnsi="Arial" w:cs="Arial"/>
+          <w:sz w:val="24"/>
+          <w:szCs w:val="24"/>
+        </w:rPr>
+      </w:pPr>
+    </w:p>
+    <w:p>
+      <w:pPr>
+        <w:rPr>
+          <w:rFonts w:ascii="Arial" w:hAnsi="Arial" w:cs="Arial"/>
+          <w:sz w:val="24"/>
+          <w:szCs w:val="24"/>
+        </w:rPr>
+      </w:pPr>
+    </w:p>
+    <w:p>
+      <w:pPr>
+        <w:rPr>
+          <w:rFonts w:ascii="Arial" w:hAnsi="Arial" w:cs="Arial"/>
+          <w:sz w:val="24"/>
+          <w:szCs w:val="24"/>
+        </w:rPr>
+      </w:pPr>
+    </w:p>
+    <w:p>
+      <w:pPr>
+        <w:rPr>
+          <w:rFonts w:ascii="Arial" w:hAnsi="Arial" w:cs="Arial"/>
+          <w:sz w:val="24"/>
+          <w:szCs w:val="24"/>
+        </w:rPr>
+      </w:pPr>
+    </w:p>
+    <w:p>
+      <w:pPr>
+        <w:rPr>
+          <w:rFonts w:ascii="Arial" w:hAnsi="Arial" w:cs="Arial"/>
+          <w:sz w:val="24"/>
+          <w:szCs w:val="24"/>
+        </w:rPr>
+      </w:pPr>
+    </w:p>
+    <w:p>
+      <w:pPr>
+        <w:rPr>
+          <w:rFonts w:ascii="Arial" w:hAnsi="Arial" w:cs="Arial"/>
+          <w:b/>
+          <w:sz w:val="24"/>
+        </w:rPr>
+      </w:pPr>
+    </w:p>
+    <w:p>
+      <w:pPr>
+        <w:rPr>
+          <w:rFonts w:ascii="Arial" w:hAnsi="Arial" w:cs="Arial"/>
+          <w:b/>
+          <w:sz w:val="24"/>
+        </w:rPr>
+      </w:pPr>
+    </w:p>
+    <w:p>
+      <w:pPr>
+        <w:jc w:val="center"/>
+        <w:rPr>
+          <w:rFonts w:ascii="Arial" w:hAnsi="Arial" w:cs="Arial"/>
+          <w:b/>
+          <w:sz w:val="24"/>
+        </w:rPr>
+      </w:pPr>
+      <w:r>
+        <w:rPr>
+          <w:rFonts w:ascii="Arial" w:hAnsi="Arial" w:cs="Arial"/>
+          <w:b/>
+          <w:sz w:val="24"/>
+        </w:rPr>
+        <w:t>CAPÍTULO 3</w:t>
+      </w:r>
+    </w:p>
+    <w:p>
+      <w:pPr>
+        <w:pStyle w:val="Ttulo1"/>
+      </w:pPr>
+      <w:bookmarkStart w:id="5" w:name="_Toc130330328"/>
+      <w:r>
+        <w:t xml:space="preserve">3 </w:t>
+      </w:r>
+      <w:r>
+        <w:t>JUSITIFICACIÓN</w:t>
+      </w:r>
+      <w:bookmarkEnd w:id="5"/>
     </w:p>
     <w:p>
       <w:pPr>
@@ -3170,15 +3286,271 @@
           <w:sz w:val="24"/>
           <w:szCs w:val="24"/>
         </w:rPr>
-        <w:t xml:space="preserve">Una problemática es </w:t>
-      </w:r>
-      <w:r>
-        <w:rPr>
-          <w:rFonts w:ascii="Arial" w:hAnsi="Arial" w:cs="Arial"/>
-          <w:sz w:val="24"/>
-          <w:szCs w:val="24"/>
-        </w:rPr>
-        <w:t>analizar</w:t>
+        <w:t>Identificar los puntos de cambio de la serie de tiempo de</w:t>
+      </w:r>
+      <w:r>
+        <w:rPr>
+          <w:rFonts w:ascii="Arial" w:hAnsi="Arial" w:cs="Arial"/>
+          <w:sz w:val="24"/>
+          <w:szCs w:val="24"/>
+        </w:rPr>
+        <w:t xml:space="preserve"> reportes de violencia de género </w:t>
+      </w:r>
+      <w:r>
+        <w:rPr>
+          <w:rFonts w:ascii="Arial" w:hAnsi="Arial" w:cs="Arial"/>
+          <w:sz w:val="24"/>
+          <w:szCs w:val="24"/>
+        </w:rPr>
+        <w:t>puede ayudarnos a responder preguntas</w:t>
+      </w:r>
+      <w:r>
+        <w:rPr>
+          <w:rFonts w:ascii="Arial" w:hAnsi="Arial" w:cs="Arial"/>
+          <w:sz w:val="24"/>
+          <w:szCs w:val="24"/>
+        </w:rPr>
+        <w:t xml:space="preserve"> importantes</w:t>
+      </w:r>
+      <w:r>
+        <w:rPr>
+          <w:rFonts w:ascii="Arial" w:hAnsi="Arial" w:cs="Arial"/>
+          <w:sz w:val="24"/>
+          <w:szCs w:val="24"/>
+        </w:rPr>
+        <w:t xml:space="preserve"> del fenómeno de violen</w:t>
+      </w:r>
+      <w:r>
+        <w:rPr>
+          <w:rFonts w:ascii="Arial" w:hAnsi="Arial" w:cs="Arial"/>
+          <w:sz w:val="24"/>
+          <w:szCs w:val="24"/>
+        </w:rPr>
+        <w:t xml:space="preserve">cia de género. Las técnicas de detección de punto de cambio nos pueden ayudar a </w:t>
+      </w:r>
+      <w:r>
+        <w:rPr>
+          <w:rFonts w:ascii="Arial" w:hAnsi="Arial" w:cs="Arial"/>
+          <w:sz w:val="24"/>
+          <w:szCs w:val="24"/>
+        </w:rPr>
+        <w:t xml:space="preserve">monitorear </w:t>
+      </w:r>
+      <w:r>
+        <w:rPr>
+          <w:rFonts w:ascii="Arial" w:hAnsi="Arial" w:cs="Arial"/>
+          <w:sz w:val="24"/>
+          <w:szCs w:val="24"/>
+        </w:rPr>
+        <w:t xml:space="preserve">y evaluar el impacto que tienen </w:t>
+      </w:r>
+      <w:r>
+        <w:rPr>
+          <w:rFonts w:ascii="Arial" w:hAnsi="Arial" w:cs="Arial"/>
+          <w:sz w:val="24"/>
+          <w:szCs w:val="24"/>
+        </w:rPr>
+        <w:t xml:space="preserve">las políticas y programas </w:t>
+      </w:r>
+      <w:r>
+        <w:rPr>
+          <w:rFonts w:ascii="Arial" w:hAnsi="Arial" w:cs="Arial"/>
+          <w:sz w:val="24"/>
+          <w:szCs w:val="24"/>
+        </w:rPr>
+        <w:t>que buscan atacar la problemática de</w:t>
+      </w:r>
+      <w:r>
+        <w:rPr>
+          <w:rFonts w:ascii="Arial" w:hAnsi="Arial" w:cs="Arial"/>
+          <w:sz w:val="24"/>
+          <w:szCs w:val="24"/>
+        </w:rPr>
+        <w:t xml:space="preserve"> la violencia de género. </w:t>
+      </w:r>
+      <w:r>
+        <w:rPr>
+          <w:rFonts w:ascii="Arial" w:hAnsi="Arial" w:cs="Arial"/>
+          <w:sz w:val="24"/>
+          <w:szCs w:val="24"/>
+        </w:rPr>
+        <w:t>Esto podría ayudar a</w:t>
+      </w:r>
+      <w:r>
+        <w:rPr>
+          <w:rFonts w:ascii="Arial" w:hAnsi="Arial" w:cs="Arial"/>
+          <w:sz w:val="24"/>
+          <w:szCs w:val="24"/>
+        </w:rPr>
+        <w:t xml:space="preserve"> que los recursos</w:t>
+      </w:r>
+      <w:r>
+        <w:rPr>
+          <w:rFonts w:ascii="Arial" w:hAnsi="Arial" w:cs="Arial"/>
+          <w:sz w:val="24"/>
+          <w:szCs w:val="24"/>
+        </w:rPr>
+        <w:t xml:space="preserve"> se utilicen de manera efectiva.</w:t>
+      </w:r>
+    </w:p>
+    <w:p>
+      <w:pPr>
+        <w:spacing w:line="360" w:lineRule="auto"/>
+        <w:jc w:val="both"/>
+        <w:rPr>
+          <w:rFonts w:ascii="Arial" w:hAnsi="Arial" w:cs="Arial"/>
+          <w:sz w:val="24"/>
+          <w:szCs w:val="24"/>
+        </w:rPr>
+      </w:pPr>
+      <w:r>
+        <w:rPr>
+          <w:rFonts w:ascii="Arial" w:hAnsi="Arial" w:cs="Arial"/>
+          <w:sz w:val="24"/>
+          <w:szCs w:val="24"/>
+        </w:rPr>
+        <w:tab/>
+        <w:t xml:space="preserve">Además la técnica de detección de puntos de cambio </w:t>
+      </w:r>
+      <w:r>
+        <w:rPr>
+          <w:rFonts w:ascii="Arial" w:hAnsi="Arial" w:cs="Arial"/>
+          <w:sz w:val="24"/>
+          <w:szCs w:val="24"/>
+        </w:rPr>
+        <w:t xml:space="preserve">podría ser útil para </w:t>
+      </w:r>
+      <w:r>
+        <w:rPr>
+          <w:rFonts w:ascii="Arial" w:hAnsi="Arial" w:cs="Arial"/>
+          <w:sz w:val="24"/>
+          <w:szCs w:val="24"/>
+        </w:rPr>
+        <w:t xml:space="preserve"> i</w:t>
+      </w:r>
+      <w:r>
+        <w:rPr>
+          <w:rFonts w:ascii="Arial" w:hAnsi="Arial" w:cs="Arial"/>
+          <w:sz w:val="24"/>
+          <w:szCs w:val="24"/>
+        </w:rPr>
+        <w:t>dentificar cambi</w:t>
+      </w:r>
+      <w:r>
+        <w:rPr>
+          <w:rFonts w:ascii="Arial" w:hAnsi="Arial" w:cs="Arial"/>
+          <w:sz w:val="24"/>
+          <w:szCs w:val="24"/>
+        </w:rPr>
+        <w:t>os en los patrones de violencia,</w:t>
+      </w:r>
+      <w:r>
+        <w:rPr>
+          <w:rFonts w:ascii="Arial" w:hAnsi="Arial" w:cs="Arial"/>
+          <w:sz w:val="24"/>
+          <w:szCs w:val="24"/>
+        </w:rPr>
+        <w:t xml:space="preserve"> identificar cambios significativos en</w:t>
+      </w:r>
+      <w:r>
+        <w:rPr>
+          <w:rFonts w:ascii="Arial" w:hAnsi="Arial" w:cs="Arial"/>
+          <w:sz w:val="24"/>
+          <w:szCs w:val="24"/>
+        </w:rPr>
+        <w:t xml:space="preserve"> la serie de tiempo</w:t>
+      </w:r>
+      <w:r>
+        <w:rPr>
+          <w:rFonts w:ascii="Arial" w:hAnsi="Arial" w:cs="Arial"/>
+          <w:sz w:val="24"/>
+          <w:szCs w:val="24"/>
+        </w:rPr>
+        <w:t>, como un aumento repentino en los casos de violencia en</w:t>
+      </w:r>
+      <w:r>
+        <w:rPr>
+          <w:rFonts w:ascii="Arial" w:hAnsi="Arial" w:cs="Arial"/>
+          <w:sz w:val="24"/>
+          <w:szCs w:val="24"/>
+        </w:rPr>
+        <w:t xml:space="preserve"> un periodo específico</w:t>
+      </w:r>
+      <w:r>
+        <w:rPr>
+          <w:rFonts w:ascii="Arial" w:hAnsi="Arial" w:cs="Arial"/>
+          <w:sz w:val="24"/>
+          <w:szCs w:val="24"/>
+        </w:rPr>
+        <w:t xml:space="preserve"> o un cambio en la volatilidad de la serie.</w:t>
+      </w:r>
+      <w:r>
+        <w:rPr>
+          <w:rFonts w:ascii="Arial" w:hAnsi="Arial" w:cs="Arial"/>
+          <w:sz w:val="24"/>
+          <w:szCs w:val="24"/>
+        </w:rPr>
+        <w:t xml:space="preserve"> Esto puede ayudar a las autoridades a </w:t>
+      </w:r>
+      <w:r>
+        <w:rPr>
+          <w:rFonts w:ascii="Arial" w:hAnsi="Arial" w:cs="Arial"/>
+          <w:sz w:val="24"/>
+          <w:szCs w:val="24"/>
+        </w:rPr>
+        <w:t xml:space="preserve">gestionar </w:t>
+      </w:r>
+      <w:r>
+        <w:rPr>
+          <w:rFonts w:ascii="Arial" w:hAnsi="Arial" w:cs="Arial"/>
+          <w:sz w:val="24"/>
+          <w:szCs w:val="24"/>
+        </w:rPr>
+        <w:t xml:space="preserve">sus recursos y tomar medidas </w:t>
+      </w:r>
+      <w:r>
+        <w:rPr>
+          <w:rFonts w:ascii="Arial" w:hAnsi="Arial" w:cs="Arial"/>
+          <w:sz w:val="24"/>
+          <w:szCs w:val="24"/>
+        </w:rPr>
+        <w:t>acorde a los hallazgos.</w:t>
+      </w:r>
+    </w:p>
+    <w:p>
+      <w:pPr>
+        <w:spacing w:line="360" w:lineRule="auto"/>
+        <w:jc w:val="both"/>
+        <w:rPr>
+          <w:rFonts w:ascii="Arial" w:hAnsi="Arial" w:cs="Arial"/>
+          <w:sz w:val="24"/>
+          <w:szCs w:val="24"/>
+        </w:rPr>
+      </w:pPr>
+      <w:r>
+        <w:rPr>
+          <w:rFonts w:ascii="Arial" w:hAnsi="Arial" w:cs="Arial"/>
+          <w:sz w:val="24"/>
+          <w:szCs w:val="24"/>
+        </w:rPr>
+        <w:tab/>
+        <w:t>Uno de los puntos más importantes para atacar la violencia a la mujer es la sensibilización de la sociedad, el estudio de la violencia de género mediante técnica</w:t>
+      </w:r>
+      <w:r>
+        <w:rPr>
+          <w:rFonts w:ascii="Arial" w:hAnsi="Arial" w:cs="Arial"/>
+          <w:sz w:val="24"/>
+          <w:szCs w:val="24"/>
+        </w:rPr>
+        <w:t xml:space="preserve">s estadísticas nos otorga la capacidad de </w:t>
+      </w:r>
+      <w:r>
+        <w:rPr>
+          <w:rFonts w:ascii="Arial" w:hAnsi="Arial" w:cs="Arial"/>
+          <w:sz w:val="24"/>
+          <w:szCs w:val="24"/>
+        </w:rPr>
+        <w:t xml:space="preserve"> dimensionar la magnitud del problema. Los</w:t>
       </w:r>
       <w:r>
         <w:rPr>
@@ -3194,167 +3566,16 @@
           <w:sz w:val="24"/>
           <w:szCs w:val="24"/>
         </w:rPr>
-        <w:t>el comportamiento de la serie de tiempo del número de reportes realizados e identificar patrones o momentos en los que las propiedades de la serie de tiempo tienen un cambio.</w:t>
-      </w:r>
-    </w:p>
-    <w:p>
-      <w:pPr>
-        <w:spacing w:line="360" w:lineRule="auto"/>
-        <w:ind w:firstLine="708"/>
-        <w:rPr>
-          <w:rFonts w:ascii="Arial" w:hAnsi="Arial" w:cs="Arial"/>
-          <w:sz w:val="24"/>
-          <w:szCs w:val="24"/>
-        </w:rPr>
-      </w:pPr>
-    </w:p>
-    <w:p>
-      <w:pPr>
-        <w:rPr>
-          <w:rFonts w:ascii="Arial" w:hAnsi="Arial" w:cs="Arial"/>
-          <w:sz w:val="24"/>
-          <w:szCs w:val="24"/>
-        </w:rPr>
-      </w:pPr>
-    </w:p>
-    <w:p>
-      <w:pPr>
-        <w:rPr>
-          <w:rFonts w:ascii="Arial" w:hAnsi="Arial" w:cs="Arial"/>
-          <w:sz w:val="24"/>
-          <w:szCs w:val="24"/>
-        </w:rPr>
-      </w:pPr>
-    </w:p>
-    <w:p>
-      <w:pPr>
-        <w:rPr>
-          <w:rFonts w:ascii="Arial" w:hAnsi="Arial" w:cs="Arial"/>
-          <w:sz w:val="24"/>
-          <w:szCs w:val="24"/>
-        </w:rPr>
-      </w:pPr>
-    </w:p>
-    <w:p>
-      <w:pPr>
-        <w:rPr>
-          <w:rFonts w:ascii="Arial" w:hAnsi="Arial" w:cs="Arial"/>
-          <w:sz w:val="24"/>
-          <w:szCs w:val="24"/>
-        </w:rPr>
-      </w:pPr>
-    </w:p>
-    <w:p>
-      <w:pPr>
-        <w:rPr>
-          <w:rFonts w:ascii="Arial" w:hAnsi="Arial" w:cs="Arial"/>
-          <w:sz w:val="24"/>
-          <w:szCs w:val="24"/>
-        </w:rPr>
-      </w:pPr>
-    </w:p>
-    <w:p>
-      <w:pPr>
-        <w:rPr>
-          <w:rFonts w:ascii="Arial" w:hAnsi="Arial" w:cs="Arial"/>
-          <w:sz w:val="24"/>
-          <w:szCs w:val="24"/>
-        </w:rPr>
-      </w:pPr>
-    </w:p>
-    <w:p>
-      <w:pPr>
-        <w:rPr>
-          <w:rFonts w:ascii="Arial" w:hAnsi="Arial" w:cs="Arial"/>
-          <w:sz w:val="24"/>
-          <w:szCs w:val="24"/>
-        </w:rPr>
-      </w:pPr>
-    </w:p>
-    <w:p>
-      <w:pPr>
-        <w:rPr>
-          <w:rFonts w:ascii="Arial" w:hAnsi="Arial" w:cs="Arial"/>
-          <w:sz w:val="24"/>
-          <w:szCs w:val="24"/>
-        </w:rPr>
-      </w:pPr>
-    </w:p>
-    <w:p>
-      <w:pPr>
-        <w:rPr>
-          <w:rFonts w:ascii="Arial" w:hAnsi="Arial" w:cs="Arial"/>
-          <w:sz w:val="24"/>
-          <w:szCs w:val="24"/>
-        </w:rPr>
-      </w:pPr>
-    </w:p>
-    <w:p>
-      <w:pPr>
-        <w:rPr>
-          <w:rFonts w:ascii="Arial" w:hAnsi="Arial" w:cs="Arial"/>
-          <w:sz w:val="24"/>
-          <w:szCs w:val="24"/>
-        </w:rPr>
-      </w:pPr>
-    </w:p>
-    <w:p>
-      <w:pPr>
-        <w:rPr>
-          <w:rFonts w:ascii="Arial" w:hAnsi="Arial" w:cs="Arial"/>
-          <w:sz w:val="24"/>
-          <w:szCs w:val="24"/>
-        </w:rPr>
-      </w:pPr>
-    </w:p>
-    <w:p>
-      <w:pPr>
-        <w:rPr>
-          <w:rFonts w:ascii="Arial" w:hAnsi="Arial" w:cs="Arial"/>
-          <w:b/>
-          <w:sz w:val="24"/>
-        </w:rPr>
-      </w:pPr>
-    </w:p>
-    <w:p>
-      <w:pPr>
-        <w:rPr>
-          <w:rFonts w:ascii="Arial" w:hAnsi="Arial" w:cs="Arial"/>
-          <w:b/>
-          <w:sz w:val="24"/>
-        </w:rPr>
-      </w:pPr>
-    </w:p>
-    <w:p>
-      <w:pPr>
-        <w:jc w:val="center"/>
-        <w:rPr>
-          <w:rFonts w:ascii="Arial" w:hAnsi="Arial" w:cs="Arial"/>
-          <w:b/>
-          <w:sz w:val="24"/>
-        </w:rPr>
-      </w:pPr>
-      <w:r>
-        <w:rPr>
-          <w:rFonts w:ascii="Arial" w:hAnsi="Arial" w:cs="Arial"/>
-          <w:b/>
-          <w:sz w:val="24"/>
-        </w:rPr>
-        <w:t>CAPÍTULO 3</w:t>
-      </w:r>
-    </w:p>
-    <w:p>
-      <w:pPr>
-        <w:pStyle w:val="Ttulo1"/>
-      </w:pPr>
-      <w:bookmarkStart w:id="5" w:name="_Toc130330328"/>
-      <w:r>
-        <w:t xml:space="preserve">3 </w:t>
-      </w:r>
-      <w:r>
-        <w:t>JUSITIFICACIÓN</w:t>
-      </w:r>
-      <w:bookmarkEnd w:id="5"/>
+        <w:t xml:space="preserve"> resultados obtenidos pueden</w:t>
+      </w:r>
+      <w:r>
+        <w:rPr>
+          <w:rFonts w:ascii="Arial" w:hAnsi="Arial" w:cs="Arial"/>
+          <w:sz w:val="24"/>
+          <w:szCs w:val="24"/>
+        </w:rPr>
+        <w:t xml:space="preserve"> educar a la población sobre los patrones de violencia de género, los grupos de mujeres más afectados y las consecuencias de la violencia. Esto puede fomentar una mayor conciencia y compromiso en la sociedad para abordar la violencia de género.</w:t>
+      </w:r>
     </w:p>
     <w:p>
       <w:pPr>
@@ -3373,314 +3594,6 @@
           <w:sz w:val="24"/>
           <w:szCs w:val="24"/>
         </w:rPr>
-        <w:t>Identificar los puntos de cambio de la serie de tiempo de</w:t>
-      </w:r>
-      <w:r>
-        <w:rPr>
-          <w:rFonts w:ascii="Arial" w:hAnsi="Arial" w:cs="Arial"/>
-          <w:sz w:val="24"/>
-          <w:szCs w:val="24"/>
-        </w:rPr>
-        <w:t xml:space="preserve"> reportes de violencia de género </w:t>
-      </w:r>
-      <w:r>
-        <w:rPr>
-          <w:rFonts w:ascii="Arial" w:hAnsi="Arial" w:cs="Arial"/>
-          <w:sz w:val="24"/>
-          <w:szCs w:val="24"/>
-        </w:rPr>
-        <w:t>puede ayudarnos a responder preguntas</w:t>
-      </w:r>
-      <w:r>
-        <w:rPr>
-          <w:rFonts w:ascii="Arial" w:hAnsi="Arial" w:cs="Arial"/>
-          <w:sz w:val="24"/>
-          <w:szCs w:val="24"/>
-        </w:rPr>
-        <w:t xml:space="preserve"> importantes</w:t>
-      </w:r>
-      <w:r>
-        <w:rPr>
-          <w:rFonts w:ascii="Arial" w:hAnsi="Arial" w:cs="Arial"/>
-          <w:sz w:val="24"/>
-          <w:szCs w:val="24"/>
-        </w:rPr>
-        <w:t xml:space="preserve"> del fenómeno de violen</w:t>
-      </w:r>
-      <w:r>
-        <w:rPr>
-          <w:rFonts w:ascii="Arial" w:hAnsi="Arial" w:cs="Arial"/>
-          <w:sz w:val="24"/>
-          <w:szCs w:val="24"/>
-        </w:rPr>
-        <w:t xml:space="preserve">cia de género. Las técnicas de detección de punto de cambio nos pueden ayudar a </w:t>
-      </w:r>
-      <w:r>
-        <w:rPr>
-          <w:rFonts w:ascii="Arial" w:hAnsi="Arial" w:cs="Arial"/>
-          <w:sz w:val="24"/>
-          <w:szCs w:val="24"/>
-        </w:rPr>
-        <w:t xml:space="preserve">monitorear </w:t>
-      </w:r>
-      <w:r>
-        <w:rPr>
-          <w:rFonts w:ascii="Arial" w:hAnsi="Arial" w:cs="Arial"/>
-          <w:sz w:val="24"/>
-          <w:szCs w:val="24"/>
-        </w:rPr>
-        <w:t xml:space="preserve">y evaluar el impacto que tienen </w:t>
-      </w:r>
-      <w:r>
-        <w:rPr>
-          <w:rFonts w:ascii="Arial" w:hAnsi="Arial" w:cs="Arial"/>
-          <w:sz w:val="24"/>
-          <w:szCs w:val="24"/>
-        </w:rPr>
-        <w:t xml:space="preserve">las políticas y programas </w:t>
-      </w:r>
-      <w:r>
-        <w:rPr>
-          <w:rFonts w:ascii="Arial" w:hAnsi="Arial" w:cs="Arial"/>
-          <w:sz w:val="24"/>
-          <w:szCs w:val="24"/>
-        </w:rPr>
-        <w:t>que buscan atacar la problemática de</w:t>
-      </w:r>
-      <w:r>
-        <w:rPr>
-          <w:rFonts w:ascii="Arial" w:hAnsi="Arial" w:cs="Arial"/>
-          <w:sz w:val="24"/>
-          <w:szCs w:val="24"/>
-        </w:rPr>
-        <w:t xml:space="preserve"> la violencia de género. </w:t>
-      </w:r>
-      <w:r>
-        <w:rPr>
-          <w:rFonts w:ascii="Arial" w:hAnsi="Arial" w:cs="Arial"/>
-          <w:sz w:val="24"/>
-          <w:szCs w:val="24"/>
-        </w:rPr>
-        <w:t>Esto podría ayudar a</w:t>
-      </w:r>
-      <w:r>
-        <w:rPr>
-          <w:rFonts w:ascii="Arial" w:hAnsi="Arial" w:cs="Arial"/>
-          <w:sz w:val="24"/>
-          <w:szCs w:val="24"/>
-        </w:rPr>
-        <w:t xml:space="preserve"> que los recursos</w:t>
-      </w:r>
-      <w:r>
-        <w:rPr>
-          <w:rFonts w:ascii="Arial" w:hAnsi="Arial" w:cs="Arial"/>
-          <w:sz w:val="24"/>
-          <w:szCs w:val="24"/>
-        </w:rPr>
-        <w:t xml:space="preserve"> se utilicen de manera efectiva.</w:t>
-      </w:r>
-    </w:p>
-    <w:p>
-      <w:pPr>
-        <w:spacing w:line="360" w:lineRule="auto"/>
-        <w:jc w:val="both"/>
-        <w:rPr>
-          <w:rFonts w:ascii="Arial" w:hAnsi="Arial" w:cs="Arial"/>
-          <w:sz w:val="24"/>
-          <w:szCs w:val="24"/>
-        </w:rPr>
-      </w:pPr>
-      <w:r>
-        <w:rPr>
-          <w:rFonts w:ascii="Arial" w:hAnsi="Arial" w:cs="Arial"/>
-          <w:sz w:val="24"/>
-          <w:szCs w:val="24"/>
-        </w:rPr>
-        <w:tab/>
-        <w:t xml:space="preserve">Además la técnica de detección de puntos de cambio </w:t>
-      </w:r>
-      <w:r>
-        <w:rPr>
-          <w:rFonts w:ascii="Arial" w:hAnsi="Arial" w:cs="Arial"/>
-          <w:sz w:val="24"/>
-          <w:szCs w:val="24"/>
-        </w:rPr>
-        <w:t xml:space="preserve">podría ser útil para </w:t>
-      </w:r>
-      <w:r>
-        <w:rPr>
-          <w:rFonts w:ascii="Arial" w:hAnsi="Arial" w:cs="Arial"/>
-          <w:sz w:val="24"/>
-          <w:szCs w:val="24"/>
-        </w:rPr>
-        <w:t xml:space="preserve"> i</w:t>
-      </w:r>
-      <w:r>
-        <w:rPr>
-          <w:rFonts w:ascii="Arial" w:hAnsi="Arial" w:cs="Arial"/>
-          <w:sz w:val="24"/>
-          <w:szCs w:val="24"/>
-        </w:rPr>
-        <w:t>dentificar cambi</w:t>
-      </w:r>
-      <w:r>
-        <w:rPr>
-          <w:rFonts w:ascii="Arial" w:hAnsi="Arial" w:cs="Arial"/>
-          <w:sz w:val="24"/>
-          <w:szCs w:val="24"/>
-        </w:rPr>
-        <w:t>os en los patrones de violencia,</w:t>
-      </w:r>
-      <w:r>
-        <w:rPr>
-          <w:rFonts w:ascii="Arial" w:hAnsi="Arial" w:cs="Arial"/>
-          <w:sz w:val="24"/>
-          <w:szCs w:val="24"/>
-        </w:rPr>
-        <w:t xml:space="preserve"> identificar cambios significativos en</w:t>
-      </w:r>
-      <w:r>
-        <w:rPr>
-          <w:rFonts w:ascii="Arial" w:hAnsi="Arial" w:cs="Arial"/>
-          <w:sz w:val="24"/>
-          <w:szCs w:val="24"/>
-        </w:rPr>
-        <w:t xml:space="preserve"> la serie de tiempo</w:t>
-      </w:r>
-      <w:r>
-        <w:rPr>
-          <w:rFonts w:ascii="Arial" w:hAnsi="Arial" w:cs="Arial"/>
-          <w:sz w:val="24"/>
-          <w:szCs w:val="24"/>
-        </w:rPr>
-        <w:t>, como un aumento repentino en los casos de violencia en</w:t>
-      </w:r>
-      <w:r>
-        <w:rPr>
-          <w:rFonts w:ascii="Arial" w:hAnsi="Arial" w:cs="Arial"/>
-          <w:sz w:val="24"/>
-          <w:szCs w:val="24"/>
-        </w:rPr>
-        <w:t xml:space="preserve"> un periodo específico</w:t>
-      </w:r>
-      <w:r>
-        <w:rPr>
-          <w:rFonts w:ascii="Arial" w:hAnsi="Arial" w:cs="Arial"/>
-          <w:sz w:val="24"/>
-          <w:szCs w:val="24"/>
-        </w:rPr>
-        <w:t xml:space="preserve"> o un cambio en la volatilidad de la serie.</w:t>
-      </w:r>
-      <w:r>
-        <w:rPr>
-          <w:rFonts w:ascii="Arial" w:hAnsi="Arial" w:cs="Arial"/>
-          <w:sz w:val="24"/>
-          <w:szCs w:val="24"/>
-        </w:rPr>
-        <w:t xml:space="preserve"> Esto puede ayudar a las autoridades a </w:t>
-      </w:r>
-      <w:r>
-        <w:rPr>
-          <w:rFonts w:ascii="Arial" w:hAnsi="Arial" w:cs="Arial"/>
-          <w:sz w:val="24"/>
-          <w:szCs w:val="24"/>
-        </w:rPr>
-        <w:t xml:space="preserve">gestionar </w:t>
-      </w:r>
-      <w:r>
-        <w:rPr>
-          <w:rFonts w:ascii="Arial" w:hAnsi="Arial" w:cs="Arial"/>
-          <w:sz w:val="24"/>
-          <w:szCs w:val="24"/>
-        </w:rPr>
-        <w:t xml:space="preserve">sus recursos y tomar medidas </w:t>
-      </w:r>
-      <w:r>
-        <w:rPr>
-          <w:rFonts w:ascii="Arial" w:hAnsi="Arial" w:cs="Arial"/>
-          <w:sz w:val="24"/>
-          <w:szCs w:val="24"/>
-        </w:rPr>
-        <w:t>acorde a los hallazgos.</w:t>
-      </w:r>
-    </w:p>
-    <w:p>
-      <w:pPr>
-        <w:spacing w:line="360" w:lineRule="auto"/>
-        <w:jc w:val="both"/>
-        <w:rPr>
-          <w:rFonts w:ascii="Arial" w:hAnsi="Arial" w:cs="Arial"/>
-          <w:sz w:val="24"/>
-          <w:szCs w:val="24"/>
-        </w:rPr>
-      </w:pPr>
-      <w:r>
-        <w:rPr>
-          <w:rFonts w:ascii="Arial" w:hAnsi="Arial" w:cs="Arial"/>
-          <w:sz w:val="24"/>
-          <w:szCs w:val="24"/>
-        </w:rPr>
-        <w:tab/>
-        <w:t>Uno de los puntos más importantes para atacar la violencia a la mujer es la sensibilización de la sociedad, el estudio de la violencia de género mediante técnica</w:t>
-      </w:r>
-      <w:r>
-        <w:rPr>
-          <w:rFonts w:ascii="Arial" w:hAnsi="Arial" w:cs="Arial"/>
-          <w:sz w:val="24"/>
-          <w:szCs w:val="24"/>
-        </w:rPr>
-        <w:t xml:space="preserve">s estadísticas nos otorga la capacidad de </w:t>
-      </w:r>
-      <w:r>
-        <w:rPr>
-          <w:rFonts w:ascii="Arial" w:hAnsi="Arial" w:cs="Arial"/>
-          <w:sz w:val="24"/>
-          <w:szCs w:val="24"/>
-        </w:rPr>
-        <w:t xml:space="preserve"> dimensionar la magnitud del problema. Los</w:t>
-      </w:r>
-      <w:r>
-        <w:rPr>
-          <w:rFonts w:ascii="Arial" w:hAnsi="Arial" w:cs="Arial"/>
-          <w:sz w:val="24"/>
-          <w:szCs w:val="24"/>
-        </w:rPr>
-        <w:t xml:space="preserve"> </w:t>
-      </w:r>
-      <w:r>
-        <w:rPr>
-          <w:rFonts w:ascii="Arial" w:hAnsi="Arial" w:cs="Arial"/>
-          <w:sz w:val="24"/>
-          <w:szCs w:val="24"/>
-        </w:rPr>
-        <w:t xml:space="preserve"> resultados obtenidos pueden</w:t>
-      </w:r>
-      <w:r>
-        <w:rPr>
-          <w:rFonts w:ascii="Arial" w:hAnsi="Arial" w:cs="Arial"/>
-          <w:sz w:val="24"/>
-          <w:szCs w:val="24"/>
-        </w:rPr>
-        <w:t xml:space="preserve"> educar a la población sobre los patrones de violencia de género, los grupos de mujeres más afectados y las consecuencias de la violencia. Esto puede fomentar una mayor conciencia y compromiso en la sociedad para abordar la violencia de género.</w:t>
-      </w:r>
-    </w:p>
-    <w:p>
-      <w:pPr>
-        <w:spacing w:line="360" w:lineRule="auto"/>
-        <w:ind w:firstLine="708"/>
-        <w:jc w:val="both"/>
-        <w:rPr>
-          <w:rFonts w:ascii="Arial" w:hAnsi="Arial" w:cs="Arial"/>
-          <w:sz w:val="24"/>
-          <w:szCs w:val="24"/>
-        </w:rPr>
-      </w:pPr>
-      <w:r>
-        <w:rPr>
-          <w:rFonts w:ascii="Arial" w:hAnsi="Arial" w:cs="Arial"/>
-          <w:sz w:val="24"/>
-          <w:szCs w:val="24"/>
-        </w:rPr>
         <w:t xml:space="preserve">Además, estudiar el problema utilizando está serie de tiempo de reportes realizados al 911 nos </w:t>
       </w:r>
       <w:r>
@@ -3697,7 +3610,7 @@
           <w:sz w:val="24"/>
           <w:szCs w:val="24"/>
         </w:rPr>
-        <w:t xml:space="preserve">una fotografía más amplia del problema, si bien, no todos los reportes realizados al 911 pueden derivar en una denuncia formal, es importante recordar que existe un sesgo en las estadísticas oficiales </w:t>
+        <w:t xml:space="preserve">una fotografía más amplia del problema, si bien, no todos los reportes realizados al 911 pueden derivar en una denuncia </w:t>
       </w:r>
       <w:r>
         <w:rPr>
@@ -3706,7 +3619,7 @@
           <w:szCs w:val="24"/>
         </w:rPr>
         <w:lastRenderedPageBreak/>
-        <w:t>de denuncias por delitos relacionados con violencia de género debido a la falta de denuncias.</w:t>
+        <w:t>formal, es importante recordar que existe un sesgo en las estadísticas oficiales de denuncias por delitos relacionados con violencia de género debido a la falta de denuncias.</w:t>
       </w:r>
     </w:p>
     <w:p>
@@ -5847,8 +5760,6 @@
         </w:rPr>
         <w:t>”. U</w:t>
       </w:r>
-      <w:bookmarkStart w:id="8" w:name="_GoBack"/>
-      <w:bookmarkEnd w:id="8"/>
       <w:r>
         <w:rPr>
           <w:rFonts w:ascii="Arial" w:hAnsi="Arial" w:cs="Arial"/>
@@ -6862,7 +6773,7 @@
           <w:sz w:val="24"/>
           <w:szCs w:val="24"/>
         </w:rPr>
-        <w:t xml:space="preserve"> et. Al</w:t>
+        <w:t xml:space="preserve"> et. </w:t>
       </w:r>
       <w:proofErr w:type="gramStart"/>
       <w:r>
@@ -6871,7 +6782,7 @@
           <w:sz w:val="24"/>
           <w:szCs w:val="24"/>
         </w:rPr>
-        <w:t>.(</w:t>
+        <w:t>Al.(</w:t>
       </w:r>
       <w:proofErr w:type="gramEnd"/>
       <w:r>
@@ -7963,23 +7874,7 @@
             <w:sz w:val="24"/>
             <w:szCs w:val="24"/>
           </w:rPr>
-          <m:t>k</m:t>
-        </m:r>
-        <m:r>
-          <w:rPr>
-            <w:rFonts w:ascii="Cambria Math" w:eastAsiaTheme="minorEastAsia" w:hAnsi="Cambria Math" w:cs="Arial"/>
-            <w:sz w:val="24"/>
-            <w:szCs w:val="24"/>
-          </w:rPr>
-          <m:t>+1</m:t>
-        </m:r>
-        <m:r>
-          <w:rPr>
-            <w:rFonts w:ascii="Cambria Math" w:eastAsiaTheme="minorEastAsia" w:hAnsi="Cambria Math" w:cs="Arial"/>
-            <w:sz w:val="24"/>
-            <w:szCs w:val="24"/>
-          </w:rPr>
-          <m:t xml:space="preserve"> </m:t>
+          <m:t xml:space="preserve">k+1 </m:t>
         </m:r>
       </m:oMath>
       <w:r>
@@ -8526,7 +8421,7 @@
           <w:sz w:val="24"/>
           <w:szCs w:val="24"/>
         </w:rPr>
-        <w:t>multi</w:t>
+        <w:t>multi-clase</w:t>
       </w:r>
       <w:proofErr w:type="spellEnd"/>
       <w:r>
@@ -8535,7 +8430,7 @@
           <w:sz w:val="24"/>
           <w:szCs w:val="24"/>
         </w:rPr>
-        <w:t xml:space="preserve">-clase y el segundo es clasificación binaria, en la figura 6 observamos un diagrama </w:t>
+        <w:t xml:space="preserve"> y el segundo es clasificación binaria, en la figura 6 observamos un diagrama </w:t>
       </w:r>
       <w:r>
         <w:rPr>
@@ -8707,7 +8602,25 @@
           <w:sz w:val="24"/>
           <w:szCs w:val="24"/>
         </w:rPr>
-        <w:t xml:space="preserve"> of </w:t>
+        <w:t xml:space="preserve"> </w:t>
+      </w:r>
+      <w:proofErr w:type="spellStart"/>
+      <w:r>
+        <w:rPr>
+          <w:rFonts w:ascii="Arial" w:hAnsi="Arial" w:cs="Arial"/>
+          <w:sz w:val="24"/>
+          <w:szCs w:val="24"/>
+        </w:rPr>
+        <w:t>of</w:t>
+      </w:r>
+      <w:proofErr w:type="spellEnd"/>
+      <w:r>
+        <w:rPr>
+          <w:rFonts w:ascii="Arial" w:hAnsi="Arial" w:cs="Arial"/>
+          <w:sz w:val="24"/>
+          <w:szCs w:val="24"/>
+        </w:rPr>
+        <w:t xml:space="preserve"> </w:t>
       </w:r>
       <w:proofErr w:type="spellStart"/>
       <w:r>
@@ -8994,7 +8907,25 @@
           <w:sz w:val="24"/>
           <w:szCs w:val="24"/>
         </w:rPr>
-        <w:t xml:space="preserve"> of </w:t>
+        <w:t xml:space="preserve"> </w:t>
+      </w:r>
+      <w:proofErr w:type="spellStart"/>
+      <w:r>
+        <w:rPr>
+          <w:rFonts w:ascii="Arial" w:hAnsi="Arial" w:cs="Arial"/>
+          <w:sz w:val="24"/>
+          <w:szCs w:val="24"/>
+        </w:rPr>
+        <w:t>of</w:t>
+      </w:r>
+      <w:proofErr w:type="spellEnd"/>
+      <w:r>
+        <w:rPr>
+          <w:rFonts w:ascii="Arial" w:hAnsi="Arial" w:cs="Arial"/>
+          <w:sz w:val="24"/>
+          <w:szCs w:val="24"/>
+        </w:rPr>
+        <w:t xml:space="preserve"> </w:t>
       </w:r>
       <w:proofErr w:type="spellStart"/>
       <w:r>
@@ -11255,14 +11186,14 @@
       <w:pPr>
         <w:pStyle w:val="Ttulo1"/>
       </w:pPr>
-      <w:bookmarkStart w:id="9" w:name="_Toc130330331"/>
+      <w:bookmarkStart w:id="8" w:name="_Toc130330331"/>
       <w:r>
         <w:t xml:space="preserve">6 </w:t>
       </w:r>
       <w:r>
         <w:t>METODOLOGÍA</w:t>
       </w:r>
-      <w:bookmarkEnd w:id="9"/>
+      <w:bookmarkEnd w:id="8"/>
     </w:p>
     <w:p>
       <w:pPr>
@@ -11416,14 +11347,14 @@
       <w:pPr>
         <w:pStyle w:val="Ttulo1"/>
       </w:pPr>
-      <w:bookmarkStart w:id="10" w:name="_Toc130330332"/>
+      <w:bookmarkStart w:id="9" w:name="_Toc130330332"/>
       <w:r>
         <w:t xml:space="preserve">7 </w:t>
       </w:r>
       <w:r>
         <w:t>RESULTADOS Y CONCLUSIONES</w:t>
       </w:r>
-      <w:bookmarkEnd w:id="10"/>
+      <w:bookmarkEnd w:id="9"/>
     </w:p>
     <w:p>
       <w:pPr>
@@ -11587,7 +11518,131 @@
           <w:sz w:val="24"/>
           <w:szCs w:val="32"/>
         </w:rPr>
-        <w:t>Datos Abiertos Monterrey</w:t>
+        <w:t>INEGI. (2022a). Encuesta Nacional sobre la Dinámica de las Relaciones en los Hogares (ENDIREH) 2021. Instituto Nacional de Estadística y Geografía. https://www.inegi.org.mx/programas/endireh/2021/</w:t>
+      </w:r>
+    </w:p>
+    <w:p>
+      <w:pPr>
+        <w:rPr>
+          <w:rFonts w:ascii="Arial" w:hAnsi="Arial" w:cs="Arial"/>
+          <w:bCs/>
+          <w:sz w:val="24"/>
+          <w:szCs w:val="32"/>
+        </w:rPr>
+      </w:pPr>
+      <w:r>
+        <w:rPr>
+          <w:rFonts w:ascii="Arial" w:hAnsi="Arial" w:cs="Arial"/>
+          <w:bCs/>
+          <w:sz w:val="24"/>
+          <w:szCs w:val="32"/>
+        </w:rPr>
+        <w:t>INEGI. (2022b). Encuesta Nacional de Victimización y Percepción sobre Seguridad Pública (ENVIPE) 2022. Instituto Nacional de Estadística y Geografía. https://www.inegi.org.mx/programas/envipe/2022/</w:t>
+      </w:r>
+    </w:p>
+    <w:p>
+      <w:pPr>
+        <w:rPr>
+          <w:rFonts w:ascii="Arial" w:hAnsi="Arial" w:cs="Arial"/>
+          <w:bCs/>
+          <w:sz w:val="24"/>
+          <w:szCs w:val="32"/>
+        </w:rPr>
+      </w:pPr>
+      <w:r>
+        <w:rPr>
+          <w:rFonts w:ascii="Arial" w:hAnsi="Arial" w:cs="Arial"/>
+          <w:bCs/>
+          <w:sz w:val="24"/>
+          <w:szCs w:val="32"/>
+        </w:rPr>
+        <w:t>Organización Mundial de la Salud. (2021). Violencia contra la mujer. https://www.who.int/es/news-room/fact-sheets/detail/violence-against-women</w:t>
+      </w:r>
+    </w:p>
+    <w:p>
+      <w:pPr>
+        <w:rPr>
+          <w:rFonts w:ascii="Arial" w:hAnsi="Arial" w:cs="Arial"/>
+          <w:bCs/>
+          <w:sz w:val="24"/>
+          <w:szCs w:val="32"/>
+        </w:rPr>
+      </w:pPr>
+      <w:r>
+        <w:rPr>
+          <w:rFonts w:ascii="Arial" w:hAnsi="Arial" w:cs="Arial"/>
+          <w:bCs/>
+          <w:sz w:val="24"/>
+          <w:szCs w:val="32"/>
+        </w:rPr>
+        <w:t>Secretariado Ejecutivo del Sistema Nacional de Seguridad Pública. (2025). Cifras de víctimas del fuero común 2015–2025 [Base de datos]. Gobierno de México. https://www.gob.mx/sesnsp/acciones-y-programas/datos-abiertos-de-incidencia-delictiva</w:t>
+      </w:r>
+    </w:p>
+    <w:p>
+      <w:pPr>
+        <w:rPr>
+          <w:rFonts w:ascii="Arial" w:hAnsi="Arial" w:cs="Arial"/>
+          <w:bCs/>
+          <w:sz w:val="24"/>
+          <w:szCs w:val="32"/>
+        </w:rPr>
+      </w:pPr>
+      <w:r>
+        <w:rPr>
+          <w:rFonts w:ascii="Arial" w:hAnsi="Arial" w:cs="Arial"/>
+          <w:bCs/>
+          <w:sz w:val="24"/>
+          <w:szCs w:val="32"/>
+        </w:rPr>
+        <w:t>Datos Abiertos Monterrey. (2022). Reportes al 911 por violencia de género [Base de datos]. Municipio de Monterrey. https://datos.monterrey.gob.mx/dataset/reportes-al-911-por-violencia-de-generohttps://mide.monterrey.gob.mx/catalogue/#/dataset/92</w:t>
+      </w:r>
+    </w:p>
+    <w:p>
+      <w:pPr>
+        <w:rPr>
+          <w:rFonts w:ascii="Arial" w:hAnsi="Arial" w:cs="Arial"/>
+          <w:bCs/>
+          <w:sz w:val="24"/>
+          <w:szCs w:val="32"/>
+        </w:rPr>
+      </w:pPr>
+    </w:p>
+    <w:p>
+      <w:pPr>
+        <w:rPr>
+          <w:rFonts w:ascii="Arial" w:hAnsi="Arial" w:cs="Arial"/>
+          <w:bCs/>
+          <w:sz w:val="24"/>
+          <w:szCs w:val="32"/>
+        </w:rPr>
+      </w:pPr>
+      <w:r>
+        <w:rPr>
+          <w:rFonts w:ascii="Arial" w:hAnsi="Arial" w:cs="Arial"/>
+          <w:bCs/>
+          <w:sz w:val="24"/>
+          <w:szCs w:val="32"/>
+        </w:rPr>
+        <w:t>Comisión Nacional para Prevenir y Erradicar la Violencia Contra las Mujeres. (2016). Declaratoria de Alerta de Violencia de Género contra las Mujeres para el estado de Nuevo León. CONAVIM / Secretaría de Gobernación. https://www.gob.mx/conavim/documentos/solicitud-de-alerta-de-violencia-de-genero-contra-las-mujeres-en-el-estado-de-nuevo-leon</w:t>
+      </w:r>
+    </w:p>
+    <w:p>
+      <w:pPr>
+        <w:rPr>
+          <w:rFonts w:ascii="Arial" w:hAnsi="Arial" w:cs="Arial"/>
+          <w:bCs/>
+          <w:sz w:val="24"/>
+          <w:szCs w:val="32"/>
+        </w:rPr>
+      </w:pPr>
+      <w:r>
+        <w:rPr>
+          <w:rFonts w:ascii="Arial" w:hAnsi="Arial" w:cs="Arial"/>
+          <w:bCs/>
+          <w:sz w:val="24"/>
+          <w:szCs w:val="32"/>
+        </w:rPr>
+        <w:t xml:space="preserve">Datos Abiertos </w:t>
       </w:r>
       <w:proofErr w:type="gramStart"/>
       <w:r>
@@ -11597,7 +11652,7 @@
           <w:sz w:val="24"/>
           <w:szCs w:val="32"/>
         </w:rPr>
-        <w:t>.(</w:t>
+        <w:t>Monterrey.(</w:t>
       </w:r>
       <w:proofErr w:type="gramEnd"/>
       <w:r>
@@ -11742,6 +11797,7 @@
           <w:sz w:val="24"/>
           <w:szCs w:val="24"/>
         </w:rPr>
+        <w:lastRenderedPageBreak/>
         <w:t>Federal, G. (2007). Ley General de Acceso de las Mujeres a una vida libre de violencia. México: Diario Oficial de la Federación.</w:t>
       </w:r>
     </w:p>
@@ -11850,25 +11906,7 @@
             <w:sz w:val="24"/>
             <w:szCs w:val="24"/>
           </w:rPr>
-          <w:t>https:/</w:t>
-        </w:r>
-        <w:r>
-          <w:rPr>
-            <w:rStyle w:val="Hipervnculo"/>
-            <w:rFonts w:ascii="Arial" w:hAnsi="Arial" w:cs="Arial"/>
-            <w:sz w:val="24"/>
-            <w:szCs w:val="24"/>
-          </w:rPr>
-          <w:t>/</w:t>
-        </w:r>
-        <w:r>
-          <w:rPr>
-            <w:rStyle w:val="Hipervnculo"/>
-            <w:rFonts w:ascii="Arial" w:hAnsi="Arial" w:cs="Arial"/>
-            <w:sz w:val="24"/>
-            <w:szCs w:val="24"/>
-          </w:rPr>
-          <w:t>www.inegi.org.mx/programas/endireh/2021/#Documentacion</w:t>
+          <w:t>https://www.inegi.org.mx/programas/endireh/2021/#Documentacion</w:t>
         </w:r>
       </w:hyperlink>
     </w:p>
@@ -12224,7 +12262,7 @@
           <w:sz w:val="24"/>
           <w:szCs w:val="24"/>
         </w:rPr>
-        <w:t xml:space="preserve"> of </w:t>
+        <w:t xml:space="preserve"> </w:t>
       </w:r>
       <w:proofErr w:type="spellStart"/>
       <w:r>
@@ -12233,6 +12271,24 @@
           <w:sz w:val="24"/>
           <w:szCs w:val="24"/>
         </w:rPr>
+        <w:t>of</w:t>
+      </w:r>
+      <w:proofErr w:type="spellEnd"/>
+      <w:r>
+        <w:rPr>
+          <w:rFonts w:ascii="Arial" w:hAnsi="Arial" w:cs="Arial"/>
+          <w:sz w:val="24"/>
+          <w:szCs w:val="24"/>
+        </w:rPr>
+        <w:t xml:space="preserve"> </w:t>
+      </w:r>
+      <w:proofErr w:type="spellStart"/>
+      <w:r>
+        <w:rPr>
+          <w:rFonts w:ascii="Arial" w:hAnsi="Arial" w:cs="Arial"/>
+          <w:sz w:val="24"/>
+          <w:szCs w:val="24"/>
+        </w:rPr>
         <w:t>the</w:t>
       </w:r>
       <w:proofErr w:type="spellEnd"/>
@@ -12422,7 +12478,6 @@
           <w:sz w:val="24"/>
           <w:szCs w:val="24"/>
         </w:rPr>
-        <w:lastRenderedPageBreak/>
         <w:t>Rybach</w:t>
       </w:r>
       <w:proofErr w:type="spellEnd"/>
@@ -12684,6 +12739,51 @@
           <w:sz w:val="24"/>
           <w:szCs w:val="24"/>
         </w:rPr>
+        <w:t xml:space="preserve"> Processing (pp. 4197-4200). IEEE.</w:t>
+      </w:r>
+    </w:p>
+    <w:p>
+      <w:pPr>
+        <w:rPr>
+          <w:rFonts w:ascii="Arial" w:hAnsi="Arial" w:cs="Arial"/>
+          <w:sz w:val="24"/>
+          <w:szCs w:val="24"/>
+        </w:rPr>
+      </w:pPr>
+      <w:proofErr w:type="spellStart"/>
+      <w:r>
+        <w:rPr>
+          <w:rFonts w:ascii="Arial" w:hAnsi="Arial" w:cs="Arial"/>
+          <w:sz w:val="24"/>
+          <w:szCs w:val="24"/>
+        </w:rPr>
+        <w:t>Hinkley</w:t>
+      </w:r>
+      <w:proofErr w:type="spellEnd"/>
+      <w:r>
+        <w:rPr>
+          <w:rFonts w:ascii="Arial" w:hAnsi="Arial" w:cs="Arial"/>
+          <w:sz w:val="24"/>
+          <w:szCs w:val="24"/>
+        </w:rPr>
+        <w:t xml:space="preserve">, D. V. (1970). </w:t>
+      </w:r>
+      <w:proofErr w:type="spellStart"/>
+      <w:r>
+        <w:rPr>
+          <w:rFonts w:ascii="Arial" w:hAnsi="Arial" w:cs="Arial"/>
+          <w:sz w:val="24"/>
+          <w:szCs w:val="24"/>
+        </w:rPr>
+        <w:t>Inference</w:t>
+      </w:r>
+      <w:proofErr w:type="spellEnd"/>
+      <w:r>
+        <w:rPr>
+          <w:rFonts w:ascii="Arial" w:hAnsi="Arial" w:cs="Arial"/>
+          <w:sz w:val="24"/>
+          <w:szCs w:val="24"/>
+        </w:rPr>
         <w:t xml:space="preserve"> </w:t>
       </w:r>
       <w:proofErr w:type="spellStart"/>
@@ -12693,7 +12793,7 @@
           <w:sz w:val="24"/>
           <w:szCs w:val="24"/>
         </w:rPr>
-        <w:t>Processing</w:t>
+        <w:t>about</w:t>
       </w:r>
       <w:proofErr w:type="spellEnd"/>
       <w:r>
@@ -12702,17 +12802,8 @@
           <w:sz w:val="24"/>
           <w:szCs w:val="24"/>
         </w:rPr>
-        <w:t xml:space="preserve"> (pp. 4197-4200). IEEE.</w:t>
-      </w:r>
-    </w:p>
-    <w:p>
-      <w:pPr>
-        <w:rPr>
-          <w:rFonts w:ascii="Arial" w:hAnsi="Arial" w:cs="Arial"/>
-          <w:sz w:val="24"/>
-          <w:szCs w:val="24"/>
-        </w:rPr>
-      </w:pPr>
+        <w:t xml:space="preserve"> </w:t>
+      </w:r>
       <w:proofErr w:type="spellStart"/>
       <w:r>
         <w:rPr>
@@ -12720,7 +12811,7 @@
           <w:sz w:val="24"/>
           <w:szCs w:val="24"/>
         </w:rPr>
-        <w:t>Hinkley</w:t>
+        <w:t>the</w:t>
       </w:r>
       <w:proofErr w:type="spellEnd"/>
       <w:r>
@@ -12729,7 +12820,7 @@
           <w:sz w:val="24"/>
           <w:szCs w:val="24"/>
         </w:rPr>
-        <w:t xml:space="preserve">, D. V. (1970). </w:t>
+        <w:t xml:space="preserve"> </w:t>
       </w:r>
       <w:proofErr w:type="spellStart"/>
       <w:r>
@@ -12738,7 +12829,7 @@
           <w:sz w:val="24"/>
           <w:szCs w:val="24"/>
         </w:rPr>
-        <w:t>Inference</w:t>
+        <w:t>change-point</w:t>
       </w:r>
       <w:proofErr w:type="spellEnd"/>
       <w:r>
@@ -12747,6 +12838,24 @@
           <w:sz w:val="24"/>
           <w:szCs w:val="24"/>
         </w:rPr>
+        <w:t xml:space="preserve"> in a </w:t>
+      </w:r>
+      <w:proofErr w:type="spellStart"/>
+      <w:r>
+        <w:rPr>
+          <w:rFonts w:ascii="Arial" w:hAnsi="Arial" w:cs="Arial"/>
+          <w:sz w:val="24"/>
+          <w:szCs w:val="24"/>
+        </w:rPr>
+        <w:t>sequence</w:t>
+      </w:r>
+      <w:proofErr w:type="spellEnd"/>
+      <w:r>
+        <w:rPr>
+          <w:rFonts w:ascii="Arial" w:hAnsi="Arial" w:cs="Arial"/>
+          <w:sz w:val="24"/>
+          <w:szCs w:val="24"/>
+        </w:rPr>
         <w:t xml:space="preserve"> </w:t>
       </w:r>
       <w:proofErr w:type="spellStart"/>
@@ -12756,7 +12865,7 @@
           <w:sz w:val="24"/>
           <w:szCs w:val="24"/>
         </w:rPr>
-        <w:t>about</w:t>
+        <w:t>of</w:t>
       </w:r>
       <w:proofErr w:type="spellEnd"/>
       <w:r>
@@ -12774,7 +12883,7 @@
           <w:sz w:val="24"/>
           <w:szCs w:val="24"/>
         </w:rPr>
-        <w:t>the</w:t>
+        <w:t>random</w:t>
       </w:r>
       <w:proofErr w:type="spellEnd"/>
       <w:r>
@@ -12783,6 +12892,51 @@
           <w:sz w:val="24"/>
           <w:szCs w:val="24"/>
         </w:rPr>
+        <w:t xml:space="preserve"> variables.</w:t>
+      </w:r>
+    </w:p>
+    <w:p>
+      <w:pPr>
+        <w:rPr>
+          <w:rFonts w:ascii="Arial" w:hAnsi="Arial" w:cs="Arial"/>
+          <w:sz w:val="24"/>
+          <w:szCs w:val="24"/>
+        </w:rPr>
+      </w:pPr>
+      <w:proofErr w:type="spellStart"/>
+      <w:r>
+        <w:rPr>
+          <w:rFonts w:ascii="Arial" w:hAnsi="Arial" w:cs="Arial"/>
+          <w:sz w:val="24"/>
+          <w:szCs w:val="24"/>
+        </w:rPr>
+        <w:t>Aminikhanghahi</w:t>
+      </w:r>
+      <w:proofErr w:type="spellEnd"/>
+      <w:r>
+        <w:rPr>
+          <w:rFonts w:ascii="Arial" w:hAnsi="Arial" w:cs="Arial"/>
+          <w:sz w:val="24"/>
+          <w:szCs w:val="24"/>
+        </w:rPr>
+        <w:t xml:space="preserve">, S., &amp; Cook, D. J. (2017). A </w:t>
+      </w:r>
+      <w:proofErr w:type="spellStart"/>
+      <w:r>
+        <w:rPr>
+          <w:rFonts w:ascii="Arial" w:hAnsi="Arial" w:cs="Arial"/>
+          <w:sz w:val="24"/>
+          <w:szCs w:val="24"/>
+        </w:rPr>
+        <w:t>survey</w:t>
+      </w:r>
+      <w:proofErr w:type="spellEnd"/>
+      <w:r>
+        <w:rPr>
+          <w:rFonts w:ascii="Arial" w:hAnsi="Arial" w:cs="Arial"/>
+          <w:sz w:val="24"/>
+          <w:szCs w:val="24"/>
+        </w:rPr>
         <w:t xml:space="preserve"> </w:t>
       </w:r>
       <w:proofErr w:type="spellStart"/>
@@ -12792,7 +12946,7 @@
           <w:sz w:val="24"/>
           <w:szCs w:val="24"/>
         </w:rPr>
-        <w:t>change-point</w:t>
+        <w:t>of</w:t>
       </w:r>
       <w:proofErr w:type="spellEnd"/>
       <w:r>
@@ -12801,7 +12955,7 @@
           <w:sz w:val="24"/>
           <w:szCs w:val="24"/>
         </w:rPr>
-        <w:t xml:space="preserve"> in a </w:t>
+        <w:t xml:space="preserve"> </w:t>
       </w:r>
       <w:proofErr w:type="spellStart"/>
       <w:r>
@@ -12810,7 +12964,7 @@
           <w:sz w:val="24"/>
           <w:szCs w:val="24"/>
         </w:rPr>
-        <w:t>sequence</w:t>
+        <w:t>methods</w:t>
       </w:r>
       <w:proofErr w:type="spellEnd"/>
       <w:r>
@@ -12819,7 +12973,7 @@
           <w:sz w:val="24"/>
           <w:szCs w:val="24"/>
         </w:rPr>
-        <w:t xml:space="preserve"> of </w:t>
+        <w:t xml:space="preserve"> </w:t>
       </w:r>
       <w:proofErr w:type="spellStart"/>
       <w:r>
@@ -12828,7 +12982,7 @@
           <w:sz w:val="24"/>
           <w:szCs w:val="24"/>
         </w:rPr>
-        <w:t>random</w:t>
+        <w:t>for</w:t>
       </w:r>
       <w:proofErr w:type="spellEnd"/>
       <w:r>
@@ -12837,17 +12991,8 @@
           <w:sz w:val="24"/>
           <w:szCs w:val="24"/>
         </w:rPr>
-        <w:t xml:space="preserve"> variables.</w:t>
-      </w:r>
-    </w:p>
-    <w:p>
-      <w:pPr>
-        <w:rPr>
-          <w:rFonts w:ascii="Arial" w:hAnsi="Arial" w:cs="Arial"/>
-          <w:sz w:val="24"/>
-          <w:szCs w:val="24"/>
-        </w:rPr>
-      </w:pPr>
+        <w:t xml:space="preserve"> time series </w:t>
+      </w:r>
       <w:proofErr w:type="spellStart"/>
       <w:r>
         <w:rPr>
@@ -12855,7 +13000,7 @@
           <w:sz w:val="24"/>
           <w:szCs w:val="24"/>
         </w:rPr>
-        <w:t>Aminikhanghahi</w:t>
+        <w:t>change</w:t>
       </w:r>
       <w:proofErr w:type="spellEnd"/>
       <w:r>
@@ -12864,7 +13009,7 @@
           <w:sz w:val="24"/>
           <w:szCs w:val="24"/>
         </w:rPr>
-        <w:t xml:space="preserve">, S., &amp; Cook, D. J. (2017). A </w:t>
+        <w:t xml:space="preserve"> </w:t>
       </w:r>
       <w:proofErr w:type="spellStart"/>
       <w:r>
@@ -12873,7 +13018,7 @@
           <w:sz w:val="24"/>
           <w:szCs w:val="24"/>
         </w:rPr>
-        <w:t>survey</w:t>
+        <w:t>point</w:t>
       </w:r>
       <w:proofErr w:type="spellEnd"/>
       <w:r>
@@ -12882,7 +13027,7 @@
           <w:sz w:val="24"/>
           <w:szCs w:val="24"/>
         </w:rPr>
-        <w:t xml:space="preserve"> of </w:t>
+        <w:t xml:space="preserve"> </w:t>
       </w:r>
       <w:proofErr w:type="spellStart"/>
       <w:r>
@@ -12891,6 +13036,231 @@
           <w:sz w:val="24"/>
           <w:szCs w:val="24"/>
         </w:rPr>
+        <w:t>detection</w:t>
+      </w:r>
+      <w:proofErr w:type="spellEnd"/>
+      <w:r>
+        <w:rPr>
+          <w:rFonts w:ascii="Arial" w:hAnsi="Arial" w:cs="Arial"/>
+          <w:sz w:val="24"/>
+          <w:szCs w:val="24"/>
+        </w:rPr>
+        <w:t xml:space="preserve">. </w:t>
+      </w:r>
+      <w:proofErr w:type="spellStart"/>
+      <w:r>
+        <w:rPr>
+          <w:rFonts w:ascii="Arial" w:hAnsi="Arial" w:cs="Arial"/>
+          <w:sz w:val="24"/>
+          <w:szCs w:val="24"/>
+        </w:rPr>
+        <w:t>Knowledge</w:t>
+      </w:r>
+      <w:proofErr w:type="spellEnd"/>
+      <w:r>
+        <w:rPr>
+          <w:rFonts w:ascii="Arial" w:hAnsi="Arial" w:cs="Arial"/>
+          <w:sz w:val="24"/>
+          <w:szCs w:val="24"/>
+        </w:rPr>
+        <w:t xml:space="preserve"> and </w:t>
+      </w:r>
+      <w:proofErr w:type="spellStart"/>
+      <w:r>
+        <w:rPr>
+          <w:rFonts w:ascii="Arial" w:hAnsi="Arial" w:cs="Arial"/>
+          <w:sz w:val="24"/>
+          <w:szCs w:val="24"/>
+        </w:rPr>
+        <w:t>information</w:t>
+      </w:r>
+      <w:proofErr w:type="spellEnd"/>
+      <w:r>
+        <w:rPr>
+          <w:rFonts w:ascii="Arial" w:hAnsi="Arial" w:cs="Arial"/>
+          <w:sz w:val="24"/>
+          <w:szCs w:val="24"/>
+        </w:rPr>
+        <w:t xml:space="preserve"> </w:t>
+      </w:r>
+      <w:proofErr w:type="spellStart"/>
+      <w:r>
+        <w:rPr>
+          <w:rFonts w:ascii="Arial" w:hAnsi="Arial" w:cs="Arial"/>
+          <w:sz w:val="24"/>
+          <w:szCs w:val="24"/>
+        </w:rPr>
+        <w:t>systems</w:t>
+      </w:r>
+      <w:proofErr w:type="spellEnd"/>
+      <w:r>
+        <w:rPr>
+          <w:rFonts w:ascii="Arial" w:hAnsi="Arial" w:cs="Arial"/>
+          <w:sz w:val="24"/>
+          <w:szCs w:val="24"/>
+        </w:rPr>
+        <w:t>, 51(2), 339-367.</w:t>
+      </w:r>
+    </w:p>
+    <w:p>
+      <w:pPr>
+        <w:rPr>
+          <w:rFonts w:ascii="Arial" w:hAnsi="Arial" w:cs="Arial"/>
+          <w:sz w:val="24"/>
+          <w:szCs w:val="24"/>
+        </w:rPr>
+      </w:pPr>
+      <w:proofErr w:type="spellStart"/>
+      <w:r>
+        <w:rPr>
+          <w:rFonts w:ascii="Arial" w:hAnsi="Arial" w:cs="Arial"/>
+          <w:sz w:val="24"/>
+          <w:szCs w:val="24"/>
+        </w:rPr>
+        <w:t>Truong</w:t>
+      </w:r>
+      <w:proofErr w:type="spellEnd"/>
+      <w:r>
+        <w:rPr>
+          <w:rFonts w:ascii="Arial" w:hAnsi="Arial" w:cs="Arial"/>
+          <w:sz w:val="24"/>
+          <w:szCs w:val="24"/>
+        </w:rPr>
+        <w:t xml:space="preserve">, C., </w:t>
+      </w:r>
+      <w:proofErr w:type="spellStart"/>
+      <w:r>
+        <w:rPr>
+          <w:rFonts w:ascii="Arial" w:hAnsi="Arial" w:cs="Arial"/>
+          <w:sz w:val="24"/>
+          <w:szCs w:val="24"/>
+        </w:rPr>
+        <w:t>Oudre</w:t>
+      </w:r>
+      <w:proofErr w:type="spellEnd"/>
+      <w:r>
+        <w:rPr>
+          <w:rFonts w:ascii="Arial" w:hAnsi="Arial" w:cs="Arial"/>
+          <w:sz w:val="24"/>
+          <w:szCs w:val="24"/>
+        </w:rPr>
+        <w:t xml:space="preserve">, L., &amp; </w:t>
+      </w:r>
+      <w:proofErr w:type="spellStart"/>
+      <w:r>
+        <w:rPr>
+          <w:rFonts w:ascii="Arial" w:hAnsi="Arial" w:cs="Arial"/>
+          <w:sz w:val="24"/>
+          <w:szCs w:val="24"/>
+        </w:rPr>
+        <w:t>Vayatis</w:t>
+      </w:r>
+      <w:proofErr w:type="spellEnd"/>
+      <w:r>
+        <w:rPr>
+          <w:rFonts w:ascii="Arial" w:hAnsi="Arial" w:cs="Arial"/>
+          <w:sz w:val="24"/>
+          <w:szCs w:val="24"/>
+        </w:rPr>
+        <w:t xml:space="preserve">, N. (2020). Selective </w:t>
+      </w:r>
+      <w:proofErr w:type="spellStart"/>
+      <w:r>
+        <w:rPr>
+          <w:rFonts w:ascii="Arial" w:hAnsi="Arial" w:cs="Arial"/>
+          <w:sz w:val="24"/>
+          <w:szCs w:val="24"/>
+        </w:rPr>
+        <w:t>review</w:t>
+      </w:r>
+      <w:proofErr w:type="spellEnd"/>
+      <w:r>
+        <w:rPr>
+          <w:rFonts w:ascii="Arial" w:hAnsi="Arial" w:cs="Arial"/>
+          <w:sz w:val="24"/>
+          <w:szCs w:val="24"/>
+        </w:rPr>
+        <w:t xml:space="preserve"> </w:t>
+      </w:r>
+      <w:proofErr w:type="spellStart"/>
+      <w:r>
+        <w:rPr>
+          <w:rFonts w:ascii="Arial" w:hAnsi="Arial" w:cs="Arial"/>
+          <w:sz w:val="24"/>
+          <w:szCs w:val="24"/>
+        </w:rPr>
+        <w:t>of</w:t>
+      </w:r>
+      <w:proofErr w:type="spellEnd"/>
+      <w:r>
+        <w:rPr>
+          <w:rFonts w:ascii="Arial" w:hAnsi="Arial" w:cs="Arial"/>
+          <w:sz w:val="24"/>
+          <w:szCs w:val="24"/>
+        </w:rPr>
+        <w:t xml:space="preserve"> offline </w:t>
+      </w:r>
+      <w:proofErr w:type="spellStart"/>
+      <w:r>
+        <w:rPr>
+          <w:rFonts w:ascii="Arial" w:hAnsi="Arial" w:cs="Arial"/>
+          <w:sz w:val="24"/>
+          <w:szCs w:val="24"/>
+        </w:rPr>
+        <w:t>change</w:t>
+      </w:r>
+      <w:proofErr w:type="spellEnd"/>
+      <w:r>
+        <w:rPr>
+          <w:rFonts w:ascii="Arial" w:hAnsi="Arial" w:cs="Arial"/>
+          <w:sz w:val="24"/>
+          <w:szCs w:val="24"/>
+        </w:rPr>
+        <w:t xml:space="preserve"> </w:t>
+      </w:r>
+      <w:proofErr w:type="spellStart"/>
+      <w:r>
+        <w:rPr>
+          <w:rFonts w:ascii="Arial" w:hAnsi="Arial" w:cs="Arial"/>
+          <w:sz w:val="24"/>
+          <w:szCs w:val="24"/>
+        </w:rPr>
+        <w:t>point</w:t>
+      </w:r>
+      <w:proofErr w:type="spellEnd"/>
+      <w:r>
+        <w:rPr>
+          <w:rFonts w:ascii="Arial" w:hAnsi="Arial" w:cs="Arial"/>
+          <w:sz w:val="24"/>
+          <w:szCs w:val="24"/>
+        </w:rPr>
+        <w:t xml:space="preserve"> </w:t>
+      </w:r>
+      <w:proofErr w:type="spellStart"/>
+      <w:r>
+        <w:rPr>
+          <w:rFonts w:ascii="Arial" w:hAnsi="Arial" w:cs="Arial"/>
+          <w:sz w:val="24"/>
+          <w:szCs w:val="24"/>
+        </w:rPr>
+        <w:t>detection</w:t>
+      </w:r>
+      <w:proofErr w:type="spellEnd"/>
+      <w:r>
+        <w:rPr>
+          <w:rFonts w:ascii="Arial" w:hAnsi="Arial" w:cs="Arial"/>
+          <w:sz w:val="24"/>
+          <w:szCs w:val="24"/>
+        </w:rPr>
+        <w:t xml:space="preserve"> </w:t>
+      </w:r>
+      <w:proofErr w:type="spellStart"/>
+      <w:r>
+        <w:rPr>
+          <w:rFonts w:ascii="Arial" w:hAnsi="Arial" w:cs="Arial"/>
+          <w:sz w:val="24"/>
+          <w:szCs w:val="24"/>
+        </w:rPr>
         <w:t>methods</w:t>
       </w:r>
       <w:proofErr w:type="spellEnd"/>
@@ -12900,7 +13270,7 @@
           <w:sz w:val="24"/>
           <w:szCs w:val="24"/>
         </w:rPr>
-        <w:t xml:space="preserve"> </w:t>
+        <w:t xml:space="preserve">. </w:t>
       </w:r>
       <w:proofErr w:type="spellStart"/>
       <w:r>
@@ -12909,7 +13279,7 @@
           <w:sz w:val="24"/>
           <w:szCs w:val="24"/>
         </w:rPr>
-        <w:t>for</w:t>
+        <w:t>Signal</w:t>
       </w:r>
       <w:proofErr w:type="spellEnd"/>
       <w:r>
@@ -12918,322 +13288,7 @@
           <w:sz w:val="24"/>
           <w:szCs w:val="24"/>
         </w:rPr>
-        <w:t xml:space="preserve"> time series </w:t>
-      </w:r>
-      <w:proofErr w:type="spellStart"/>
-      <w:r>
-        <w:rPr>
-          <w:rFonts w:ascii="Arial" w:hAnsi="Arial" w:cs="Arial"/>
-          <w:sz w:val="24"/>
-          <w:szCs w:val="24"/>
-        </w:rPr>
-        <w:t>change</w:t>
-      </w:r>
-      <w:proofErr w:type="spellEnd"/>
-      <w:r>
-        <w:rPr>
-          <w:rFonts w:ascii="Arial" w:hAnsi="Arial" w:cs="Arial"/>
-          <w:sz w:val="24"/>
-          <w:szCs w:val="24"/>
-        </w:rPr>
-        <w:t xml:space="preserve"> </w:t>
-      </w:r>
-      <w:proofErr w:type="spellStart"/>
-      <w:r>
-        <w:rPr>
-          <w:rFonts w:ascii="Arial" w:hAnsi="Arial" w:cs="Arial"/>
-          <w:sz w:val="24"/>
-          <w:szCs w:val="24"/>
-        </w:rPr>
-        <w:t>point</w:t>
-      </w:r>
-      <w:proofErr w:type="spellEnd"/>
-      <w:r>
-        <w:rPr>
-          <w:rFonts w:ascii="Arial" w:hAnsi="Arial" w:cs="Arial"/>
-          <w:sz w:val="24"/>
-          <w:szCs w:val="24"/>
-        </w:rPr>
-        <w:t xml:space="preserve"> </w:t>
-      </w:r>
-      <w:proofErr w:type="spellStart"/>
-      <w:r>
-        <w:rPr>
-          <w:rFonts w:ascii="Arial" w:hAnsi="Arial" w:cs="Arial"/>
-          <w:sz w:val="24"/>
-          <w:szCs w:val="24"/>
-        </w:rPr>
-        <w:t>detection</w:t>
-      </w:r>
-      <w:proofErr w:type="spellEnd"/>
-      <w:r>
-        <w:rPr>
-          <w:rFonts w:ascii="Arial" w:hAnsi="Arial" w:cs="Arial"/>
-          <w:sz w:val="24"/>
-          <w:szCs w:val="24"/>
-        </w:rPr>
-        <w:t xml:space="preserve">. </w:t>
-      </w:r>
-      <w:proofErr w:type="spellStart"/>
-      <w:r>
-        <w:rPr>
-          <w:rFonts w:ascii="Arial" w:hAnsi="Arial" w:cs="Arial"/>
-          <w:sz w:val="24"/>
-          <w:szCs w:val="24"/>
-        </w:rPr>
-        <w:t>Knowledge</w:t>
-      </w:r>
-      <w:proofErr w:type="spellEnd"/>
-      <w:r>
-        <w:rPr>
-          <w:rFonts w:ascii="Arial" w:hAnsi="Arial" w:cs="Arial"/>
-          <w:sz w:val="24"/>
-          <w:szCs w:val="24"/>
-        </w:rPr>
-        <w:t xml:space="preserve"> and </w:t>
-      </w:r>
-      <w:proofErr w:type="spellStart"/>
-      <w:r>
-        <w:rPr>
-          <w:rFonts w:ascii="Arial" w:hAnsi="Arial" w:cs="Arial"/>
-          <w:sz w:val="24"/>
-          <w:szCs w:val="24"/>
-        </w:rPr>
-        <w:t>information</w:t>
-      </w:r>
-      <w:proofErr w:type="spellEnd"/>
-      <w:r>
-        <w:rPr>
-          <w:rFonts w:ascii="Arial" w:hAnsi="Arial" w:cs="Arial"/>
-          <w:sz w:val="24"/>
-          <w:szCs w:val="24"/>
-        </w:rPr>
-        <w:t xml:space="preserve"> </w:t>
-      </w:r>
-      <w:proofErr w:type="spellStart"/>
-      <w:r>
-        <w:rPr>
-          <w:rFonts w:ascii="Arial" w:hAnsi="Arial" w:cs="Arial"/>
-          <w:sz w:val="24"/>
-          <w:szCs w:val="24"/>
-        </w:rPr>
-        <w:t>systems</w:t>
-      </w:r>
-      <w:proofErr w:type="spellEnd"/>
-      <w:r>
-        <w:rPr>
-          <w:rFonts w:ascii="Arial" w:hAnsi="Arial" w:cs="Arial"/>
-          <w:sz w:val="24"/>
-          <w:szCs w:val="24"/>
-        </w:rPr>
-        <w:t>, 51(2), 339-367.</w:t>
-      </w:r>
-    </w:p>
-    <w:p>
-      <w:pPr>
-        <w:rPr>
-          <w:rFonts w:ascii="Arial" w:hAnsi="Arial" w:cs="Arial"/>
-          <w:sz w:val="24"/>
-          <w:szCs w:val="24"/>
-        </w:rPr>
-      </w:pPr>
-      <w:proofErr w:type="spellStart"/>
-      <w:r>
-        <w:rPr>
-          <w:rFonts w:ascii="Arial" w:hAnsi="Arial" w:cs="Arial"/>
-          <w:sz w:val="24"/>
-          <w:szCs w:val="24"/>
-        </w:rPr>
-        <w:t>Truong</w:t>
-      </w:r>
-      <w:proofErr w:type="spellEnd"/>
-      <w:r>
-        <w:rPr>
-          <w:rFonts w:ascii="Arial" w:hAnsi="Arial" w:cs="Arial"/>
-          <w:sz w:val="24"/>
-          <w:szCs w:val="24"/>
-        </w:rPr>
-        <w:t xml:space="preserve">, C., </w:t>
-      </w:r>
-      <w:proofErr w:type="spellStart"/>
-      <w:r>
-        <w:rPr>
-          <w:rFonts w:ascii="Arial" w:hAnsi="Arial" w:cs="Arial"/>
-          <w:sz w:val="24"/>
-          <w:szCs w:val="24"/>
-        </w:rPr>
-        <w:t>Oudre</w:t>
-      </w:r>
-      <w:proofErr w:type="spellEnd"/>
-      <w:r>
-        <w:rPr>
-          <w:rFonts w:ascii="Arial" w:hAnsi="Arial" w:cs="Arial"/>
-          <w:sz w:val="24"/>
-          <w:szCs w:val="24"/>
-        </w:rPr>
-        <w:t xml:space="preserve">, L., &amp; </w:t>
-      </w:r>
-      <w:proofErr w:type="spellStart"/>
-      <w:r>
-        <w:rPr>
-          <w:rFonts w:ascii="Arial" w:hAnsi="Arial" w:cs="Arial"/>
-          <w:sz w:val="24"/>
-          <w:szCs w:val="24"/>
-        </w:rPr>
-        <w:t>Vayatis</w:t>
-      </w:r>
-      <w:proofErr w:type="spellEnd"/>
-      <w:r>
-        <w:rPr>
-          <w:rFonts w:ascii="Arial" w:hAnsi="Arial" w:cs="Arial"/>
-          <w:sz w:val="24"/>
-          <w:szCs w:val="24"/>
-        </w:rPr>
-        <w:t xml:space="preserve">, N. (2020). </w:t>
-      </w:r>
-      <w:proofErr w:type="spellStart"/>
-      <w:r>
-        <w:rPr>
-          <w:rFonts w:ascii="Arial" w:hAnsi="Arial" w:cs="Arial"/>
-          <w:sz w:val="24"/>
-          <w:szCs w:val="24"/>
-        </w:rPr>
-        <w:t>Selective</w:t>
-      </w:r>
-      <w:proofErr w:type="spellEnd"/>
-      <w:r>
-        <w:rPr>
-          <w:rFonts w:ascii="Arial" w:hAnsi="Arial" w:cs="Arial"/>
-          <w:sz w:val="24"/>
-          <w:szCs w:val="24"/>
-        </w:rPr>
-        <w:t xml:space="preserve"> </w:t>
-      </w:r>
-      <w:proofErr w:type="spellStart"/>
-      <w:r>
-        <w:rPr>
-          <w:rFonts w:ascii="Arial" w:hAnsi="Arial" w:cs="Arial"/>
-          <w:sz w:val="24"/>
-          <w:szCs w:val="24"/>
-        </w:rPr>
-        <w:t>review</w:t>
-      </w:r>
-      <w:proofErr w:type="spellEnd"/>
-      <w:r>
-        <w:rPr>
-          <w:rFonts w:ascii="Arial" w:hAnsi="Arial" w:cs="Arial"/>
-          <w:sz w:val="24"/>
-          <w:szCs w:val="24"/>
-        </w:rPr>
-        <w:t xml:space="preserve"> of offline </w:t>
-      </w:r>
-      <w:proofErr w:type="spellStart"/>
-      <w:r>
-        <w:rPr>
-          <w:rFonts w:ascii="Arial" w:hAnsi="Arial" w:cs="Arial"/>
-          <w:sz w:val="24"/>
-          <w:szCs w:val="24"/>
-        </w:rPr>
-        <w:t>change</w:t>
-      </w:r>
-      <w:proofErr w:type="spellEnd"/>
-      <w:r>
-        <w:rPr>
-          <w:rFonts w:ascii="Arial" w:hAnsi="Arial" w:cs="Arial"/>
-          <w:sz w:val="24"/>
-          <w:szCs w:val="24"/>
-        </w:rPr>
-        <w:t xml:space="preserve"> </w:t>
-      </w:r>
-      <w:proofErr w:type="spellStart"/>
-      <w:r>
-        <w:rPr>
-          <w:rFonts w:ascii="Arial" w:hAnsi="Arial" w:cs="Arial"/>
-          <w:sz w:val="24"/>
-          <w:szCs w:val="24"/>
-        </w:rPr>
-        <w:t>point</w:t>
-      </w:r>
-      <w:proofErr w:type="spellEnd"/>
-      <w:r>
-        <w:rPr>
-          <w:rFonts w:ascii="Arial" w:hAnsi="Arial" w:cs="Arial"/>
-          <w:sz w:val="24"/>
-          <w:szCs w:val="24"/>
-        </w:rPr>
-        <w:t xml:space="preserve"> </w:t>
-      </w:r>
-      <w:proofErr w:type="spellStart"/>
-      <w:r>
-        <w:rPr>
-          <w:rFonts w:ascii="Arial" w:hAnsi="Arial" w:cs="Arial"/>
-          <w:sz w:val="24"/>
-          <w:szCs w:val="24"/>
-        </w:rPr>
-        <w:t>detection</w:t>
-      </w:r>
-      <w:proofErr w:type="spellEnd"/>
-      <w:r>
-        <w:rPr>
-          <w:rFonts w:ascii="Arial" w:hAnsi="Arial" w:cs="Arial"/>
-          <w:sz w:val="24"/>
-          <w:szCs w:val="24"/>
-        </w:rPr>
-        <w:t xml:space="preserve"> </w:t>
-      </w:r>
-      <w:proofErr w:type="spellStart"/>
-      <w:r>
-        <w:rPr>
-          <w:rFonts w:ascii="Arial" w:hAnsi="Arial" w:cs="Arial"/>
-          <w:sz w:val="24"/>
-          <w:szCs w:val="24"/>
-        </w:rPr>
-        <w:t>methods</w:t>
-      </w:r>
-      <w:proofErr w:type="spellEnd"/>
-      <w:r>
-        <w:rPr>
-          <w:rFonts w:ascii="Arial" w:hAnsi="Arial" w:cs="Arial"/>
-          <w:sz w:val="24"/>
-          <w:szCs w:val="24"/>
-        </w:rPr>
-        <w:t xml:space="preserve">. </w:t>
-      </w:r>
-      <w:proofErr w:type="spellStart"/>
-      <w:r>
-        <w:rPr>
-          <w:rFonts w:ascii="Arial" w:hAnsi="Arial" w:cs="Arial"/>
-          <w:sz w:val="24"/>
-          <w:szCs w:val="24"/>
-        </w:rPr>
-        <w:t>Signal</w:t>
-      </w:r>
-      <w:proofErr w:type="spellEnd"/>
-      <w:r>
-        <w:rPr>
-          <w:rFonts w:ascii="Arial" w:hAnsi="Arial" w:cs="Arial"/>
-          <w:sz w:val="24"/>
-          <w:szCs w:val="24"/>
-        </w:rPr>
-        <w:t xml:space="preserve"> </w:t>
-      </w:r>
-      <w:proofErr w:type="spellStart"/>
-      <w:r>
-        <w:rPr>
-          <w:rFonts w:ascii="Arial" w:hAnsi="Arial" w:cs="Arial"/>
-          <w:sz w:val="24"/>
-          <w:szCs w:val="24"/>
-        </w:rPr>
-        <w:t>Processing</w:t>
-      </w:r>
-      <w:proofErr w:type="spellEnd"/>
-      <w:r>
-        <w:rPr>
-          <w:rFonts w:ascii="Arial" w:hAnsi="Arial" w:cs="Arial"/>
-          <w:sz w:val="24"/>
-          <w:szCs w:val="24"/>
-        </w:rPr>
-        <w:t>, 167, 107299.</w:t>
+        <w:t xml:space="preserve"> Processing, 167, 107299.</w:t>
       </w:r>
     </w:p>
     <w:p>
@@ -13460,7 +13515,7 @@
 </file>
 
 <file path=word/endnotes.xml><?xml version="1.0" encoding="utf-8"?>
-<w:endnotes xmlns:wpc="http://schemas.microsoft.com/office/word/2010/wordprocessingCanvas" xmlns:mc="http://schemas.openxmlformats.org/markup-compatibility/2006" xmlns:o="urn:schemas-microsoft-com:office:office" xmlns:r="http://schemas.openxmlformats.org/officeDocument/2006/relationships" xmlns:m="http://schemas.openxmlformats.org/officeDocument/2006/math" xmlns:v="urn:schemas-microsoft-com:vml" xmlns:wp14="http://schemas.microsoft.com/office/word/2010/wordprocessingDrawing" xmlns:wp="http://schemas.openxmlformats.org/drawingml/2006/wordprocessingDrawing" xmlns:w10="urn:schemas-microsoft-com:office:word" xmlns:w="http://schemas.openxmlformats.org/wordprocessingml/2006/main" xmlns:w14="http://schemas.microsoft.com/office/word/2010/wordml" xmlns:w15="http://schemas.microsoft.com/office/word/2012/wordml" xmlns:wpg="http://schemas.microsoft.com/office/word/2010/wordprocessingGroup" xmlns:wpi="http://schemas.microsoft.com/office/word/2010/wordprocessingInk" xmlns:wne="http://schemas.microsoft.com/office/word/2006/wordml" xmlns:wps="http://schemas.microsoft.com/office/word/2010/wordprocessingShape" mc:Ignorable="w14 w15 wp14">
+<w:endnotes xmlns:wpc="http://schemas.microsoft.com/office/word/2010/wordprocessingCanvas" xmlns:cx="http://schemas.microsoft.com/office/drawing/2014/chartex" xmlns:cx1="http://schemas.microsoft.com/office/drawing/2015/9/8/chartex" xmlns:cx2="http://schemas.microsoft.com/office/drawing/2015/10/21/chartex" xmlns:cx3="http://schemas.microsoft.com/office/drawing/2016/5/9/chartex" xmlns:cx4="http://schemas.microsoft.com/office/drawing/2016/5/10/chartex" xmlns:cx5="http://schemas.microsoft.com/office/drawing/2016/5/11/chartex" xmlns:cx6="http://schemas.microsoft.com/office/drawing/2016/5/12/chartex" xmlns:cx7="http://schemas.microsoft.com/office/drawing/2016/5/13/chartex" xmlns:cx8="http://schemas.microsoft.com/office/drawing/2016/5/14/chartex" xmlns:mc="http://schemas.openxmlformats.org/markup-compatibility/2006" xmlns:aink="http://schemas.microsoft.com/office/drawing/2016/ink" xmlns:am3d="http://schemas.microsoft.com/office/drawing/2017/model3d" xmlns:o="urn:schemas-microsoft-com:office:office" xmlns:r="http://schemas.openxmlformats.org/officeDocument/2006/relationships" xmlns:m="http://schemas.openxmlformats.org/officeDocument/2006/math" xmlns:v="urn:schemas-microsoft-com:vml" xmlns:wp14="http://schemas.microsoft.com/office/word/2010/wordprocessingDrawing" xmlns:wp="http://schemas.openxmlformats.org/drawingml/2006/wordprocessingDrawing" xmlns:w10="urn:schemas-microsoft-com:office:word" xmlns:w="http://schemas.openxmlformats.org/wordprocessingml/2006/main" xmlns:w14="http://schemas.microsoft.com/office/word/2010/wordml" xmlns:w15="http://schemas.microsoft.com/office/word/2012/wordml" xmlns:w16cex="http://schemas.microsoft.com/office/word/2018/wordml/cex" xmlns:w16cid="http://schemas.microsoft.com/office/word/2016/wordml/cid" xmlns:w16="http://schemas.microsoft.com/office/word/2018/wordml" xmlns:w16sdtdh="http://schemas.microsoft.com/office/word/2020/wordml/sdtdatahash" xmlns:w16se="http://schemas.microsoft.com/office/word/2015/wordml/symex" xmlns:wpg="http://schemas.microsoft.com/office/word/2010/wordprocessingGroup" xmlns:wpi="http://schemas.microsoft.com/office/word/2010/wordprocessingInk" xmlns:wne="http://schemas.microsoft.com/office/word/2006/wordml" xmlns:wps="http://schemas.microsoft.com/office/word/2010/wordprocessingShape" mc:Ignorable="w14 w15 w16se w16cid w16 w16cex w16sdtdh wp14">
   <w:endnote w:type="separator" w:id="-1">
     <w:p>
       <w:pPr>
@@ -13485,7 +13540,7 @@
 </file>
 
 <file path=word/footer1.xml><?xml version="1.0" encoding="utf-8"?>
-<w:ftr xmlns:wpc="http://schemas.microsoft.com/office/word/2010/wordprocessingCanvas" xmlns:mc="http://schemas.openxmlformats.org/markup-compatibility/2006" xmlns:o="urn:schemas-microsoft-com:office:office" xmlns:r="http://schemas.openxmlformats.org/officeDocument/2006/relationships" xmlns:m="http://schemas.openxmlformats.org/officeDocument/2006/math" xmlns:v="urn:schemas-microsoft-com:vml" xmlns:wp14="http://schemas.microsoft.com/office/word/2010/wordprocessingDrawing" xmlns:wp="http://schemas.openxmlformats.org/drawingml/2006/wordprocessingDrawing" xmlns:w10="urn:schemas-microsoft-com:office:word" xmlns:w="http://schemas.openxmlformats.org/wordprocessingml/2006/main" xmlns:w14="http://schemas.microsoft.com/office/word/2010/wordml" xmlns:w15="http://schemas.microsoft.com/office/word/2012/wordml" xmlns:wpg="http://schemas.microsoft.com/office/word/2010/wordprocessingGroup" xmlns:wpi="http://schemas.microsoft.com/office/word/2010/wordprocessingInk" xmlns:wne="http://schemas.microsoft.com/office/word/2006/wordml" xmlns:wps="http://schemas.microsoft.com/office/word/2010/wordprocessingShape" mc:Ignorable="w14 w15 wp14">
+<w:ftr xmlns:wpc="http://schemas.microsoft.com/office/word/2010/wordprocessingCanvas" xmlns:cx="http://schemas.microsoft.com/office/drawing/2014/chartex" xmlns:cx1="http://schemas.microsoft.com/office/drawing/2015/9/8/chartex" xmlns:cx2="http://schemas.microsoft.com/office/drawing/2015/10/21/chartex" xmlns:cx3="http://schemas.microsoft.com/office/drawing/2016/5/9/chartex" xmlns:cx4="http://schemas.microsoft.com/office/drawing/2016/5/10/chartex" xmlns:cx5="http://schemas.microsoft.com/office/drawing/2016/5/11/chartex" xmlns:cx6="http://schemas.microsoft.com/office/drawing/2016/5/12/chartex" xmlns:cx7="http://schemas.microsoft.com/office/drawing/2016/5/13/chartex" xmlns:cx8="http://schemas.microsoft.com/office/drawing/2016/5/14/chartex" xmlns:mc="http://schemas.openxmlformats.org/markup-compatibility/2006" xmlns:aink="http://schemas.microsoft.com/office/drawing/2016/ink" xmlns:am3d="http://schemas.microsoft.com/office/drawing/2017/model3d" xmlns:o="urn:schemas-microsoft-com:office:office" xmlns:r="http://schemas.openxmlformats.org/officeDocument/2006/relationships" xmlns:m="http://schemas.openxmlformats.org/officeDocument/2006/math" xmlns:v="urn:schemas-microsoft-com:vml" xmlns:wp14="http://schemas.microsoft.com/office/word/2010/wordprocessingDrawing" xmlns:wp="http://schemas.openxmlformats.org/drawingml/2006/wordprocessingDrawing" xmlns:w10="urn:schemas-microsoft-com:office:word" xmlns:w="http://schemas.openxmlformats.org/wordprocessingml/2006/main" xmlns:w14="http://schemas.microsoft.com/office/word/2010/wordml" xmlns:w15="http://schemas.microsoft.com/office/word/2012/wordml" xmlns:w16cex="http://schemas.microsoft.com/office/word/2018/wordml/cex" xmlns:w16cid="http://schemas.microsoft.com/office/word/2016/wordml/cid" xmlns:w16="http://schemas.microsoft.com/office/word/2018/wordml" xmlns:w16sdtdh="http://schemas.microsoft.com/office/word/2020/wordml/sdtdatahash" xmlns:w16se="http://schemas.microsoft.com/office/word/2015/wordml/symex" xmlns:wpg="http://schemas.microsoft.com/office/word/2010/wordprocessingGroup" xmlns:wpi="http://schemas.microsoft.com/office/word/2010/wordprocessingInk" xmlns:wne="http://schemas.microsoft.com/office/word/2006/wordml" xmlns:wps="http://schemas.microsoft.com/office/word/2010/wordprocessingShape" mc:Ignorable="w14 w15 w16se w16cid w16 w16cex w16sdtdh wp14">
   <w:sdt>
     <w:sdtPr>
       <w:id w:val="-707878249"/>
@@ -13494,6 +13549,7 @@
         <w:docPartUnique/>
       </w:docPartObj>
     </w:sdtPr>
+    <w:sdtEndPr/>
     <w:sdtContent>
       <w:p>
         <w:pPr>
@@ -13531,7 +13587,7 @@
 </file>
 
 <file path=word/footnotes.xml><?xml version="1.0" encoding="utf-8"?>
-<w:footnotes xmlns:wpc="http://schemas.microsoft.com/office/word/2010/wordprocessingCanvas" xmlns:mc="http://schemas.openxmlformats.org/markup-compatibility/2006" xmlns:o="urn:schemas-microsoft-com:office:office" xmlns:r="http://schemas.openxmlformats.org/officeDocument/2006/relationships" xmlns:m="http://schemas.openxmlformats.org/officeDocument/2006/math" xmlns:v="urn:schemas-microsoft-com:vml" xmlns:wp14="http://schemas.microsoft.com/office/word/2010/wordprocessingDrawing" xmlns:wp="http://schemas.openxmlformats.org/drawingml/2006/wordprocessingDrawing" xmlns:w10="urn:schemas-microsoft-com:office:word" xmlns:w="http://schemas.openxmlformats.org/wordprocessingml/2006/main" xmlns:w14="http://schemas.microsoft.com/office/word/2010/wordml" xmlns:w15="http://schemas.microsoft.com/office/word/2012/wordml" xmlns:wpg="http://schemas.microsoft.com/office/word/2010/wordprocessingGroup" xmlns:wpi="http://schemas.microsoft.com/office/word/2010/wordprocessingInk" xmlns:wne="http://schemas.microsoft.com/office/word/2006/wordml" xmlns:wps="http://schemas.microsoft.com/office/word/2010/wordprocessingShape" mc:Ignorable="w14 w15 wp14">
+<w:footnotes xmlns:wpc="http://schemas.microsoft.com/office/word/2010/wordprocessingCanvas" xmlns:cx="http://schemas.microsoft.com/office/drawing/2014/chartex" xmlns:cx1="http://schemas.microsoft.com/office/drawing/2015/9/8/chartex" xmlns:cx2="http://schemas.microsoft.com/office/drawing/2015/10/21/chartex" xmlns:cx3="http://schemas.microsoft.com/office/drawing/2016/5/9/chartex" xmlns:cx4="http://schemas.microsoft.com/office/drawing/2016/5/10/chartex" xmlns:cx5="http://schemas.microsoft.com/office/drawing/2016/5/11/chartex" xmlns:cx6="http://schemas.microsoft.com/office/drawing/2016/5/12/chartex" xmlns:cx7="http://schemas.microsoft.com/office/drawing/2016/5/13/chartex" xmlns:cx8="http://schemas.microsoft.com/office/drawing/2016/5/14/chartex" xmlns:mc="http://schemas.openxmlformats.org/markup-compatibility/2006" xmlns:aink="http://schemas.microsoft.com/office/drawing/2016/ink" xmlns:am3d="http://schemas.microsoft.com/office/drawing/2017/model3d" xmlns:o="urn:schemas-microsoft-com:office:office" xmlns:r="http://schemas.openxmlformats.org/officeDocument/2006/relationships" xmlns:m="http://schemas.openxmlformats.org/officeDocument/2006/math" xmlns:v="urn:schemas-microsoft-com:vml" xmlns:wp14="http://schemas.microsoft.com/office/word/2010/wordprocessingDrawing" xmlns:wp="http://schemas.openxmlformats.org/drawingml/2006/wordprocessingDrawing" xmlns:w10="urn:schemas-microsoft-com:office:word" xmlns:w="http://schemas.openxmlformats.org/wordprocessingml/2006/main" xmlns:w14="http://schemas.microsoft.com/office/word/2010/wordml" xmlns:w15="http://schemas.microsoft.com/office/word/2012/wordml" xmlns:w16cex="http://schemas.microsoft.com/office/word/2018/wordml/cex" xmlns:w16cid="http://schemas.microsoft.com/office/word/2016/wordml/cid" xmlns:w16="http://schemas.microsoft.com/office/word/2018/wordml" xmlns:w16sdtdh="http://schemas.microsoft.com/office/word/2020/wordml/sdtdatahash" xmlns:w16se="http://schemas.microsoft.com/office/word/2015/wordml/symex" xmlns:wpg="http://schemas.microsoft.com/office/word/2010/wordprocessingGroup" xmlns:wpi="http://schemas.microsoft.com/office/word/2010/wordprocessingInk" xmlns:wne="http://schemas.microsoft.com/office/word/2006/wordml" xmlns:wps="http://schemas.microsoft.com/office/word/2010/wordprocessingShape" mc:Ignorable="w14 w15 w16se w16cid w16 w16cex w16sdtdh wp14">
   <w:footnote w:type="separator" w:id="-1">
     <w:p>
       <w:pPr>
@@ -13556,7 +13612,7 @@
 </file>
 
 <file path=word/numbering.xml><?xml version="1.0" encoding="utf-8"?>
-<w:numbering xmlns:wpc="http://schemas.microsoft.com/office/word/2010/wordprocessingCanvas" xmlns:mc="http://schemas.openxmlformats.org/markup-compatibility/2006" xmlns:o="urn:schemas-microsoft-com:office:office" xmlns:r="http://schemas.openxmlformats.org/officeDocument/2006/relationships" xmlns:m="http://schemas.openxmlformats.org/officeDocument/2006/math" xmlns:v="urn:schemas-microsoft-com:vml" xmlns:wp14="http://schemas.microsoft.com/office/word/2010/wordprocessingDrawing" xmlns:wp="http://schemas.openxmlformats.org/drawingml/2006/wordprocessingDrawing" xmlns:w10="urn:schemas-microsoft-com:office:word" xmlns:w="http://schemas.openxmlformats.org/wordprocessingml/2006/main" xmlns:w14="http://schemas.microsoft.com/office/word/2010/wordml" xmlns:w15="http://schemas.microsoft.com/office/word/2012/wordml" xmlns:wpg="http://schemas.microsoft.com/office/word/2010/wordprocessingGroup" xmlns:wpi="http://schemas.microsoft.com/office/word/2010/wordprocessingInk" xmlns:wne="http://schemas.microsoft.com/office/word/2006/wordml" xmlns:wps="http://schemas.microsoft.com/office/word/2010/wordprocessingShape" mc:Ignorable="w14 w15 wp14">
+<w:numbering xmlns:wpc="http://schemas.microsoft.com/office/word/2010/wordprocessingCanvas" xmlns:cx="http://schemas.microsoft.com/office/drawing/2014/chartex" xmlns:cx1="http://schemas.microsoft.com/office/drawing/2015/9/8/chartex" xmlns:cx2="http://schemas.microsoft.com/office/drawing/2015/10/21/chartex" xmlns:cx3="http://schemas.microsoft.com/office/drawing/2016/5/9/chartex" xmlns:cx4="http://schemas.microsoft.com/office/drawing/2016/5/10/chartex" xmlns:cx5="http://schemas.microsoft.com/office/drawing/2016/5/11/chartex" xmlns:cx6="http://schemas.microsoft.com/office/drawing/2016/5/12/chartex" xmlns:cx7="http://schemas.microsoft.com/office/drawing/2016/5/13/chartex" xmlns:cx8="http://schemas.microsoft.com/office/drawing/2016/5/14/chartex" xmlns:mc="http://schemas.openxmlformats.org/markup-compatibility/2006" xmlns:aink="http://schemas.microsoft.com/office/drawing/2016/ink" xmlns:am3d="http://schemas.microsoft.com/office/drawing/2017/model3d" xmlns:o="urn:schemas-microsoft-com:office:office" xmlns:r="http://schemas.openxmlformats.org/officeDocument/2006/relationships" xmlns:m="http://schemas.openxmlformats.org/officeDocument/2006/math" xmlns:v="urn:schemas-microsoft-com:vml" xmlns:wp14="http://schemas.microsoft.com/office/word/2010/wordprocessingDrawing" xmlns:wp="http://schemas.openxmlformats.org/drawingml/2006/wordprocessingDrawing" xmlns:w10="urn:schemas-microsoft-com:office:word" xmlns:w="http://schemas.openxmlformats.org/wordprocessingml/2006/main" xmlns:w14="http://schemas.microsoft.com/office/word/2010/wordml" xmlns:w15="http://schemas.microsoft.com/office/word/2012/wordml" xmlns:w16cex="http://schemas.microsoft.com/office/word/2018/wordml/cex" xmlns:w16cid="http://schemas.microsoft.com/office/word/2016/wordml/cid" xmlns:w16="http://schemas.microsoft.com/office/word/2018/wordml" xmlns:w16sdtdh="http://schemas.microsoft.com/office/word/2020/wordml/sdtdatahash" xmlns:w16se="http://schemas.microsoft.com/office/word/2015/wordml/symex" xmlns:wpg="http://schemas.microsoft.com/office/word/2010/wordprocessingGroup" xmlns:wpi="http://schemas.microsoft.com/office/word/2010/wordprocessingInk" xmlns:wne="http://schemas.microsoft.com/office/word/2006/wordml" xmlns:wps="http://schemas.microsoft.com/office/word/2010/wordprocessingShape" mc:Ignorable="w14 w15 w16se w16cid w16 w16cex w16sdtdh wp14">
   <w:abstractNum w:abstractNumId="0" w15:restartNumberingAfterBreak="0">
     <w:nsid w:val="00D9334F"/>
     <w:multiLevelType w:val="hybridMultilevel"/>
@@ -15776,7 +15832,7 @@
 </file>
 
 <file path=word/styles.xml><?xml version="1.0" encoding="utf-8"?>
-<w:styles xmlns:mc="http://schemas.openxmlformats.org/markup-compatibility/2006" xmlns:r="http://schemas.openxmlformats.org/officeDocument/2006/relationships" xmlns:w="http://schemas.openxmlformats.org/wordprocessingml/2006/main" xmlns:w14="http://schemas.microsoft.com/office/word/2010/wordml" xmlns:w15="http://schemas.microsoft.com/office/word/2012/wordml" mc:Ignorable="w14 w15">
+<w:styles xmlns:mc="http://schemas.openxmlformats.org/markup-compatibility/2006" xmlns:r="http://schemas.openxmlformats.org/officeDocument/2006/relationships" xmlns:w="http://schemas.openxmlformats.org/wordprocessingml/2006/main" xmlns:w14="http://schemas.microsoft.com/office/word/2010/wordml" xmlns:w15="http://schemas.microsoft.com/office/word/2012/wordml" xmlns:w16cex="http://schemas.microsoft.com/office/word/2018/wordml/cex" xmlns:w16cid="http://schemas.microsoft.com/office/word/2016/wordml/cid" xmlns:w16="http://schemas.microsoft.com/office/word/2018/wordml" xmlns:w16sdtdh="http://schemas.microsoft.com/office/word/2020/wordml/sdtdatahash" xmlns:w16se="http://schemas.microsoft.com/office/word/2015/wordml/symex" mc:Ignorable="w14 w15 w16se w16cid w16 w16cex w16sdtdh">
   <w:docDefaults>
     <w:rPrDefault>
       <w:rPr>
@@ -15792,7 +15848,7 @@
       </w:pPr>
     </w:pPrDefault>
   </w:docDefaults>
-  <w:latentStyles w:defLockedState="0" w:defUIPriority="99" w:defSemiHidden="0" w:defUnhideWhenUsed="0" w:defQFormat="0" w:count="371">
+  <w:latentStyles w:defLockedState="0" w:defUIPriority="99" w:defSemiHidden="0" w:defUnhideWhenUsed="0" w:defQFormat="0" w:count="376">
     <w:lsdException w:name="Normal" w:uiPriority="0" w:qFormat="1"/>
     <w:lsdException w:name="heading 1" w:uiPriority="9" w:qFormat="1"/>
     <w:lsdException w:name="heading 2" w:semiHidden="1" w:uiPriority="9" w:unhideWhenUsed="1" w:qFormat="1"/>
@@ -15898,7 +15954,6 @@
     <w:lsdException w:name="HTML Sample" w:semiHidden="1" w:unhideWhenUsed="1"/>
     <w:lsdException w:name="HTML Typewriter" w:semiHidden="1" w:unhideWhenUsed="1"/>
     <w:lsdException w:name="HTML Variable" w:semiHidden="1" w:unhideWhenUsed="1"/>
-    <w:lsdException w:name="Normal Table" w:semiHidden="1" w:unhideWhenUsed="1"/>
     <w:lsdException w:name="annotation subject" w:semiHidden="1" w:unhideWhenUsed="1"/>
     <w:lsdException w:name="No List" w:semiHidden="1" w:unhideWhenUsed="1"/>
     <w:lsdException w:name="Outline List 1" w:semiHidden="1" w:unhideWhenUsed="1"/>
@@ -15941,11 +15996,8 @@
     <w:lsdException w:name="Table Contemporary" w:semiHidden="1" w:unhideWhenUsed="1"/>
     <w:lsdException w:name="Table Elegant" w:semiHidden="1" w:unhideWhenUsed="1"/>
     <w:lsdException w:name="Table Professional" w:semiHidden="1" w:unhideWhenUsed="1"/>
-    <w:lsdException w:name="Table Subtle 1" w:semiHidden="1" w:unhideWhenUsed="1"/>
     <w:lsdException w:name="Table Subtle 2" w:semiHidden="1" w:unhideWhenUsed="1"/>
     <w:lsdException w:name="Table Web 1" w:semiHidden="1" w:unhideWhenUsed="1"/>
-    <w:lsdException w:name="Table Web 2" w:semiHidden="1" w:unhideWhenUsed="1"/>
-    <w:lsdException w:name="Table Web 3" w:semiHidden="1" w:unhideWhenUsed="1"/>
     <w:lsdException w:name="Balloon Text" w:semiHidden="1" w:unhideWhenUsed="1"/>
     <w:lsdException w:name="Table Grid" w:uiPriority="39"/>
     <w:lsdException w:name="Table Theme" w:semiHidden="1" w:unhideWhenUsed="1"/>
@@ -16164,6 +16216,11 @@
     <w:lsdException w:name="List Table 5 Dark Accent 6" w:uiPriority="50"/>
     <w:lsdException w:name="List Table 6 Colorful Accent 6" w:uiPriority="51"/>
     <w:lsdException w:name="List Table 7 Colorful Accent 6" w:uiPriority="52"/>
+    <w:lsdException w:name="Mention" w:semiHidden="1" w:unhideWhenUsed="1"/>
+    <w:lsdException w:name="Smart Hyperlink" w:semiHidden="1" w:unhideWhenUsed="1"/>
+    <w:lsdException w:name="Hashtag" w:semiHidden="1" w:unhideWhenUsed="1"/>
+    <w:lsdException w:name="Unresolved Mention" w:semiHidden="1" w:unhideWhenUsed="1"/>
+    <w:lsdException w:name="Smart Link" w:semiHidden="1" w:unhideWhenUsed="1"/>
   </w:latentStyles>
   <w:style w:type="paragraph" w:default="1" w:styleId="Normal">
     <w:name w:val="Normal"/>
@@ -16234,7 +16291,7 @@
       <w:szCs w:val="32"/>
     </w:rPr>
   </w:style>
-  <w:style w:type="paragraph" w:styleId="TtulodeTDC">
+  <w:style w:type="paragraph" w:styleId="TtuloTDC">
     <w:name w:val="TOC Heading"/>
     <w:basedOn w:val="Ttulo1"/>
     <w:next w:val="Normal"/>
@@ -16470,561 +16527,6 @@
     <w:rsid w:val="001C3E0D"/>
   </w:style>
 </w:styles>
-</file>
-
-<file path=word/glossary/document.xml><?xml version="1.0" encoding="utf-8"?>
-<w:glossaryDocument xmlns:wpc="http://schemas.microsoft.com/office/word/2010/wordprocessingCanvas" xmlns:mc="http://schemas.openxmlformats.org/markup-compatibility/2006" xmlns:o="urn:schemas-microsoft-com:office:office" xmlns:r="http://schemas.openxmlformats.org/officeDocument/2006/relationships" xmlns:m="http://schemas.openxmlformats.org/officeDocument/2006/math" xmlns:v="urn:schemas-microsoft-com:vml" xmlns:wp14="http://schemas.microsoft.com/office/word/2010/wordprocessingDrawing" xmlns:wp="http://schemas.openxmlformats.org/drawingml/2006/wordprocessingDrawing" xmlns:w10="urn:schemas-microsoft-com:office:word" xmlns:w="http://schemas.openxmlformats.org/wordprocessingml/2006/main" xmlns:w14="http://schemas.microsoft.com/office/word/2010/wordml" xmlns:w15="http://schemas.microsoft.com/office/word/2012/wordml" xmlns:wpg="http://schemas.microsoft.com/office/word/2010/wordprocessingGroup" xmlns:wpi="http://schemas.microsoft.com/office/word/2010/wordprocessingInk" xmlns:wne="http://schemas.microsoft.com/office/word/2006/wordml" xmlns:wps="http://schemas.microsoft.com/office/word/2010/wordprocessingShape" mc:Ignorable="w14 w15 wp14"/>
-</file>
-
-<file path=word/glossary/fontTable.xml><?xml version="1.0" encoding="utf-8"?>
-<w:fonts xmlns:mc="http://schemas.openxmlformats.org/markup-compatibility/2006" xmlns:r="http://schemas.openxmlformats.org/officeDocument/2006/relationships" xmlns:w="http://schemas.openxmlformats.org/wordprocessingml/2006/main" xmlns:w14="http://schemas.microsoft.com/office/word/2010/wordml" xmlns:w15="http://schemas.microsoft.com/office/word/2012/wordml" mc:Ignorable="w14 w15">
-  <w:font w:name="Symbol">
-    <w:panose1 w:val="05050102010706020507"/>
-    <w:charset w:val="02"/>
-    <w:family w:val="roman"/>
-    <w:pitch w:val="variable"/>
-    <w:sig w:usb0="00000000" w:usb1="10000000" w:usb2="00000000" w:usb3="00000000" w:csb0="80000000" w:csb1="00000000"/>
-  </w:font>
-  <w:font w:name="Times New Roman">
-    <w:panose1 w:val="02020603050405020304"/>
-    <w:charset w:val="00"/>
-    <w:family w:val="roman"/>
-    <w:pitch w:val="variable"/>
-    <w:sig w:usb0="E0002EFF" w:usb1="C000785B" w:usb2="00000009" w:usb3="00000000" w:csb0="000001FF" w:csb1="00000000"/>
-  </w:font>
-  <w:font w:name="Courier New">
-    <w:panose1 w:val="02070309020205020404"/>
-    <w:charset w:val="00"/>
-    <w:family w:val="modern"/>
-    <w:pitch w:val="fixed"/>
-    <w:sig w:usb0="E0002EFF" w:usb1="C0007843" w:usb2="00000009" w:usb3="00000000" w:csb0="000001FF" w:csb1="00000000"/>
-  </w:font>
-  <w:font w:name="Wingdings">
-    <w:panose1 w:val="05000000000000000000"/>
-    <w:charset w:val="02"/>
-    <w:family w:val="auto"/>
-    <w:pitch w:val="variable"/>
-    <w:sig w:usb0="00000000" w:usb1="10000000" w:usb2="00000000" w:usb3="00000000" w:csb0="80000000" w:csb1="00000000"/>
-  </w:font>
-  <w:font w:name="Calibri">
-    <w:panose1 w:val="020F0502020204030204"/>
-    <w:charset w:val="00"/>
-    <w:family w:val="swiss"/>
-    <w:pitch w:val="variable"/>
-    <w:sig w:usb0="E4002EFF" w:usb1="C000247B" w:usb2="00000009" w:usb3="00000000" w:csb0="000001FF" w:csb1="00000000"/>
-  </w:font>
-  <w:font w:name="Arial">
-    <w:panose1 w:val="020B0604020202020204"/>
-    <w:charset w:val="00"/>
-    <w:family w:val="swiss"/>
-    <w:pitch w:val="variable"/>
-    <w:sig w:usb0="E0002EFF" w:usb1="C000785B" w:usb2="00000009" w:usb3="00000000" w:csb0="000001FF" w:csb1="00000000"/>
-  </w:font>
-  <w:font w:name="Montserrat">
-    <w:altName w:val="Montserrat"/>
-    <w:panose1 w:val="00000000000000000000"/>
-    <w:charset w:val="00"/>
-    <w:family w:val="swiss"/>
-    <w:notTrueType/>
-    <w:pitch w:val="default"/>
-    <w:sig w:usb0="00000003" w:usb1="00000000" w:usb2="00000000" w:usb3="00000000" w:csb0="00000001" w:csb1="00000000"/>
-  </w:font>
-  <w:font w:name="Cambria Math">
-    <w:panose1 w:val="02040503050406030204"/>
-    <w:charset w:val="00"/>
-    <w:family w:val="roman"/>
-    <w:pitch w:val="variable"/>
-    <w:sig w:usb0="E00006FF" w:usb1="420024FF" w:usb2="02000000" w:usb3="00000000" w:csb0="0000019F" w:csb1="00000000"/>
-  </w:font>
-  <w:font w:name="Calibri Light">
-    <w:panose1 w:val="020F0302020204030204"/>
-    <w:charset w:val="00"/>
-    <w:family w:val="swiss"/>
-    <w:pitch w:val="variable"/>
-    <w:sig w:usb0="E4002EFF" w:usb1="C000247B" w:usb2="00000009" w:usb3="00000000" w:csb0="000001FF" w:csb1="00000000"/>
-  </w:font>
-</w:fonts>
-</file>
-
-<file path=word/glossary/settings.xml><?xml version="1.0" encoding="utf-8"?>
-<w:settings xmlns:mc="http://schemas.openxmlformats.org/markup-compatibility/2006" xmlns:o="urn:schemas-microsoft-com:office:office" xmlns:r="http://schemas.openxmlformats.org/officeDocument/2006/relationships" xmlns:m="http://schemas.openxmlformats.org/officeDocument/2006/math" xmlns:v="urn:schemas-microsoft-com:vml" xmlns:w10="urn:schemas-microsoft-com:office:word" xmlns:w="http://schemas.openxmlformats.org/wordprocessingml/2006/main" xmlns:w14="http://schemas.microsoft.com/office/word/2010/wordml" xmlns:w15="http://schemas.microsoft.com/office/word/2012/wordml" xmlns:sl="http://schemas.openxmlformats.org/schemaLibrary/2006/main" mc:Ignorable="w14 w15">
-  <w:view w:val="normal"/>
-  <w:defaultTabStop w:val="708"/>
-  <w:hyphenationZone w:val="425"/>
-  <w:characterSpacingControl w:val="doNotCompress"/>
-  <w:compat>
-    <w:useFELayout/>
-    <w:compatSetting w:name="compatibilityMode" w:uri="http://schemas.microsoft.com/office/word" w:val="15"/>
-    <w:compatSetting w:name="overrideTableStyleFontSizeAndJustification" w:uri="http://schemas.microsoft.com/office/word" w:val="1"/>
-    <w:compatSetting w:name="enableOpenTypeFeatures" w:uri="http://schemas.microsoft.com/office/word" w:val="1"/>
-    <w:compatSetting w:name="doNotFlipMirrorIndents" w:uri="http://schemas.microsoft.com/office/word" w:val="1"/>
-    <w:compatSetting w:name="differentiateMultirowTableHeaders" w:uri="http://schemas.microsoft.com/office/word" w:val="1"/>
-  </w:compat>
-  <w:rsids>
-    <w:rsidRoot w:val="00B137C7"/>
-    <w:rsid w:val="002B2293"/>
-    <w:rsid w:val="00B137C7"/>
-  </w:rsids>
-  <m:mathPr>
-    <m:mathFont m:val="Cambria Math"/>
-    <m:brkBin m:val="before"/>
-    <m:brkBinSub m:val="--"/>
-    <m:smallFrac m:val="0"/>
-    <m:dispDef/>
-    <m:lMargin m:val="0"/>
-    <m:rMargin m:val="0"/>
-    <m:defJc m:val="centerGroup"/>
-    <m:wrapIndent m:val="1440"/>
-    <m:intLim m:val="subSup"/>
-    <m:naryLim m:val="undOvr"/>
-  </m:mathPr>
-  <w:themeFontLang w:val="es-MX"/>
-  <w:clrSchemeMapping w:bg1="light1" w:t1="dark1" w:bg2="light2" w:t2="dark2" w:accent1="accent1" w:accent2="accent2" w:accent3="accent3" w:accent4="accent4" w:accent5="accent5" w:accent6="accent6" w:hyperlink="hyperlink" w:followedHyperlink="followedHyperlink"/>
-  <w:decimalSymbol w:val="."/>
-  <w:listSeparator w:val=","/>
-  <w15:chartTrackingRefBased/>
-</w:settings>
-</file>
-
-<file path=word/glossary/styles.xml><?xml version="1.0" encoding="utf-8"?>
-<w:styles xmlns:mc="http://schemas.openxmlformats.org/markup-compatibility/2006" xmlns:r="http://schemas.openxmlformats.org/officeDocument/2006/relationships" xmlns:w="http://schemas.openxmlformats.org/wordprocessingml/2006/main" xmlns:w14="http://schemas.microsoft.com/office/word/2010/wordml" xmlns:w15="http://schemas.microsoft.com/office/word/2012/wordml" mc:Ignorable="w14 w15">
-  <w:docDefaults>
-    <w:rPrDefault>
-      <w:rPr>
-        <w:rFonts w:asciiTheme="minorHAnsi" w:eastAsiaTheme="minorEastAsia" w:hAnsiTheme="minorHAnsi" w:cstheme="minorBidi"/>
-        <w:sz w:val="22"/>
-        <w:szCs w:val="22"/>
-        <w:lang w:val="es-MX" w:eastAsia="es-MX" w:bidi="ar-SA"/>
-      </w:rPr>
-    </w:rPrDefault>
-    <w:pPrDefault>
-      <w:pPr>
-        <w:spacing w:after="160" w:line="259" w:lineRule="auto"/>
-      </w:pPr>
-    </w:pPrDefault>
-  </w:docDefaults>
-  <w:latentStyles w:defLockedState="0" w:defUIPriority="99" w:defSemiHidden="0" w:defUnhideWhenUsed="0" w:defQFormat="0" w:count="371">
-    <w:lsdException w:name="Normal" w:uiPriority="0" w:qFormat="1"/>
-    <w:lsdException w:name="heading 1" w:uiPriority="9" w:qFormat="1"/>
-    <w:lsdException w:name="heading 2" w:semiHidden="1" w:uiPriority="9" w:unhideWhenUsed="1" w:qFormat="1"/>
-    <w:lsdException w:name="heading 3" w:semiHidden="1" w:uiPriority="9" w:unhideWhenUsed="1" w:qFormat="1"/>
-    <w:lsdException w:name="heading 4" w:semiHidden="1" w:uiPriority="9" w:unhideWhenUsed="1" w:qFormat="1"/>
-    <w:lsdException w:name="heading 5" w:semiHidden="1" w:uiPriority="9" w:unhideWhenUsed="1" w:qFormat="1"/>
-    <w:lsdException w:name="heading 6" w:semiHidden="1" w:uiPriority="9" w:unhideWhenUsed="1" w:qFormat="1"/>
-    <w:lsdException w:name="heading 7" w:semiHidden="1" w:uiPriority="9" w:unhideWhenUsed="1" w:qFormat="1"/>
-    <w:lsdException w:name="heading 8" w:semiHidden="1" w:uiPriority="9" w:unhideWhenUsed="1" w:qFormat="1"/>
-    <w:lsdException w:name="heading 9" w:semiHidden="1" w:uiPriority="9" w:unhideWhenUsed="1" w:qFormat="1"/>
-    <w:lsdException w:name="index 1" w:semiHidden="1" w:unhideWhenUsed="1"/>
-    <w:lsdException w:name="index 2" w:semiHidden="1" w:unhideWhenUsed="1"/>
-    <w:lsdException w:name="index 3" w:semiHidden="1" w:unhideWhenUsed="1"/>
-    <w:lsdException w:name="index 4" w:semiHidden="1" w:unhideWhenUsed="1"/>
-    <w:lsdException w:name="index 5" w:semiHidden="1" w:unhideWhenUsed="1"/>
-    <w:lsdException w:name="index 6" w:semiHidden="1" w:unhideWhenUsed="1"/>
-    <w:lsdException w:name="index 7" w:semiHidden="1" w:unhideWhenUsed="1"/>
-    <w:lsdException w:name="index 8" w:semiHidden="1" w:unhideWhenUsed="1"/>
-    <w:lsdException w:name="index 9" w:semiHidden="1" w:unhideWhenUsed="1"/>
-    <w:lsdException w:name="toc 1" w:semiHidden="1" w:uiPriority="39" w:unhideWhenUsed="1"/>
-    <w:lsdException w:name="toc 2" w:semiHidden="1" w:uiPriority="39" w:unhideWhenUsed="1"/>
-    <w:lsdException w:name="toc 3" w:semiHidden="1" w:uiPriority="39" w:unhideWhenUsed="1"/>
-    <w:lsdException w:name="toc 4" w:semiHidden="1" w:uiPriority="39" w:unhideWhenUsed="1"/>
-    <w:lsdException w:name="toc 5" w:semiHidden="1" w:uiPriority="39" w:unhideWhenUsed="1"/>
-    <w:lsdException w:name="toc 6" w:semiHidden="1" w:uiPriority="39" w:unhideWhenUsed="1"/>
-    <w:lsdException w:name="toc 7" w:semiHidden="1" w:uiPriority="39" w:unhideWhenUsed="1"/>
-    <w:lsdException w:name="toc 8" w:semiHidden="1" w:uiPriority="39" w:unhideWhenUsed="1"/>
-    <w:lsdException w:name="toc 9" w:semiHidden="1" w:uiPriority="39" w:unhideWhenUsed="1"/>
-    <w:lsdException w:name="Normal Indent" w:semiHidden="1" w:unhideWhenUsed="1"/>
-    <w:lsdException w:name="footnote text" w:semiHidden="1" w:unhideWhenUsed="1"/>
-    <w:lsdException w:name="annotation text" w:semiHidden="1" w:unhideWhenUsed="1"/>
-    <w:lsdException w:name="header" w:semiHidden="1" w:unhideWhenUsed="1"/>
-    <w:lsdException w:name="footer" w:semiHidden="1" w:unhideWhenUsed="1"/>
-    <w:lsdException w:name="index heading" w:semiHidden="1" w:unhideWhenUsed="1"/>
-    <w:lsdException w:name="caption" w:semiHidden="1" w:uiPriority="35" w:unhideWhenUsed="1" w:qFormat="1"/>
-    <w:lsdException w:name="table of figures" w:semiHidden="1" w:unhideWhenUsed="1"/>
-    <w:lsdException w:name="envelope address" w:semiHidden="1" w:unhideWhenUsed="1"/>
-    <w:lsdException w:name="envelope return" w:semiHidden="1" w:unhideWhenUsed="1"/>
-    <w:lsdException w:name="footnote reference" w:semiHidden="1" w:unhideWhenUsed="1"/>
-    <w:lsdException w:name="annotation reference" w:semiHidden="1" w:unhideWhenUsed="1"/>
-    <w:lsdException w:name="line number" w:semiHidden="1" w:unhideWhenUsed="1"/>
-    <w:lsdException w:name="page number" w:semiHidden="1" w:unhideWhenUsed="1"/>
-    <w:lsdException w:name="endnote reference" w:semiHidden="1" w:unhideWhenUsed="1"/>
-    <w:lsdException w:name="endnote text" w:semiHidden="1" w:unhideWhenUsed="1"/>
-    <w:lsdException w:name="table of authorities" w:semiHidden="1" w:unhideWhenUsed="1"/>
-    <w:lsdException w:name="macro" w:semiHidden="1" w:unhideWhenUsed="1"/>
-    <w:lsdException w:name="toa heading" w:semiHidden="1" w:unhideWhenUsed="1"/>
-    <w:lsdException w:name="List" w:semiHidden="1" w:unhideWhenUsed="1"/>
-    <w:lsdException w:name="List Bullet" w:semiHidden="1" w:unhideWhenUsed="1"/>
-    <w:lsdException w:name="List Number" w:semiHidden="1" w:unhideWhenUsed="1"/>
-    <w:lsdException w:name="List 2" w:semiHidden="1" w:unhideWhenUsed="1"/>
-    <w:lsdException w:name="List 3" w:semiHidden="1" w:unhideWhenUsed="1"/>
-    <w:lsdException w:name="List 4" w:semiHidden="1" w:unhideWhenUsed="1"/>
-    <w:lsdException w:name="List 5" w:semiHidden="1" w:unhideWhenUsed="1"/>
-    <w:lsdException w:name="List Bullet 2" w:semiHidden="1" w:unhideWhenUsed="1"/>
-    <w:lsdException w:name="List Bullet 3" w:semiHidden="1" w:unhideWhenUsed="1"/>
-    <w:lsdException w:name="List Bullet 4" w:semiHidden="1" w:unhideWhenUsed="1"/>
-    <w:lsdException w:name="List Bullet 5" w:semiHidden="1" w:unhideWhenUsed="1"/>
-    <w:lsdException w:name="List Number 2" w:semiHidden="1" w:unhideWhenUsed="1"/>
-    <w:lsdException w:name="List Number 3" w:semiHidden="1" w:unhideWhenUsed="1"/>
-    <w:lsdException w:name="List Number 4" w:semiHidden="1" w:unhideWhenUsed="1"/>
-    <w:lsdException w:name="List Number 5" w:semiHidden="1" w:unhideWhenUsed="1"/>
-    <w:lsdException w:name="Title" w:uiPriority="10" w:qFormat="1"/>
-    <w:lsdException w:name="Closing" w:semiHidden="1" w:unhideWhenUsed="1"/>
-    <w:lsdException w:name="Signature" w:semiHidden="1" w:unhideWhenUsed="1"/>
-    <w:lsdException w:name="Default Paragraph Font" w:semiHidden="1" w:uiPriority="1" w:unhideWhenUsed="1"/>
-    <w:lsdException w:name="Body Text" w:semiHidden="1" w:unhideWhenUsed="1"/>
-    <w:lsdException w:name="Body Text Indent" w:semiHidden="1" w:unhideWhenUsed="1"/>
-    <w:lsdException w:name="List Continue" w:semiHidden="1" w:unhideWhenUsed="1"/>
-    <w:lsdException w:name="List Continue 2" w:semiHidden="1" w:unhideWhenUsed="1"/>
-    <w:lsdException w:name="List Continue 3" w:semiHidden="1" w:unhideWhenUsed="1"/>
-    <w:lsdException w:name="List Continue 4" w:semiHidden="1" w:unhideWhenUsed="1"/>
-    <w:lsdException w:name="List Continue 5" w:semiHidden="1" w:unhideWhenUsed="1"/>
-    <w:lsdException w:name="Message Header" w:semiHidden="1" w:unhideWhenUsed="1"/>
-    <w:lsdException w:name="Subtitle" w:uiPriority="11" w:qFormat="1"/>
-    <w:lsdException w:name="Salutation" w:semiHidden="1" w:unhideWhenUsed="1"/>
-    <w:lsdException w:name="Date" w:semiHidden="1" w:unhideWhenUsed="1"/>
-    <w:lsdException w:name="Body Text First Indent" w:semiHidden="1" w:unhideWhenUsed="1"/>
-    <w:lsdException w:name="Body Text First Indent 2" w:semiHidden="1" w:unhideWhenUsed="1"/>
-    <w:lsdException w:name="Note Heading" w:semiHidden="1" w:unhideWhenUsed="1"/>
-    <w:lsdException w:name="Body Text 2" w:semiHidden="1" w:unhideWhenUsed="1"/>
-    <w:lsdException w:name="Body Text 3" w:semiHidden="1" w:unhideWhenUsed="1"/>
-    <w:lsdException w:name="Body Text Indent 2" w:semiHidden="1" w:unhideWhenUsed="1"/>
-    <w:lsdException w:name="Body Text Indent 3" w:semiHidden="1" w:unhideWhenUsed="1"/>
-    <w:lsdException w:name="Block Text" w:semiHidden="1" w:unhideWhenUsed="1"/>
-    <w:lsdException w:name="Hyperlink" w:semiHidden="1" w:unhideWhenUsed="1"/>
-    <w:lsdException w:name="FollowedHyperlink" w:semiHidden="1" w:unhideWhenUsed="1"/>
-    <w:lsdException w:name="Strong" w:uiPriority="22" w:qFormat="1"/>
-    <w:lsdException w:name="Emphasis" w:uiPriority="20" w:qFormat="1"/>
-    <w:lsdException w:name="Document Map" w:semiHidden="1" w:unhideWhenUsed="1"/>
-    <w:lsdException w:name="Plain Text" w:semiHidden="1" w:unhideWhenUsed="1"/>
-    <w:lsdException w:name="E-mail Signature" w:semiHidden="1" w:unhideWhenUsed="1"/>
-    <w:lsdException w:name="HTML Top of Form" w:semiHidden="1" w:unhideWhenUsed="1"/>
-    <w:lsdException w:name="HTML Bottom of Form" w:semiHidden="1" w:unhideWhenUsed="1"/>
-    <w:lsdException w:name="Normal (Web)" w:semiHidden="1" w:unhideWhenUsed="1"/>
-    <w:lsdException w:name="HTML Acronym" w:semiHidden="1" w:unhideWhenUsed="1"/>
-    <w:lsdException w:name="HTML Address" w:semiHidden="1" w:unhideWhenUsed="1"/>
-    <w:lsdException w:name="HTML Cite" w:semiHidden="1" w:unhideWhenUsed="1"/>
-    <w:lsdException w:name="HTML Code" w:semiHidden="1" w:unhideWhenUsed="1"/>
-    <w:lsdException w:name="HTML Definition" w:semiHidden="1" w:unhideWhenUsed="1"/>
-    <w:lsdException w:name="HTML Keyboard" w:semiHidden="1" w:unhideWhenUsed="1"/>
-    <w:lsdException w:name="HTML Preformatted" w:semiHidden="1" w:unhideWhenUsed="1"/>
-    <w:lsdException w:name="HTML Sample" w:semiHidden="1" w:unhideWhenUsed="1"/>
-    <w:lsdException w:name="HTML Typewriter" w:semiHidden="1" w:unhideWhenUsed="1"/>
-    <w:lsdException w:name="HTML Variable" w:semiHidden="1" w:unhideWhenUsed="1"/>
-    <w:lsdException w:name="Normal Table" w:semiHidden="1" w:unhideWhenUsed="1"/>
-    <w:lsdException w:name="annotation subject" w:semiHidden="1" w:unhideWhenUsed="1"/>
-    <w:lsdException w:name="No List" w:semiHidden="1" w:unhideWhenUsed="1"/>
-    <w:lsdException w:name="Outline List 1" w:semiHidden="1" w:unhideWhenUsed="1"/>
-    <w:lsdException w:name="Outline List 2" w:semiHidden="1" w:unhideWhenUsed="1"/>
-    <w:lsdException w:name="Outline List 3" w:semiHidden="1" w:unhideWhenUsed="1"/>
-    <w:lsdException w:name="Table Simple 1" w:semiHidden="1" w:unhideWhenUsed="1"/>
-    <w:lsdException w:name="Table Simple 2" w:semiHidden="1" w:unhideWhenUsed="1"/>
-    <w:lsdException w:name="Table Simple 3" w:semiHidden="1" w:unhideWhenUsed="1"/>
-    <w:lsdException w:name="Table Classic 1" w:semiHidden="1" w:unhideWhenUsed="1"/>
-    <w:lsdException w:name="Table Classic 2" w:semiHidden="1" w:unhideWhenUsed="1"/>
-    <w:lsdException w:name="Table Classic 3" w:semiHidden="1" w:unhideWhenUsed="1"/>
-    <w:lsdException w:name="Table Classic 4" w:semiHidden="1" w:unhideWhenUsed="1"/>
-    <w:lsdException w:name="Table Colorful 1" w:semiHidden="1" w:unhideWhenUsed="1"/>
-    <w:lsdException w:name="Table Colorful 2" w:semiHidden="1" w:unhideWhenUsed="1"/>
-    <w:lsdException w:name="Table Colorful 3" w:semiHidden="1" w:unhideWhenUsed="1"/>
-    <w:lsdException w:name="Table Columns 1" w:semiHidden="1" w:unhideWhenUsed="1"/>
-    <w:lsdException w:name="Table Columns 2" w:semiHidden="1" w:unhideWhenUsed="1"/>
-    <w:lsdException w:name="Table Columns 3" w:semiHidden="1" w:unhideWhenUsed="1"/>
-    <w:lsdException w:name="Table Columns 4" w:semiHidden="1" w:unhideWhenUsed="1"/>
-    <w:lsdException w:name="Table Columns 5" w:semiHidden="1" w:unhideWhenUsed="1"/>
-    <w:lsdException w:name="Table Grid 1" w:semiHidden="1" w:unhideWhenUsed="1"/>
-    <w:lsdException w:name="Table Grid 2" w:semiHidden="1" w:unhideWhenUsed="1"/>
-    <w:lsdException w:name="Table Grid 3" w:semiHidden="1" w:unhideWhenUsed="1"/>
-    <w:lsdException w:name="Table Grid 4" w:semiHidden="1" w:unhideWhenUsed="1"/>
-    <w:lsdException w:name="Table Grid 5" w:semiHidden="1" w:unhideWhenUsed="1"/>
-    <w:lsdException w:name="Table Grid 6" w:semiHidden="1" w:unhideWhenUsed="1"/>
-    <w:lsdException w:name="Table Grid 7" w:semiHidden="1" w:unhideWhenUsed="1"/>
-    <w:lsdException w:name="Table Grid 8" w:semiHidden="1" w:unhideWhenUsed="1"/>
-    <w:lsdException w:name="Table List 1" w:semiHidden="1" w:unhideWhenUsed="1"/>
-    <w:lsdException w:name="Table List 2" w:semiHidden="1" w:unhideWhenUsed="1"/>
-    <w:lsdException w:name="Table List 3" w:semiHidden="1" w:unhideWhenUsed="1"/>
-    <w:lsdException w:name="Table List 4" w:semiHidden="1" w:unhideWhenUsed="1"/>
-    <w:lsdException w:name="Table List 5" w:semiHidden="1" w:unhideWhenUsed="1"/>
-    <w:lsdException w:name="Table List 6" w:semiHidden="1" w:unhideWhenUsed="1"/>
-    <w:lsdException w:name="Table List 7" w:semiHidden="1" w:unhideWhenUsed="1"/>
-    <w:lsdException w:name="Table List 8" w:semiHidden="1" w:unhideWhenUsed="1"/>
-    <w:lsdException w:name="Table 3D effects 1" w:semiHidden="1" w:unhideWhenUsed="1"/>
-    <w:lsdException w:name="Table 3D effects 2" w:semiHidden="1" w:unhideWhenUsed="1"/>
-    <w:lsdException w:name="Table 3D effects 3" w:semiHidden="1" w:unhideWhenUsed="1"/>
-    <w:lsdException w:name="Table Contemporary" w:semiHidden="1" w:unhideWhenUsed="1"/>
-    <w:lsdException w:name="Table Elegant" w:semiHidden="1" w:unhideWhenUsed="1"/>
-    <w:lsdException w:name="Table Professional" w:semiHidden="1" w:unhideWhenUsed="1"/>
-    <w:lsdException w:name="Table Subtle 1" w:semiHidden="1" w:unhideWhenUsed="1"/>
-    <w:lsdException w:name="Table Subtle 2" w:semiHidden="1" w:unhideWhenUsed="1"/>
-    <w:lsdException w:name="Table Web 1" w:semiHidden="1" w:unhideWhenUsed="1"/>
-    <w:lsdException w:name="Table Web 2" w:semiHidden="1" w:unhideWhenUsed="1"/>
-    <w:lsdException w:name="Table Web 3" w:semiHidden="1" w:unhideWhenUsed="1"/>
-    <w:lsdException w:name="Balloon Text" w:semiHidden="1" w:unhideWhenUsed="1"/>
-    <w:lsdException w:name="Table Grid" w:uiPriority="39"/>
-    <w:lsdException w:name="Table Theme" w:semiHidden="1" w:unhideWhenUsed="1"/>
-    <w:lsdException w:name="Placeholder Text" w:semiHidden="1"/>
-    <w:lsdException w:name="No Spacing" w:uiPriority="1" w:qFormat="1"/>
-    <w:lsdException w:name="Light Shading" w:uiPriority="60"/>
-    <w:lsdException w:name="Light List" w:uiPriority="61"/>
-    <w:lsdException w:name="Light Grid" w:uiPriority="62"/>
-    <w:lsdException w:name="Medium Shading 1" w:uiPriority="63"/>
-    <w:lsdException w:name="Medium Shading 2" w:uiPriority="64"/>
-    <w:lsdException w:name="Medium List 1" w:uiPriority="65"/>
-    <w:lsdException w:name="Medium List 2" w:uiPriority="66"/>
-    <w:lsdException w:name="Medium Grid 1" w:uiPriority="67"/>
-    <w:lsdException w:name="Medium Grid 2" w:uiPriority="68"/>
-    <w:lsdException w:name="Medium Grid 3" w:uiPriority="69"/>
-    <w:lsdException w:name="Dark List" w:uiPriority="70"/>
-    <w:lsdException w:name="Colorful Shading" w:uiPriority="71"/>
-    <w:lsdException w:name="Colorful List" w:uiPriority="72"/>
-    <w:lsdException w:name="Colorful Grid" w:uiPriority="73"/>
-    <w:lsdException w:name="Light Shading Accent 1" w:uiPriority="60"/>
-    <w:lsdException w:name="Light List Accent 1" w:uiPriority="61"/>
-    <w:lsdException w:name="Light Grid Accent 1" w:uiPriority="62"/>
-    <w:lsdException w:name="Medium Shading 1 Accent 1" w:uiPriority="63"/>
-    <w:lsdException w:name="Medium Shading 2 Accent 1" w:uiPriority="64"/>
-    <w:lsdException w:name="Medium List 1 Accent 1" w:uiPriority="65"/>
-    <w:lsdException w:name="Revision" w:semiHidden="1"/>
-    <w:lsdException w:name="List Paragraph" w:uiPriority="34" w:qFormat="1"/>
-    <w:lsdException w:name="Quote" w:uiPriority="29" w:qFormat="1"/>
-    <w:lsdException w:name="Intense Quote" w:uiPriority="30" w:qFormat="1"/>
-    <w:lsdException w:name="Medium List 2 Accent 1" w:uiPriority="66"/>
-    <w:lsdException w:name="Medium Grid 1 Accent 1" w:uiPriority="67"/>
-    <w:lsdException w:name="Medium Grid 2 Accent 1" w:uiPriority="68"/>
-    <w:lsdException w:name="Medium Grid 3 Accent 1" w:uiPriority="69"/>
-    <w:lsdException w:name="Dark List Accent 1" w:uiPriority="70"/>
-    <w:lsdException w:name="Colorful Shading Accent 1" w:uiPriority="71"/>
-    <w:lsdException w:name="Colorful List Accent 1" w:uiPriority="72"/>
-    <w:lsdException w:name="Colorful Grid Accent 1" w:uiPriority="73"/>
-    <w:lsdException w:name="Light Shading Accent 2" w:uiPriority="60"/>
-    <w:lsdException w:name="Light List Accent 2" w:uiPriority="61"/>
-    <w:lsdException w:name="Light Grid Accent 2" w:uiPriority="62"/>
-    <w:lsdException w:name="Medium Shading 1 Accent 2" w:uiPriority="63"/>
-    <w:lsdException w:name="Medium Shading 2 Accent 2" w:uiPriority="64"/>
-    <w:lsdException w:name="Medium List 1 Accent 2" w:uiPriority="65"/>
-    <w:lsdException w:name="Medium List 2 Accent 2" w:uiPriority="66"/>
-    <w:lsdException w:name="Medium Grid 1 Accent 2" w:uiPriority="67"/>
-    <w:lsdException w:name="Medium Grid 2 Accent 2" w:uiPriority="68"/>
-    <w:lsdException w:name="Medium Grid 3 Accent 2" w:uiPriority="69"/>
-    <w:lsdException w:name="Dark List Accent 2" w:uiPriority="70"/>
-    <w:lsdException w:name="Colorful Shading Accent 2" w:uiPriority="71"/>
-    <w:lsdException w:name="Colorful List Accent 2" w:uiPriority="72"/>
-    <w:lsdException w:name="Colorful Grid Accent 2" w:uiPriority="73"/>
-    <w:lsdException w:name="Light Shading Accent 3" w:uiPriority="60"/>
-    <w:lsdException w:name="Light List Accent 3" w:uiPriority="61"/>
-    <w:lsdException w:name="Light Grid Accent 3" w:uiPriority="62"/>
-    <w:lsdException w:name="Medium Shading 1 Accent 3" w:uiPriority="63"/>
-    <w:lsdException w:name="Medium Shading 2 Accent 3" w:uiPriority="64"/>
-    <w:lsdException w:name="Medium List 1 Accent 3" w:uiPriority="65"/>
-    <w:lsdException w:name="Medium List 2 Accent 3" w:uiPriority="66"/>
-    <w:lsdException w:name="Medium Grid 1 Accent 3" w:uiPriority="67"/>
-    <w:lsdException w:name="Medium Grid 2 Accent 3" w:uiPriority="68"/>
-    <w:lsdException w:name="Medium Grid 3 Accent 3" w:uiPriority="69"/>
-    <w:lsdException w:name="Dark List Accent 3" w:uiPriority="70"/>
-    <w:lsdException w:name="Colorful Shading Accent 3" w:uiPriority="71"/>
-    <w:lsdException w:name="Colorful List Accent 3" w:uiPriority="72"/>
-    <w:lsdException w:name="Colorful Grid Accent 3" w:uiPriority="73"/>
-    <w:lsdException w:name="Light Shading Accent 4" w:uiPriority="60"/>
-    <w:lsdException w:name="Light List Accent 4" w:uiPriority="61"/>
-    <w:lsdException w:name="Light Grid Accent 4" w:uiPriority="62"/>
-    <w:lsdException w:name="Medium Shading 1 Accent 4" w:uiPriority="63"/>
-    <w:lsdException w:name="Medium Shading 2 Accent 4" w:uiPriority="64"/>
-    <w:lsdException w:name="Medium List 1 Accent 4" w:uiPriority="65"/>
-    <w:lsdException w:name="Medium List 2 Accent 4" w:uiPriority="66"/>
-    <w:lsdException w:name="Medium Grid 1 Accent 4" w:uiPriority="67"/>
-    <w:lsdException w:name="Medium Grid 2 Accent 4" w:uiPriority="68"/>
-    <w:lsdException w:name="Medium Grid 3 Accent 4" w:uiPriority="69"/>
-    <w:lsdException w:name="Dark List Accent 4" w:uiPriority="70"/>
-    <w:lsdException w:name="Colorful Shading Accent 4" w:uiPriority="71"/>
-    <w:lsdException w:name="Colorful List Accent 4" w:uiPriority="72"/>
-    <w:lsdException w:name="Colorful Grid Accent 4" w:uiPriority="73"/>
-    <w:lsdException w:name="Light Shading Accent 5" w:uiPriority="60"/>
-    <w:lsdException w:name="Light List Accent 5" w:uiPriority="61"/>
-    <w:lsdException w:name="Light Grid Accent 5" w:uiPriority="62"/>
-    <w:lsdException w:name="Medium Shading 1 Accent 5" w:uiPriority="63"/>
-    <w:lsdException w:name="Medium Shading 2 Accent 5" w:uiPriority="64"/>
-    <w:lsdException w:name="Medium List 1 Accent 5" w:uiPriority="65"/>
-    <w:lsdException w:name="Medium List 2 Accent 5" w:uiPriority="66"/>
-    <w:lsdException w:name="Medium Grid 1 Accent 5" w:uiPriority="67"/>
-    <w:lsdException w:name="Medium Grid 2 Accent 5" w:uiPriority="68"/>
-    <w:lsdException w:name="Medium Grid 3 Accent 5" w:uiPriority="69"/>
-    <w:lsdException w:name="Dark List Accent 5" w:uiPriority="70"/>
-    <w:lsdException w:name="Colorful Shading Accent 5" w:uiPriority="71"/>
-    <w:lsdException w:name="Colorful List Accent 5" w:uiPriority="72"/>
-    <w:lsdException w:name="Colorful Grid Accent 5" w:uiPriority="73"/>
-    <w:lsdException w:name="Light Shading Accent 6" w:uiPriority="60"/>
-    <w:lsdException w:name="Light List Accent 6" w:uiPriority="61"/>
-    <w:lsdException w:name="Light Grid Accent 6" w:uiPriority="62"/>
-    <w:lsdException w:name="Medium Shading 1 Accent 6" w:uiPriority="63"/>
-    <w:lsdException w:name="Medium Shading 2 Accent 6" w:uiPriority="64"/>
-    <w:lsdException w:name="Medium List 1 Accent 6" w:uiPriority="65"/>
-    <w:lsdException w:name="Medium List 2 Accent 6" w:uiPriority="66"/>
-    <w:lsdException w:name="Medium Grid 1 Accent 6" w:uiPriority="67"/>
-    <w:lsdException w:name="Medium Grid 2 Accent 6" w:uiPriority="68"/>
-    <w:lsdException w:name="Medium Grid 3 Accent 6" w:uiPriority="69"/>
-    <w:lsdException w:name="Dark List Accent 6" w:uiPriority="70"/>
-    <w:lsdException w:name="Colorful Shading Accent 6" w:uiPriority="71"/>
-    <w:lsdException w:name="Colorful List Accent 6" w:uiPriority="72"/>
-    <w:lsdException w:name="Colorful Grid Accent 6" w:uiPriority="73"/>
-    <w:lsdException w:name="Subtle Emphasis" w:uiPriority="19" w:qFormat="1"/>
-    <w:lsdException w:name="Intense Emphasis" w:uiPriority="21" w:qFormat="1"/>
-    <w:lsdException w:name="Subtle Reference" w:uiPriority="31" w:qFormat="1"/>
-    <w:lsdException w:name="Intense Reference" w:uiPriority="32" w:qFormat="1"/>
-    <w:lsdException w:name="Book Title" w:uiPriority="33" w:qFormat="1"/>
-    <w:lsdException w:name="Bibliography" w:semiHidden="1" w:uiPriority="37" w:unhideWhenUsed="1"/>
-    <w:lsdException w:name="TOC Heading" w:semiHidden="1" w:uiPriority="39" w:unhideWhenUsed="1" w:qFormat="1"/>
-    <w:lsdException w:name="Plain Table 1" w:uiPriority="41"/>
-    <w:lsdException w:name="Plain Table 2" w:uiPriority="42"/>
-    <w:lsdException w:name="Plain Table 3" w:uiPriority="43"/>
-    <w:lsdException w:name="Plain Table 4" w:uiPriority="44"/>
-    <w:lsdException w:name="Plain Table 5" w:uiPriority="45"/>
-    <w:lsdException w:name="Grid Table Light" w:uiPriority="40"/>
-    <w:lsdException w:name="Grid Table 1 Light" w:uiPriority="46"/>
-    <w:lsdException w:name="Grid Table 2" w:uiPriority="47"/>
-    <w:lsdException w:name="Grid Table 3" w:uiPriority="48"/>
-    <w:lsdException w:name="Grid Table 4" w:uiPriority="49"/>
-    <w:lsdException w:name="Grid Table 5 Dark" w:uiPriority="50"/>
-    <w:lsdException w:name="Grid Table 6 Colorful" w:uiPriority="51"/>
-    <w:lsdException w:name="Grid Table 7 Colorful" w:uiPriority="52"/>
-    <w:lsdException w:name="Grid Table 1 Light Accent 1" w:uiPriority="46"/>
-    <w:lsdException w:name="Grid Table 2 Accent 1" w:uiPriority="47"/>
-    <w:lsdException w:name="Grid Table 3 Accent 1" w:uiPriority="48"/>
-    <w:lsdException w:name="Grid Table 4 Accent 1" w:uiPriority="49"/>
-    <w:lsdException w:name="Grid Table 5 Dark Accent 1" w:uiPriority="50"/>
-    <w:lsdException w:name="Grid Table 6 Colorful Accent 1" w:uiPriority="51"/>
-    <w:lsdException w:name="Grid Table 7 Colorful Accent 1" w:uiPriority="52"/>
-    <w:lsdException w:name="Grid Table 1 Light Accent 2" w:uiPriority="46"/>
-    <w:lsdException w:name="Grid Table 2 Accent 2" w:uiPriority="47"/>
-    <w:lsdException w:name="Grid Table 3 Accent 2" w:uiPriority="48"/>
-    <w:lsdException w:name="Grid Table 4 Accent 2" w:uiPriority="49"/>
-    <w:lsdException w:name="Grid Table 5 Dark Accent 2" w:uiPriority="50"/>
-    <w:lsdException w:name="Grid Table 6 Colorful Accent 2" w:uiPriority="51"/>
-    <w:lsdException w:name="Grid Table 7 Colorful Accent 2" w:uiPriority="52"/>
-    <w:lsdException w:name="Grid Table 1 Light Accent 3" w:uiPriority="46"/>
-    <w:lsdException w:name="Grid Table 2 Accent 3" w:uiPriority="47"/>
-    <w:lsdException w:name="Grid Table 3 Accent 3" w:uiPriority="48"/>
-    <w:lsdException w:name="Grid Table 4 Accent 3" w:uiPriority="49"/>
-    <w:lsdException w:name="Grid Table 5 Dark Accent 3" w:uiPriority="50"/>
-    <w:lsdException w:name="Grid Table 6 Colorful Accent 3" w:uiPriority="51"/>
-    <w:lsdException w:name="Grid Table 7 Colorful Accent 3" w:uiPriority="52"/>
-    <w:lsdException w:name="Grid Table 1 Light Accent 4" w:uiPriority="46"/>
-    <w:lsdException w:name="Grid Table 2 Accent 4" w:uiPriority="47"/>
-    <w:lsdException w:name="Grid Table 3 Accent 4" w:uiPriority="48"/>
-    <w:lsdException w:name="Grid Table 4 Accent 4" w:uiPriority="49"/>
-    <w:lsdException w:name="Grid Table 5 Dark Accent 4" w:uiPriority="50"/>
-    <w:lsdException w:name="Grid Table 6 Colorful Accent 4" w:uiPriority="51"/>
-    <w:lsdException w:name="Grid Table 7 Colorful Accent 4" w:uiPriority="52"/>
-    <w:lsdException w:name="Grid Table 1 Light Accent 5" w:uiPriority="46"/>
-    <w:lsdException w:name="Grid Table 2 Accent 5" w:uiPriority="47"/>
-    <w:lsdException w:name="Grid Table 3 Accent 5" w:uiPriority="48"/>
-    <w:lsdException w:name="Grid Table 4 Accent 5" w:uiPriority="49"/>
-    <w:lsdException w:name="Grid Table 5 Dark Accent 5" w:uiPriority="50"/>
-    <w:lsdException w:name="Grid Table 6 Colorful Accent 5" w:uiPriority="51"/>
-    <w:lsdException w:name="Grid Table 7 Colorful Accent 5" w:uiPriority="52"/>
-    <w:lsdException w:name="Grid Table 1 Light Accent 6" w:uiPriority="46"/>
-    <w:lsdException w:name="Grid Table 2 Accent 6" w:uiPriority="47"/>
-    <w:lsdException w:name="Grid Table 3 Accent 6" w:uiPriority="48"/>
-    <w:lsdException w:name="Grid Table 4 Accent 6" w:uiPriority="49"/>
-    <w:lsdException w:name="Grid Table 5 Dark Accent 6" w:uiPriority="50"/>
-    <w:lsdException w:name="Grid Table 6 Colorful Accent 6" w:uiPriority="51"/>
-    <w:lsdException w:name="Grid Table 7 Colorful Accent 6" w:uiPriority="52"/>
-    <w:lsdException w:name="List Table 1 Light" w:uiPriority="46"/>
-    <w:lsdException w:name="List Table 2" w:uiPriority="47"/>
-    <w:lsdException w:name="List Table 3" w:uiPriority="48"/>
-    <w:lsdException w:name="List Table 4" w:uiPriority="49"/>
-    <w:lsdException w:name="List Table 5 Dark" w:uiPriority="50"/>
-    <w:lsdException w:name="List Table 6 Colorful" w:uiPriority="51"/>
-    <w:lsdException w:name="List Table 7 Colorful" w:uiPriority="52"/>
-    <w:lsdException w:name="List Table 1 Light Accent 1" w:uiPriority="46"/>
-    <w:lsdException w:name="List Table 2 Accent 1" w:uiPriority="47"/>
-    <w:lsdException w:name="List Table 3 Accent 1" w:uiPriority="48"/>
-    <w:lsdException w:name="List Table 4 Accent 1" w:uiPriority="49"/>
-    <w:lsdException w:name="List Table 5 Dark Accent 1" w:uiPriority="50"/>
-    <w:lsdException w:name="List Table 6 Colorful Accent 1" w:uiPriority="51"/>
-    <w:lsdException w:name="List Table 7 Colorful Accent 1" w:uiPriority="52"/>
-    <w:lsdException w:name="List Table 1 Light Accent 2" w:uiPriority="46"/>
-    <w:lsdException w:name="List Table 2 Accent 2" w:uiPriority="47"/>
-    <w:lsdException w:name="List Table 3 Accent 2" w:uiPriority="48"/>
-    <w:lsdException w:name="List Table 4 Accent 2" w:uiPriority="49"/>
-    <w:lsdException w:name="List Table 5 Dark Accent 2" w:uiPriority="50"/>
-    <w:lsdException w:name="List Table 6 Colorful Accent 2" w:uiPriority="51"/>
-    <w:lsdException w:name="List Table 7 Colorful Accent 2" w:uiPriority="52"/>
-    <w:lsdException w:name="List Table 1 Light Accent 3" w:uiPriority="46"/>
-    <w:lsdException w:name="List Table 2 Accent 3" w:uiPriority="47"/>
-    <w:lsdException w:name="List Table 3 Accent 3" w:uiPriority="48"/>
-    <w:lsdException w:name="List Table 4 Accent 3" w:uiPriority="49"/>
-    <w:lsdException w:name="List Table 5 Dark Accent 3" w:uiPriority="50"/>
-    <w:lsdException w:name="List Table 6 Colorful Accent 3" w:uiPriority="51"/>
-    <w:lsdException w:name="List Table 7 Colorful Accent 3" w:uiPriority="52"/>
-    <w:lsdException w:name="List Table 1 Light Accent 4" w:uiPriority="46"/>
-    <w:lsdException w:name="List Table 2 Accent 4" w:uiPriority="47"/>
-    <w:lsdException w:name="List Table 3 Accent 4" w:uiPriority="48"/>
-    <w:lsdException w:name="List Table 4 Accent 4" w:uiPriority="49"/>
-    <w:lsdException w:name="List Table 5 Dark Accent 4" w:uiPriority="50"/>
-    <w:lsdException w:name="List Table 6 Colorful Accent 4" w:uiPriority="51"/>
-    <w:lsdException w:name="List Table 7 Colorful Accent 4" w:uiPriority="52"/>
-    <w:lsdException w:name="List Table 1 Light Accent 5" w:uiPriority="46"/>
-    <w:lsdException w:name="List Table 2 Accent 5" w:uiPriority="47"/>
-    <w:lsdException w:name="List Table 3 Accent 5" w:uiPriority="48"/>
-    <w:lsdException w:name="List Table 4 Accent 5" w:uiPriority="49"/>
-    <w:lsdException w:name="List Table 5 Dark Accent 5" w:uiPriority="50"/>
-    <w:lsdException w:name="List Table 6 Colorful Accent 5" w:uiPriority="51"/>
-    <w:lsdException w:name="List Table 7 Colorful Accent 5" w:uiPriority="52"/>
-    <w:lsdException w:name="List Table 1 Light Accent 6" w:uiPriority="46"/>
-    <w:lsdException w:name="List Table 2 Accent 6" w:uiPriority="47"/>
-    <w:lsdException w:name="List Table 3 Accent 6" w:uiPriority="48"/>
-    <w:lsdException w:name="List Table 4 Accent 6" w:uiPriority="49"/>
-    <w:lsdException w:name="List Table 5 Dark Accent 6" w:uiPriority="50"/>
-    <w:lsdException w:name="List Table 6 Colorful Accent 6" w:uiPriority="51"/>
-    <w:lsdException w:name="List Table 7 Colorful Accent 6" w:uiPriority="52"/>
-  </w:latentStyles>
-  <w:style w:type="paragraph" w:default="1" w:styleId="Normal">
-    <w:name w:val="Normal"/>
-    <w:qFormat/>
-  </w:style>
-  <w:style w:type="character" w:default="1" w:styleId="Fuentedeprrafopredeter">
-    <w:name w:val="Default Paragraph Font"/>
-    <w:uiPriority w:val="1"/>
-    <w:semiHidden/>
-    <w:unhideWhenUsed/>
-  </w:style>
-  <w:style w:type="table" w:default="1" w:styleId="Tablanormal">
-    <w:name w:val="Normal Table"/>
-    <w:uiPriority w:val="99"/>
-    <w:semiHidden/>
-    <w:unhideWhenUsed/>
-    <w:tblPr>
-      <w:tblInd w:w="0" w:type="dxa"/>
-      <w:tblCellMar>
-        <w:top w:w="0" w:type="dxa"/>
-        <w:left w:w="108" w:type="dxa"/>
-        <w:bottom w:w="0" w:type="dxa"/>
-        <w:right w:w="108" w:type="dxa"/>
-      </w:tblCellMar>
-    </w:tblPr>
-  </w:style>
-  <w:style w:type="numbering" w:default="1" w:styleId="Sinlista">
-    <w:name w:val="No List"/>
-    <w:uiPriority w:val="99"/>
-    <w:semiHidden/>
-    <w:unhideWhenUsed/>
-  </w:style>
-  <w:style w:type="character" w:styleId="Textodelmarcadordeposicin">
-    <w:name w:val="Placeholder Text"/>
-    <w:basedOn w:val="Fuentedeprrafopredeter"/>
-    <w:uiPriority w:val="99"/>
-    <w:semiHidden/>
-    <w:rsid w:val="002B2293"/>
-    <w:rPr>
-      <w:color w:val="808080"/>
-    </w:rPr>
-  </w:style>
-</w:styles>
-</file>
-
-<file path=word/glossary/webSettings.xml><?xml version="1.0" encoding="utf-8"?>
-<w:webSettings xmlns:mc="http://schemas.openxmlformats.org/markup-compatibility/2006" xmlns:r="http://schemas.openxmlformats.org/officeDocument/2006/relationships" xmlns:w="http://schemas.openxmlformats.org/wordprocessingml/2006/main" xmlns:w14="http://schemas.microsoft.com/office/word/2010/wordml" xmlns:w15="http://schemas.microsoft.com/office/word/2012/wordml" mc:Ignorable="w14 w15">
-  <w:optimizeForBrowser/>
-  <w:allowPNG/>
-</w:webSettings>
 </file>
 
 <file path=word/theme/theme1.xml><?xml version="1.0" encoding="utf-8"?>
@@ -17289,12 +16791,6 @@
 </file>
 
 <file path=customXml/item1.xml><?xml version="1.0" encoding="utf-8"?>
-<p:properties xmlns:p="http://schemas.microsoft.com/office/2006/metadata/properties" xmlns:xsi="http://www.w3.org/2001/XMLSchema-instance" xmlns:pc="http://schemas.microsoft.com/office/infopath/2007/PartnerControls">
-  <documentManagement/>
-</p:properties>
-</file>
-
-<file path=customXml/item2.xml><?xml version="1.0" encoding="utf-8"?>
 <ct:contentTypeSchema xmlns:ct="http://schemas.microsoft.com/office/2006/metadata/contentType" xmlns:ma="http://schemas.microsoft.com/office/2006/metadata/properties/metaAttributes" ct:_="" ma:_="" ma:contentTypeName="Documento" ma:contentTypeID="0x010100AB0C0D8EEDCB2545918E5F87BCDE63BA" ma:contentTypeVersion="3" ma:contentTypeDescription="Crear nuevo documento." ma:contentTypeScope="" ma:versionID="bc22d8df9fd37ab3e62aecbb03d46024">
   <xsd:schema xmlns:xsd="http://www.w3.org/2001/XMLSchema" xmlns:xs="http://www.w3.org/2001/XMLSchema" xmlns:p="http://schemas.microsoft.com/office/2006/metadata/properties" xmlns:ns2="cf6ae8cf-e821-4852-904d-089c5e30801b" targetNamespace="http://schemas.microsoft.com/office/2006/metadata/properties" ma:root="true" ma:fieldsID="b4fabf5b4411a891b6edad1894c25bb6" ns2:_="">
     <xsd:import namespace="cf6ae8cf-e821-4852-904d-089c5e30801b"/>
@@ -17432,7 +16928,17 @@
 </ct:contentTypeSchema>
 </file>
 
+<file path=customXml/item2.xml><?xml version="1.0" encoding="utf-8"?>
+<p:properties xmlns:p="http://schemas.microsoft.com/office/2006/metadata/properties" xmlns:xsi="http://www.w3.org/2001/XMLSchema-instance" xmlns:pc="http://schemas.microsoft.com/office/infopath/2007/PartnerControls">
+  <documentManagement/>
+</p:properties>
+</file>
+
 <file path=customXml/item3.xml><?xml version="1.0" encoding="utf-8"?>
+<b:Sources xmlns:b="http://schemas.openxmlformats.org/officeDocument/2006/bibliography" xmlns="http://schemas.openxmlformats.org/officeDocument/2006/bibliography" SelectedStyle="\APASixthEditionOfficeOnline.xsl" StyleName="APA" Version="6"/>
+</file>
+
+<file path=customXml/item4.xml><?xml version="1.0" encoding="utf-8"?>
 <?mso-contentType ?>
 <FormTemplates xmlns="http://schemas.microsoft.com/sharepoint/v3/contenttype/forms">
   <Display>DocumentLibraryForm</Display>
@@ -17441,27 +16947,7 @@
 </FormTemplates>
 </file>
 
-<file path=customXml/item4.xml><?xml version="1.0" encoding="utf-8"?>
-<b:Sources xmlns:b="http://schemas.openxmlformats.org/officeDocument/2006/bibliography" xmlns="http://schemas.openxmlformats.org/officeDocument/2006/bibliography" SelectedStyle="\APASixthEditionOfficeOnline.xsl" StyleName="APA" Version="6"/>
-</file>
-
 <file path=customXml/itemProps1.xml><?xml version="1.0" encoding="utf-8"?>
-<ds:datastoreItem xmlns:ds="http://schemas.openxmlformats.org/officeDocument/2006/customXml" ds:itemID="{14090BC4-771D-4E7F-B7E6-219A5FD41DCD}">
-  <ds:schemaRefs>
-    <ds:schemaRef ds:uri="http://www.w3.org/XML/1998/namespace"/>
-    <ds:schemaRef ds:uri="http://schemas.microsoft.com/office/infopath/2007/PartnerControls"/>
-    <ds:schemaRef ds:uri="http://purl.org/dc/elements/1.1/"/>
-    <ds:schemaRef ds:uri="cf6ae8cf-e821-4852-904d-089c5e30801b"/>
-    <ds:schemaRef ds:uri="http://schemas.microsoft.com/office/2006/documentManagement/types"/>
-    <ds:schemaRef ds:uri="http://purl.org/dc/terms/"/>
-    <ds:schemaRef ds:uri="http://schemas.microsoft.com/office/2006/metadata/properties"/>
-    <ds:schemaRef ds:uri="http://schemas.openxmlformats.org/package/2006/metadata/core-properties"/>
-    <ds:schemaRef ds:uri="http://purl.org/dc/dcmitype/"/>
-  </ds:schemaRefs>
-</ds:datastoreItem>
-</file>
-
-<file path=customXml/itemProps2.xml><?xml version="1.0" encoding="utf-8"?>
 <ds:datastoreItem xmlns:ds="http://schemas.openxmlformats.org/officeDocument/2006/customXml" ds:itemID="{E5418C2B-4F6B-459B-B5C0-EA19941C7158}">
   <ds:schemaRefs>
     <ds:schemaRef ds:uri="http://schemas.microsoft.com/office/2006/metadata/contentType"/>
@@ -17479,18 +16965,27 @@
 </ds:datastoreItem>
 </file>
 
+<file path=customXml/itemProps2.xml><?xml version="1.0" encoding="utf-8"?>
+<ds:datastoreItem xmlns:ds="http://schemas.openxmlformats.org/officeDocument/2006/customXml" ds:itemID="{14090BC4-771D-4E7F-B7E6-219A5FD41DCD}">
+  <ds:schemaRefs>
+    <ds:schemaRef ds:uri="http://schemas.microsoft.com/office/2006/metadata/properties"/>
+    <ds:schemaRef ds:uri="http://schemas.microsoft.com/office/infopath/2007/PartnerControls"/>
+  </ds:schemaRefs>
+</ds:datastoreItem>
+</file>
+
 <file path=customXml/itemProps3.xml><?xml version="1.0" encoding="utf-8"?>
+<ds:datastoreItem xmlns:ds="http://schemas.openxmlformats.org/officeDocument/2006/customXml" ds:itemID="{376B7BEA-C61D-4967-9F50-2CCD41409597}">
+  <ds:schemaRefs>
+    <ds:schemaRef ds:uri="http://schemas.openxmlformats.org/officeDocument/2006/bibliography"/>
+  </ds:schemaRefs>
+</ds:datastoreItem>
+</file>
+
+<file path=customXml/itemProps4.xml><?xml version="1.0" encoding="utf-8"?>
 <ds:datastoreItem xmlns:ds="http://schemas.openxmlformats.org/officeDocument/2006/customXml" ds:itemID="{4FF3115C-C316-419C-B6EF-25864C290842}">
   <ds:schemaRefs>
     <ds:schemaRef ds:uri="http://schemas.microsoft.com/sharepoint/v3/contenttype/forms"/>
   </ds:schemaRefs>
 </ds:datastoreItem>
-</file>
-
-<file path=customXml/itemProps4.xml><?xml version="1.0" encoding="utf-8"?>
-<ds:datastoreItem xmlns:ds="http://schemas.openxmlformats.org/officeDocument/2006/customXml" ds:itemID="{376B7BEA-C61D-4967-9F50-2CCD41409597}">
-  <ds:schemaRefs>
-    <ds:schemaRef ds:uri="http://schemas.openxmlformats.org/officeDocument/2006/bibliography"/>
-  </ds:schemaRefs>
-</ds:datastoreItem>
 </file>
</xml_diff>